<commit_message>
Rewrite the abstract in plain English and rebuild the PDF and Word files.
The abstract now defines each technical term (malicious, benign, perturbation)
where it first appears so the paper reads without a glossary, and the rebuilt
artefacts keep the PDF, DOCX and .tex sources in step.
</commit_message>
<xml_diff>
--- a/paper/main.docx
+++ b/paper/main.docx
@@ -73,7 +73,7 @@
           <w:b w:val="0"/>
           <w:i w:val="0"/>
         </w:rPr>
-        <w:t xml:space="preserve">Security teams often use language models (AI text classifiers) to sort incoming emails and text messages. The model decides whether a message is </w:t>
+        <w:t xml:space="preserve">Security teams often use small AI text classifiers to sort incoming emails and text messages. The classifier decides whether a message is </w:t>
       </w:r>
       <w:r>
         <w:rPr>
@@ -87,7 +87,7 @@
           <w:b w:val="0"/>
           <w:i w:val="0"/>
         </w:rPr>
-        <w:t xml:space="preserve"> (harmful or dangerous) or </w:t>
+        <w:t xml:space="preserve"> (harmful) or </w:t>
       </w:r>
       <w:r>
         <w:rPr>
@@ -101,7 +101,7 @@
           <w:b w:val="0"/>
           <w:i w:val="0"/>
         </w:rPr>
-        <w:t xml:space="preserve"> (safe and normal) before a human analyst reviews it. In this paper, we study what happens when an attacker makes small, careful text edits (known as perturbations) to bypass the classifier. We show that evasion rates can only be measured accurately under a </w:t>
+        <w:t xml:space="preserve"> (safe) before a human reviews it. In this paper, we test what happens when an attacker makes small text edits, called perturbations, to fool the classifier. We show that evasion rates can only be measured fairly under a </w:t>
       </w:r>
       <w:r>
         <w:rPr>
@@ -115,7 +115,21 @@
           <w:b w:val="0"/>
           <w:i w:val="0"/>
         </w:rPr>
-        <w:t xml:space="preserve"> testing rule: researchers must only attack messages that the model originally caught, verify each original message again during testing, and limit the attacker to a realistic edit budget per sample.</w:t>
+        <w:t xml:space="preserve"> test rule: researchers must only attack messages that the model originally caught, re</w:t>
+      </w:r>
+      <w:r>
+        <w:rPr>
+          <w:b w:val="0"/>
+          <w:i w:val="0"/>
+        </w:rPr>
+        <w:t>-</w:t>
+      </w:r>
+      <w:r>
+        <w:rPr>
+          <w:b w:val="0"/>
+          <w:i w:val="0"/>
+        </w:rPr>
+        <w:t>check every original message during testing, and limit the attacker to a realistic edit budget per sample.</w:t>
       </w:r>
     </w:p>
     <w:p>
@@ -127,7 +141,7 @@
           <w:b w:val="0"/>
           <w:i w:val="0"/>
         </w:rPr>
-        <w:t>We test this method on three open, lightweight language models (1.7 billion to 3.8 billion parameters) without extra fine</w:t>
+        <w:t>We test this method on three open, lightweight language models (1.7 billion to 3.8 billion parameters) without extra training (zero</w:t>
       </w:r>
       <w:r>
         <w:rPr>
@@ -141,21 +155,7 @@
           <w:b w:val="0"/>
           <w:i w:val="0"/>
         </w:rPr>
-        <w:t>tuning (zero</w:t>
-      </w:r>
-      <w:r>
-        <w:rPr>
-          <w:b w:val="0"/>
-          <w:i w:val="0"/>
-        </w:rPr>
-        <w:t>-</w:t>
-      </w:r>
-      <w:r>
-        <w:rPr>
-          <w:b w:val="0"/>
-          <w:i w:val="0"/>
-        </w:rPr>
-        <w:t>shot) on phishing emails and SMS spam (smishing). We test 2</w:t>
+        <w:t>shot) on phishing emails and SMS spam (known as smishing). We test 2</w:t>
       </w:r>
       <w:r>
         <w:rPr>
@@ -197,7 +197,7 @@
           <w:b w:val="0"/>
           <w:i w:val="0"/>
         </w:rPr>
-        <w:t xml:space="preserve"> total edit budget. At first glance, the models appear quite resistant to simple edits. Small character changes (like typos or look</w:t>
+        <w:t xml:space="preserve"> total edit budget. At first glance, the models look quite resistant to simple edits. Small character changes (like typos or look</w:t>
       </w:r>
       <w:r>
         <w:rPr>
@@ -279,7 +279,21 @@
           <w:b w:val="0"/>
           <w:i w:val="0"/>
         </w:rPr>
-        <w:t>However, a more targeted search changes the picture. When we use a saliency</w:t>
+        <w:t>However, a more targeted search changes the picture. When we rank word replacements by their actual impact on the model</w:t>
+      </w:r>
+      <w:r>
+        <w:rPr>
+          <w:b w:val="0"/>
+          <w:i w:val="0"/>
+        </w:rPr>
+        <w:t>’</w:t>
+      </w:r>
+      <w:r>
+        <w:rPr>
+          <w:b w:val="0"/>
+          <w:i w:val="0"/>
+        </w:rPr>
+        <w:t>s decision (a saliency</w:t>
       </w:r>
       <w:r>
         <w:rPr>
@@ -293,21 +307,7 @@
           <w:b w:val="0"/>
           <w:i w:val="0"/>
         </w:rPr>
-        <w:t>guided word attack (ranking word replacements by their actual impact on the model</w:t>
-      </w:r>
-      <w:r>
-        <w:rPr>
-          <w:b w:val="0"/>
-          <w:i w:val="0"/>
-        </w:rPr>
-        <w:t>’</w:t>
-      </w:r>
-      <w:r>
-        <w:rPr>
-          <w:b w:val="0"/>
-          <w:i w:val="0"/>
-        </w:rPr>
-        <w:t>s decision), the attack success rate rises to 4.6</w:t>
+        <w:t>guided word attack), the success rate rises to 4.6</w:t>
       </w:r>
       <w:r>
         <w:rPr>
@@ -349,7 +349,7 @@
           <w:b w:val="0"/>
           <w:i w:val="0"/>
         </w:rPr>
-        <w:t xml:space="preserve">001 attacks, averaging 23 model queries per message. In direct paired comparisons on the exact same messages, the saliency attack flips 33 messages that random edits miss, while random edits flip only 7 that saliency misses (exact McNemar </w:t>
+        <w:t xml:space="preserve">001 attempts, averaging 23 model queries per message. In direct paired comparisons on the exact same messages, the guided attack flips 33 messages that random edits miss, while random edits flip only 7 that guided edits miss (exact McNemar test </w:t>
       </w:r>
       <w:r>
         <w:rPr>
@@ -407,7 +407,7 @@
           <w:b w:val="0"/>
           <w:i w:val="0"/>
         </w:rPr>
-        <w:t>). This demonstrates that model vulnerability is concentrated in a few key words rather than spread evenly across the vocabulary. Evasion rates depend heavily on the quality of the attacker</w:t>
+        <w:t>). This shows that vulnerability is concentrated in a few key words rather than spread evenly across the vocabulary. Evasion rates depend heavily on the quality of the attacker</w:t>
       </w:r>
       <w:r>
         <w:rPr>
@@ -461,7 +461,7 @@
           <w:b w:val="0"/>
           <w:i w:val="0"/>
         </w:rPr>
-        <w:t>s internal confidence) do not always match the final generated text decision. The two readouts agree on 941 of 1</w:t>
+        <w:t>s internal confidence) do not always match the final text decision. The two readouts agree on 941 of 1</w:t>
       </w:r>
       <w:r>
         <w:rPr>
@@ -599,7 +599,7 @@
           <w:b w:val="0"/>
           <w:i w:val="0"/>
         </w:rPr>
-        <w:t>Our main practical takeaway is that with small edit budgets, the primary limitation of small triage models is basic classification accuracy rather than susceptibility to random text edits. Furthermore, attack success rates must always be reported with their exact denominator (sample count), a statistical confidence interval, and the specific search method used. A result of 0 out of 188 is an upper limit of 2.0</w:t>
+        <w:t>Our main practical takeaway is that with small edit budgets, the primary limitation of small triage models is basic classification accuracy rather than susceptibility to random text edits. Furthermore, attack success rates must always be reported with their exact sample count (denominator), a statistical confidence interval, and the specific search method used. A result of 0 out of 188 is an upper limit of 2.0</w:t>
       </w:r>
       <w:r>
         <w:rPr>

</xml_diff>

<commit_message>
Add the author e-mail and a dedicated Future Work subsection.
The paper named its open experiments only in passing, inside the limitations
list and one closing sentence, so a reviewer had to infer what comes next. The
new subsection states the four measurements the current results stop short of,
and the Word build now carries the e-mail address that previously existed only
in the PDF. The figure check counts figures from the sources, so adding one no
longer makes the check fail on a hard-coded number.
</commit_message>
<xml_diff>
--- a/paper/main.docx
+++ b/paper/main.docx
@@ -54,6 +54,19 @@
           <w:i/>
         </w:rPr>
         <w:t xml:space="preserve"> Information Technology, Dera Ismail Khan, Pakistan</w:t>
+      </w:r>
+    </w:p>
+    <w:p>
+      <w:pPr>
+        <w:jc w:val="center"/>
+      </w:pPr>
+      <w:r>
+        <w:rPr>
+          <w:b w:val="0"/>
+          <w:i w:val="0"/>
+          <w:sz w:val="20"/>
+        </w:rPr>
+        <w:t>daudkhan@qurtuba.edu.pk</w:t>
       </w:r>
     </w:p>
     <w:p>
@@ -37881,6 +37894,363 @@
           <w:i w:val="0"/>
         </w:rPr>
         <w:t>aware adaptive attacks were designed but not run.</w:t>
+      </w:r>
+    </w:p>
+    <w:p>
+      <w:pPr>
+        <w:pStyle w:val="Heading2"/>
+      </w:pPr>
+      <w:r>
+        <w:t>9.8 Future Work</w:t>
+      </w:r>
+    </w:p>
+    <w:p>
+      <w:pPr>
+        <w:jc w:val="both"/>
+      </w:pPr>
+      <w:r>
+        <w:rPr>
+          <w:b w:val="0"/>
+          <w:i w:val="0"/>
+        </w:rPr>
+        <w:t>Four measurements would move this line of work forward. None of them is claimed above, and each of them is a place where the current numbers stop.</w:t>
+      </w:r>
+    </w:p>
+    <w:p>
+      <w:pPr>
+        <w:pStyle w:val="Heading3"/>
+      </w:pPr>
+      <w:r>
+        <w:t>A sentence-level paraphrase attacker.</w:t>
+      </w:r>
+    </w:p>
+    <w:p>
+      <w:pPr>
+        <w:jc w:val="both"/>
+      </w:pPr>
+      <w:r>
+        <w:rPr>
+          <w:b w:val="0"/>
+          <w:i w:val="0"/>
+        </w:rPr>
+        <w:t xml:space="preserve">Every edit measured here is local: a character, a word, a synonym. An attacker who rewrites whole sentences </w:t>
+      </w:r>
+      <w:r>
+        <w:rPr>
+          <w:b w:val="0"/>
+          <w:i w:val="0"/>
+        </w:rPr>
+        <w:t>—</w:t>
+      </w:r>
+      <w:r>
+        <w:rPr>
+          <w:b w:val="0"/>
+          <w:i w:val="0"/>
+        </w:rPr>
+        <w:t xml:space="preserve"> keeping the same request and the same lure </w:t>
+      </w:r>
+      <w:r>
+        <w:rPr>
+          <w:b w:val="0"/>
+          <w:i w:val="0"/>
+        </w:rPr>
+        <w:t>—</w:t>
+      </w:r>
+      <w:r>
+        <w:rPr>
+          <w:b w:val="0"/>
+          <w:i w:val="0"/>
+        </w:rPr>
+        <w:t xml:space="preserve"> is a different kind of threat, and the shared 15</w:t>
+      </w:r>
+      <w:r>
+        <w:rPr>
+          <w:b w:val="0"/>
+          <w:i w:val="0"/>
+        </w:rPr>
+        <w:t>%</w:t>
+      </w:r>
+      <w:r>
+        <w:rPr>
+          <w:b w:val="0"/>
+          <w:i w:val="0"/>
+        </w:rPr>
+        <w:t xml:space="preserve"> edit budget does not describe it, because a paraphrase can change most of the message while leaving the meaning intact. Two pieces would be needed before such an attack could sit in the same table as the ones above: a reliable meaning check, so that a rewrite is counted only when a reader would treat it as the same request; and a cost model, because the rewriter is itself a model call and the query accounting of </w:t>
+      </w:r>
+      <w:r>
+        <w:rPr>
+          <w:b w:val="0"/>
+          <w:i w:val="0"/>
+        </w:rPr>
+        <w:t>§</w:t>
+      </w:r>
+      <w:r>
+        <w:rPr>
+          <w:b w:val="0"/>
+          <w:i w:val="0"/>
+        </w:rPr>
+        <w:t>6</w:t>
+      </w:r>
+      <w:r>
+        <w:rPr>
+          <w:b w:val="0"/>
+          <w:i w:val="0"/>
+        </w:rPr>
+        <w:t xml:space="preserve"> would have to include it. The open question is whether the attack success that our bounded search leaves on the table is reachable this way. Nothing measured here answers that.</w:t>
+      </w:r>
+    </w:p>
+    <w:p>
+      <w:pPr>
+        <w:pStyle w:val="Heading3"/>
+      </w:pPr>
+      <w:r>
+        <w:t>A defence-aware attacker.</w:t>
+      </w:r>
+    </w:p>
+    <w:p>
+      <w:pPr>
+        <w:jc w:val="both"/>
+      </w:pPr>
+      <w:r>
+        <w:rPr>
+          <w:b w:val="0"/>
+          <w:i w:val="0"/>
+        </w:rPr>
+        <w:t xml:space="preserve">The two defences of </w:t>
+      </w:r>
+      <w:r>
+        <w:rPr>
+          <w:b w:val="0"/>
+          <w:i w:val="0"/>
+        </w:rPr>
+        <w:t>§</w:t>
+      </w:r>
+      <w:r>
+        <w:rPr>
+          <w:b w:val="0"/>
+          <w:i w:val="0"/>
+        </w:rPr>
+        <w:t>8</w:t>
+      </w:r>
+      <w:r>
+        <w:rPr>
+          <w:b w:val="0"/>
+          <w:i w:val="0"/>
+        </w:rPr>
+        <w:t xml:space="preserve"> were measured against perturbations built without any knowledge of them. That is the honest way to measure a defence once, and the wrong way to conclude that it holds. An attacker who can see the character normaliser and the threshold spends the same budget differently: a substitution outside the normaliser</w:t>
+      </w:r>
+      <w:r>
+        <w:rPr>
+          <w:b w:val="0"/>
+          <w:i w:val="0"/>
+        </w:rPr>
+        <w:t>’</w:t>
+      </w:r>
+      <w:r>
+        <w:rPr>
+          <w:b w:val="0"/>
+          <w:i w:val="0"/>
+        </w:rPr>
+        <w:t xml:space="preserve">s mapping table passes through unchanged, and a threshold is a number to be pushed under. Repeating the character and word attacks with the defence in the loop </w:t>
+      </w:r>
+      <w:r>
+        <w:rPr>
+          <w:b w:val="0"/>
+          <w:i w:val="0"/>
+        </w:rPr>
+        <w:t>—</w:t>
+      </w:r>
+      <w:r>
+        <w:rPr>
+          <w:b w:val="0"/>
+          <w:i w:val="0"/>
+        </w:rPr>
+        <w:t xml:space="preserve"> the normaliser applied before every query, the threshold known to the search </w:t>
+      </w:r>
+      <w:r>
+        <w:rPr>
+          <w:b w:val="0"/>
+          <w:i w:val="0"/>
+        </w:rPr>
+        <w:t>—</w:t>
+      </w:r>
+      <w:r>
+        <w:rPr>
+          <w:b w:val="0"/>
+          <w:i w:val="0"/>
+        </w:rPr>
+        <w:t xml:space="preserve"> is the experiment that would say whether the residual flip rate we report is a floor or a first measurement. Until it runs, the defence results should be read as a property of the perturbation set, not of the defence.</w:t>
+      </w:r>
+    </w:p>
+    <w:p>
+      <w:pPr>
+        <w:pStyle w:val="Heading3"/>
+      </w:pPr>
+      <w:r>
+        <w:t>The models we could not run.</w:t>
+      </w:r>
+    </w:p>
+    <w:p>
+      <w:pPr>
+        <w:jc w:val="both"/>
+      </w:pPr>
+      <w:r>
+        <w:rPr>
+          <w:b w:val="0"/>
+          <w:i w:val="0"/>
+        </w:rPr>
+        <w:t>Llama</w:t>
+      </w:r>
+      <w:r>
+        <w:rPr>
+          <w:b w:val="0"/>
+          <w:i w:val="0"/>
+        </w:rPr>
+        <w:t>-</w:t>
+      </w:r>
+      <w:r>
+        <w:rPr>
+          <w:b w:val="0"/>
+          <w:i w:val="0"/>
+        </w:rPr>
+        <w:t>3.2</w:t>
+      </w:r>
+      <w:r>
+        <w:rPr>
+          <w:b w:val="0"/>
+          <w:i w:val="0"/>
+        </w:rPr>
+        <w:t>-</w:t>
+      </w:r>
+      <w:r>
+        <w:rPr>
+          <w:b w:val="0"/>
+          <w:i w:val="0"/>
+        </w:rPr>
+        <w:t>3B</w:t>
+      </w:r>
+      <w:r>
+        <w:rPr>
+          <w:b w:val="0"/>
+          <w:i w:val="0"/>
+        </w:rPr>
+        <w:t>-</w:t>
+      </w:r>
+      <w:r>
+        <w:rPr>
+          <w:b w:val="0"/>
+          <w:i w:val="0"/>
+        </w:rPr>
+        <w:t xml:space="preserve">Instruct was omitted because it is gated, and the three models we do report sit in one size band. We therefore cannot say whether fragility grows or shrinks with model size, and we do not: the discussion of </w:t>
+      </w:r>
+      <w:r>
+        <w:rPr>
+          <w:b w:val="0"/>
+          <w:i w:val="0"/>
+        </w:rPr>
+        <w:t>§</w:t>
+      </w:r>
+      <w:r>
+        <w:rPr>
+          <w:b w:val="0"/>
+          <w:i w:val="0"/>
+        </w:rPr>
+        <w:t>9</w:t>
+      </w:r>
+      <w:r>
+        <w:rPr>
+          <w:b w:val="0"/>
+          <w:i w:val="0"/>
+        </w:rPr>
+        <w:t xml:space="preserve"> compares models of similar capacity. Attacking a 1B, a 3B and an 8B model of the same family on the same messages would answer a simple question that a deployment actually asks </w:t>
+      </w:r>
+      <w:r>
+        <w:rPr>
+          <w:b w:val="0"/>
+          <w:i w:val="0"/>
+        </w:rPr>
+        <w:t>—</w:t>
+      </w:r>
+      <w:r>
+        <w:rPr>
+          <w:b w:val="0"/>
+          <w:i w:val="0"/>
+        </w:rPr>
+        <w:t xml:space="preserve"> is the near</w:t>
+      </w:r>
+      <w:r>
+        <w:rPr>
+          <w:b w:val="0"/>
+          <w:i w:val="0"/>
+        </w:rPr>
+        <w:t>-</w:t>
+      </w:r>
+      <w:r>
+        <w:rPr>
+          <w:b w:val="0"/>
+          <w:i w:val="0"/>
+        </w:rPr>
+        <w:t>constant decision rule of the strongest model here a property of that model, or of its size? The experiment is the only way to find out.</w:t>
+      </w:r>
+    </w:p>
+    <w:p>
+      <w:pPr>
+        <w:pStyle w:val="Heading3"/>
+      </w:pPr>
+      <w:r>
+        <w:t>Run-to-run variability.</w:t>
+      </w:r>
+    </w:p>
+    <w:p>
+      <w:pPr>
+        <w:jc w:val="both"/>
+      </w:pPr>
+      <w:r>
+        <w:rPr>
+          <w:b w:val="0"/>
+          <w:i w:val="0"/>
+        </w:rPr>
+        <w:t>Our intervals cover variation across messages, not across runs. Sampling, prompt order and batching all move the generated verdict at the margin, and a flip count of a few dozen messages is exactly the scale at which that noise matters. Repeating one attack under several seeds, and reporting the spread next to the interval, would tell a reader how much of a two</w:t>
+      </w:r>
+      <w:r>
+        <w:rPr>
+          <w:b w:val="0"/>
+          <w:i w:val="0"/>
+        </w:rPr>
+        <w:t>-</w:t>
+      </w:r>
+      <w:r>
+        <w:rPr>
+          <w:b w:val="0"/>
+          <w:i w:val="0"/>
+        </w:rPr>
+        <w:t>point gap between two rows is real. It would also turn the single</w:t>
+      </w:r>
+      <w:r>
+        <w:rPr>
+          <w:b w:val="0"/>
+          <w:i w:val="0"/>
+        </w:rPr>
+        <w:t>-</w:t>
+      </w:r>
+      <w:r>
+        <w:rPr>
+          <w:b w:val="0"/>
+          <w:i w:val="0"/>
+        </w:rPr>
+        <w:t>run numbers in this paper into a distribution, which is what the paired tests already assume.</w:t>
+      </w:r>
+    </w:p>
+    <w:p>
+      <w:pPr>
+        <w:jc w:val="both"/>
+      </w:pPr>
+      <w:r>
+        <w:rPr>
+          <w:b w:val="0"/>
+          <w:i w:val="0"/>
+        </w:rPr>
+        <w:t>None of these changes a number reported above. Each of them changes what those numbers would be allowed to mean.</w:t>
       </w:r>
     </w:p>
     <w:p>

</xml_diff>

<commit_message>
Rewrite the remaining sections in plain English.
The abstract, introduction and discussion were already readable; the middle of
the paper still leaned on words a non-specialist has to look up (saliency,
oracle, denominator, homoglyph, degenerate detector, idempotent). Each term is
now defined where it first appears, or replaced with the plain phrase, and every
number, citation, table and cross-reference is unchanged so the checks still
tie the prose to the CSVs.
</commit_message>
<xml_diff>
--- a/paper/main.docx
+++ b/paper/main.docx
@@ -1400,7 +1400,7 @@
           <w:b w:val="0"/>
           <w:i w:val="0"/>
         </w:rPr>
-        <w:t>shot classification) is now a standard baseline for security triage. Rojas</w:t>
+        <w:t>shot classification) is now a standard baseline for security triage, that is, for sorting incoming messages into harmful and safe. Rojas</w:t>
       </w:r>
       <w:r>
         <w:rPr>
@@ -1414,7 +1414,7 @@
           <w:b w:val="0"/>
           <w:i w:val="0"/>
         </w:rPr>
-        <w:t>Galeano tested models on SpamAssassin without extra training. They reported an F1 score of 90</w:t>
+        <w:t>Galeano tested models on SpamAssassin without extra training: an F1 score of 90</w:t>
       </w:r>
       <w:r>
         <w:rPr>
@@ -1505,7 +1505,7 @@
           <w:b w:val="0"/>
           <w:i w:val="0"/>
         </w:rPr>
-        <w:t>tested zero</w:t>
+        <w:t>tried zero</w:t>
       </w:r>
       <w:r>
         <w:rPr>
@@ -1533,7 +1533,7 @@
           <w:b w:val="0"/>
           <w:i w:val="0"/>
         </w:rPr>
-        <w:t>shot prompts for phishing detection. They found mixed accuracy across models and questioned if decisions rely on model knowledge or prompt examples</w:t>
+        <w:t>shot prompts for phishing detection. Accuracy varied between models, and they asked whether the answers come from what the model already knows or from the examples in the prompt</w:t>
       </w:r>
       <w:r>
         <w:rPr>
@@ -1568,7 +1568,7 @@
           <w:b w:val="0"/>
           <w:i w:val="0"/>
         </w:rPr>
-        <w:t>designed a detector using email headers and bodies. They reported 99.70</w:t>
+        <w:t>built a detector from email headers and bodies and reported 99.70</w:t>
       </w:r>
       <w:r>
         <w:rPr>
@@ -1631,7 +1631,7 @@
           <w:b w:val="0"/>
           <w:i w:val="0"/>
         </w:rPr>
-        <w:t>added external web context to SMS triage inside an agent pipeline, achieving 98.8</w:t>
+        <w:t>added outside web context to SMS triage inside an agent pipeline and reached 98.8</w:t>
       </w:r>
       <w:r>
         <w:rPr>
@@ -1680,7 +1680,7 @@
           <w:b w:val="0"/>
           <w:i w:val="0"/>
         </w:rPr>
-        <w:t>studied small language models and observed that rewritten emails lower detection performance</w:t>
+        <w:t>studied small language models and found that rewritten emails lower detection performance</w:t>
       </w:r>
       <w:r>
         <w:rPr>
@@ -1701,7 +1701,7 @@
           <w:b w:val="0"/>
           <w:i w:val="0"/>
         </w:rPr>
-        <w:t>. Our study focuses on measurement discipline rather than model architecture. We keep the detector and prompt constant, applying careful accounting rules to measure how text edits change the verdict.</w:t>
+        <w:t>. Our study is about measurement rules rather than model design. We keep the detector and the prompt fixed and apply careful counting rules to see how text edits change the final decision.</w:t>
       </w:r>
     </w:p>
     <w:p>
@@ -1735,7 +1735,21 @@
           <w:b w:val="0"/>
           <w:i w:val="0"/>
         </w:rPr>
-        <w:t>generated plausible text to attack threat intelligence pipelines. They found that evasion misled classifiers, producing a 75</w:t>
+        <w:t>generated believable text to attack threat</w:t>
+      </w:r>
+      <w:r>
+        <w:rPr>
+          <w:b w:val="0"/>
+          <w:i w:val="0"/>
+        </w:rPr>
+        <w:t>-</w:t>
+      </w:r>
+      <w:r>
+        <w:rPr>
+          <w:b w:val="0"/>
+          <w:i w:val="0"/>
+        </w:rPr>
+        <w:t>intelligence pipelines. Their text misled the classifiers, producing a 75</w:t>
       </w:r>
       <w:r>
         <w:rPr>
@@ -1812,7 +1826,7 @@
           <w:b w:val="0"/>
           <w:i w:val="0"/>
         </w:rPr>
-        <w:t>generated adversarial phishing pages. They observed that small detectors failed, while vision</w:t>
+        <w:t>generated fake phishing pages: small detectors failed, while vision</w:t>
       </w:r>
       <w:r>
         <w:rPr>
@@ -1826,7 +1840,7 @@
           <w:b w:val="0"/>
           <w:i w:val="0"/>
         </w:rPr>
-        <w:t>language models proved more resilient</w:t>
+        <w:t>language models held up better</w:t>
       </w:r>
       <w:r>
         <w:rPr>
@@ -1847,7 +1861,7 @@
           <w:b w:val="0"/>
           <w:i w:val="0"/>
         </w:rPr>
-        <w:t>. In our setting, we study raw message text rather than web pages. Our adversary makes small edits rather than generating new text from scratch. This matches the real constraints of an attacker who wants users to read the message.</w:t>
+        <w:t>. Our setting is the raw message text, not a web page, and our attacker makes small edits instead of writing new text from scratch. That matches what a real attacker needs, because the victim still has to read the message.</w:t>
       </w:r>
     </w:p>
     <w:p>
@@ -1855,7 +1869,7 @@
         <w:pStyle w:val="Heading3"/>
       </w:pPr>
       <w:r>
-        <w:t>Text perturbation techniques and budgets.</w:t>
+        <w:t>Small text edits (perturbations) and their budgets.</w:t>
       </w:r>
     </w:p>
     <w:p>
@@ -1881,7 +1895,7 @@
           <w:b w:val="0"/>
           <w:i w:val="0"/>
         </w:rPr>
-        <w:t>level attacks change individual letters. DeepWordBug introduced typos and letter swaps</w:t>
+        <w:t>level attacks change single letters. DeepWordBug added typos and letter swaps</w:t>
       </w:r>
       <w:r>
         <w:rPr>
@@ -1902,7 +1916,21 @@
           <w:b w:val="0"/>
           <w:i w:val="0"/>
         </w:rPr>
-        <w:t>, while HotFlip formalized gradient character flips</w:t>
+        <w:t>, and HotFlip formalized gradient</w:t>
+      </w:r>
+      <w:r>
+        <w:rPr>
+          <w:b w:val="0"/>
+          <w:i w:val="0"/>
+        </w:rPr>
+        <w:t>-</w:t>
+      </w:r>
+      <w:r>
+        <w:rPr>
+          <w:b w:val="0"/>
+          <w:i w:val="0"/>
+        </w:rPr>
+        <w:t>based character flips</w:t>
       </w:r>
       <w:r>
         <w:rPr>
@@ -1937,7 +1965,7 @@
           <w:b w:val="0"/>
           <w:i w:val="0"/>
         </w:rPr>
-        <w:t>level attacks replace whole words while preserving meaning. TextFooler searches synonyms greedily</w:t>
+        <w:t>level attacks replace whole words while keeping the meaning. TextFooler searches for synonyms greedily</w:t>
       </w:r>
       <w:r>
         <w:rPr>
@@ -1958,7 +1986,21 @@
           <w:b w:val="0"/>
           <w:i w:val="0"/>
         </w:rPr>
-        <w:t>, and PWWS ranks words by probability changes (saliency)</w:t>
+        <w:t>, and PWWS ranks words by how much a replacement changes the model</w:t>
+      </w:r>
+      <w:r>
+        <w:rPr>
+          <w:b w:val="0"/>
+          <w:i w:val="0"/>
+        </w:rPr>
+        <w:t>’</w:t>
+      </w:r>
+      <w:r>
+        <w:rPr>
+          <w:b w:val="0"/>
+          <w:i w:val="0"/>
+        </w:rPr>
+        <w:t>s confidence (its saliency)</w:t>
       </w:r>
       <w:r>
         <w:rPr>
@@ -1979,7 +2021,7 @@
           <w:b w:val="0"/>
           <w:i w:val="0"/>
         </w:rPr>
-        <w:t>. The TextAttack library organizes these methods into standard goals, constraints, and transformations</w:t>
+        <w:t>. The TextAttack library puts these methods into standard goals, limits and transformations</w:t>
       </w:r>
       <w:r>
         <w:rPr>
@@ -2000,7 +2042,7 @@
           <w:b w:val="0"/>
           <w:i w:val="0"/>
         </w:rPr>
-        <w:t>. In this paper, we evaluate two main search strengths. The first is a random draw over a small synonym table. This represents a simple adversary and serves as a lower bound on evasion rates. The second is a guided attack that ranks word swaps by their measured effect on the model (</w:t>
+        <w:t>. We test two search strengths. The first picks a synonym at random from a small table; it stands for a simple attacker and gives a lower bound on evasion. The second ranks word swaps by their measured effect on the model (</w:t>
       </w:r>
       <w:r>
         <w:rPr>
@@ -2021,7 +2063,7 @@
           <w:b w:val="0"/>
           <w:i w:val="0"/>
         </w:rPr>
-        <w:t xml:space="preserve">). In </w:t>
+        <w:t xml:space="preserve">), and we call it the guided attack. In </w:t>
       </w:r>
       <w:r>
         <w:rPr>
@@ -2042,7 +2084,7 @@
           <w:b w:val="0"/>
           <w:i w:val="0"/>
         </w:rPr>
-        <w:t>, we also test TextFooler</w:t>
+        <w:t xml:space="preserve"> we also run TextFooler</w:t>
       </w:r>
       <w:r>
         <w:rPr>
@@ -2084,7 +2126,7 @@
           <w:b w:val="0"/>
           <w:i w:val="0"/>
         </w:rPr>
-        <w:t>out word ranking as a reference arm. We use PWWS and TextFooler to define search logic rather than to compare numerical results directly.</w:t>
+        <w:t>out word ranking as a reference arm. We use PWWS and TextFooler to define the search logic, not to compare our numbers with the ones they report.</w:t>
       </w:r>
     </w:p>
     <w:p>
@@ -2092,7 +2134,7 @@
         <w:pStyle w:val="Heading3"/>
       </w:pPr>
       <w:r>
-        <w:t>Cross-model transfer and evaluation methodology.</w:t>
+        <w:t>Cross-model transfer, and how such results should be evaluated.</w:t>
       </w:r>
     </w:p>
     <w:p>
@@ -2118,7 +2160,7 @@
           <w:b w:val="0"/>
           <w:i w:val="0"/>
         </w:rPr>
-        <w:t>showed that adversarial text often transfers across different neural models, and they built ensembles to target multiple models together</w:t>
+        <w:t>showed that adversarial text often transfers across different neural models, and built ensembles that attack several models at once</w:t>
       </w:r>
       <w:r>
         <w:rPr>
@@ -2209,21 +2251,7 @@
           <w:b w:val="0"/>
           <w:i w:val="0"/>
         </w:rPr>
-        <w:t>. In our tests, black</w:t>
-      </w:r>
-      <w:r>
-        <w:rPr>
-          <w:b w:val="0"/>
-          <w:i w:val="0"/>
-        </w:rPr>
-        <w:t>-</w:t>
-      </w:r>
-      <w:r>
-        <w:rPr>
-          <w:b w:val="0"/>
-          <w:i w:val="0"/>
-        </w:rPr>
-        <w:t>box perturbations found on one model rarely transfer to another. Our adversary uses a bounded local search rather than learning global transfer directions. On statistical methodology, Carlini et al.</w:t>
+        <w:t>. In our tests, edits found on one model rarely work on another, because our attacker runs a bounded local search rather than learning directions that carry across models. On statistics, Carlini et al.</w:t>
       </w:r>
       <w:r>
         <w:rPr>
@@ -2237,7 +2265,7 @@
           <w:b w:val="0"/>
           <w:i w:val="0"/>
         </w:rPr>
-        <w:t>demonstrated that many adversarial robustness evaluations contain flaws and proposed standard practices for threat models</w:t>
+        <w:t>showed that many robustness evaluations contain flaws and proposed standard practice for threat models</w:t>
       </w:r>
       <w:r>
         <w:rPr>
@@ -2272,7 +2300,7 @@
           <w:b w:val="0"/>
           <w:i w:val="0"/>
         </w:rPr>
-        <w:t>used active tests to reveal weaknesses in 11 of 13 published defenses</w:t>
+        <w:t>used active tests to find weaknesses in 11 of 13 published defenses</w:t>
       </w:r>
       <w:r>
         <w:rPr>
@@ -2293,7 +2321,7 @@
           <w:b w:val="0"/>
           <w:i w:val="0"/>
         </w:rPr>
-        <w:t>. Recent research also highlights the importance of exact confidence intervals for robustness certificates</w:t>
+        <w:t>. Recent work also stresses the need for exact confidence intervals in robustness certificates</w:t>
       </w:r>
       <w:r>
         <w:rPr>
@@ -2314,7 +2342,7 @@
           <w:b w:val="0"/>
           <w:i w:val="0"/>
         </w:rPr>
-        <w:t>. We follow these rigorous practices. Every evasion rate in this paper reports its numerator, its denominator, and an exact Wilson interval</w:t>
+        <w:t>. We follow that practice: every evasion rate in this paper reports its numerator, its total count and an exact Wilson interval</w:t>
       </w:r>
       <w:r>
         <w:rPr>
@@ -2363,7 +2391,21 @@
           <w:b w:val="0"/>
           <w:i w:val="0"/>
         </w:rPr>
-        <w:t>The attacker controls the message text and nothing else: no access to weights, gradients, logits or the detector</w:t>
+        <w:t>The attacker controls the message text and nothing else: no access to the model weights, gradients, logits or detector code, and no way to retrain it. The attacker also wants the message to stay readable, so the edit budget is capped: at most 15</w:t>
+      </w:r>
+      <w:r>
+        <w:rPr>
+          <w:b w:val="0"/>
+          <w:i w:val="0"/>
+        </w:rPr>
+        <w:t>%</w:t>
+      </w:r>
+      <w:r>
+        <w:rPr>
+          <w:b w:val="0"/>
+          <w:i w:val="0"/>
+        </w:rPr>
+        <w:t xml:space="preserve"> of the message</w:t>
       </w:r>
       <w:r>
         <w:rPr>
@@ -2377,34 +2419,6 @@
           <w:b w:val="0"/>
           <w:i w:val="0"/>
         </w:rPr>
-        <w:t>s code, and no ability to retrain it. The attacker additionally wants the message to remain readable, so the edit budget is bounded: at most 15</w:t>
-      </w:r>
-      <w:r>
-        <w:rPr>
-          <w:b w:val="0"/>
-          <w:i w:val="0"/>
-        </w:rPr>
-        <w:t>%</w:t>
-      </w:r>
-      <w:r>
-        <w:rPr>
-          <w:b w:val="0"/>
-          <w:i w:val="0"/>
-        </w:rPr>
-        <w:t xml:space="preserve"> of the message</w:t>
-      </w:r>
-      <w:r>
-        <w:rPr>
-          <w:b w:val="0"/>
-          <w:i w:val="0"/>
-        </w:rPr>
-        <w:t>’</w:t>
-      </w:r>
-      <w:r>
-        <w:rPr>
-          <w:b w:val="0"/>
-          <w:i w:val="0"/>
-        </w:rPr>
         <w:t>s units (characters for the character</w:t>
       </w:r>
       <w:r>
@@ -2419,7 +2433,21 @@
           <w:b w:val="0"/>
           <w:i w:val="0"/>
         </w:rPr>
-        <w:t>level attack, whitespace tokens for the word</w:t>
+        <w:t>level attack, whitespace</w:t>
+      </w:r>
+      <w:r>
+        <w:rPr>
+          <w:b w:val="0"/>
+          <w:i w:val="0"/>
+        </w:rPr>
+        <w:t>-</w:t>
+      </w:r>
+      <w:r>
+        <w:rPr>
+          <w:b w:val="0"/>
+          <w:i w:val="0"/>
+        </w:rPr>
+        <w:t>separated tokens for the word</w:t>
       </w:r>
       <w:r>
         <w:rPr>
@@ -2441,7 +2469,7 @@
         <w:pStyle w:val="Heading3"/>
       </w:pPr>
       <w:r>
-        <w:t>Two access levels, reported separately.</w:t>
+        <w:t>Two levels of access, reported separately.</w:t>
       </w:r>
     </w:p>
     <w:p>
@@ -2453,7 +2481,7 @@
           <w:b w:val="0"/>
           <w:i w:val="0"/>
         </w:rPr>
-        <w:t xml:space="preserve">Not every attack in this paper assumes the same interface, and the paper never pools them. </w:t>
+        <w:t xml:space="preserve">Not every attack in this paper assumes the same interface, and the paper never adds them together. </w:t>
       </w:r>
       <w:r>
         <w:rPr>
@@ -2481,7 +2509,7 @@
           <w:b w:val="0"/>
           <w:i w:val="0"/>
         </w:rPr>
-        <w:t>word generated answer: malicious or benign, one bit per query. That is what a spammer probing a filter receives, and it is the oracle for the character and random</w:t>
+        <w:t>word generated answer: malicious or benign, one bit per query. That is what a spammer probing a filter receives, and it is the information source for the character and random</w:t>
       </w:r>
       <w:r>
         <w:rPr>
@@ -2530,7 +2558,7 @@
           <w:b w:val="0"/>
           <w:i w:val="0"/>
         </w:rPr>
-        <w:t xml:space="preserve"> additionally exposes </w:t>
+        <w:t xml:space="preserve"> also returns </w:t>
       </w:r>
       <w:r>
         <w:rPr>
@@ -2621,7 +2649,7 @@
           <w:b w:val="0"/>
           <w:i w:val="0"/>
         </w:rPr>
-        <w:t>), because a ranking needs a number and one bit per candidate cannot produce one. Every row in every table records which channel produced it, the two channels are never mixed in a single comparison, and the disagreement between them is itself reported (</w:t>
+        <w:t>), because a ranking needs a number and one bit per candidate cannot give one. Every row in every table records which channel produced it, the two channels are never mixed inside one comparison, and the disagreement between them is reported on its own (</w:t>
       </w:r>
       <w:r>
         <w:rPr>
@@ -2663,7 +2691,7 @@
           <w:b w:val="0"/>
           <w:i w:val="0"/>
         </w:rPr>
-        <w:t xml:space="preserve"> holds the oracle fixed across arms precisely so that the cost of dropping from probability access to verdict access is measured rather than assumed.</w:t>
+        <w:t xml:space="preserve"> holds the information source fixed across arms, precisely so that the cost of dropping from probability access to verdict access is measured rather than assumed.</w:t>
       </w:r>
     </w:p>
     <w:p>
@@ -2689,7 +2717,7 @@
           <w:b w:val="0"/>
           <w:i w:val="0"/>
         </w:rPr>
-        <w:t>only adversary is a deliberately weak one, and its ASR is a lower bound for that reason as well. A white</w:t>
+        <w:t>only adversary is deliberately weak, and for that reason its attack success rate (ASR) is a lower bound. An attacker with weight access, an embedding</w:t>
       </w:r>
       <w:r>
         <w:rPr>
@@ -2703,7 +2731,7 @@
           <w:b w:val="0"/>
           <w:i w:val="0"/>
         </w:rPr>
-        <w:t>box attacker with logit access, an embedding</w:t>
+        <w:t>space attack or a saliency</w:t>
       </w:r>
       <w:r>
         <w:rPr>
@@ -2717,21 +2745,7 @@
           <w:b w:val="0"/>
           <w:i w:val="0"/>
         </w:rPr>
-        <w:t>space attack, or a saliency</w:t>
-      </w:r>
-      <w:r>
-        <w:rPr>
-          <w:b w:val="0"/>
-          <w:i w:val="0"/>
-        </w:rPr>
-        <w:t>-</w:t>
-      </w:r>
-      <w:r>
-        <w:rPr>
-          <w:b w:val="0"/>
-          <w:i w:val="0"/>
-        </w:rPr>
-        <w:t>guided word search would do better. The point of a weak adversary is that a flip under it is unambiguously bad news for the detector: nothing exotic happened, the message simply stopped looking suspicious.</w:t>
+        <w:t>guided word search would do better. A weak adversary is useful precisely because a flip under it is unambiguously bad news for the detector: nothing exotic happened, the message simply stopped looking suspicious.</w:t>
       </w:r>
     </w:p>
     <w:p>
@@ -2747,7 +2761,7 @@
         <w:pStyle w:val="Heading3"/>
       </w:pPr>
       <w:r>
-        <w:t>Rule 1 — conditional denominator, re-queried.</w:t>
+        <w:t>Rule 1 — count only the messages the model had caught, and check them again.</w:t>
       </w:r>
     </w:p>
     <w:p>
@@ -2773,7 +2787,7 @@
           <w:b w:val="0"/>
           <w:i w:val="0"/>
         </w:rPr>
-        <w:t xml:space="preserve"> are attacked. The original text is queried again inside the attack run instead of trusting the baseline label, and a sample whose original is no longer read as malicious is </w:t>
+        <w:t xml:space="preserve"> are attacked. The original text is queried again inside the attack run instead of trusting the baseline label, and a sample whose original no longer reads as malicious is </w:t>
       </w:r>
       <w:r>
         <w:rPr>
@@ -2787,7 +2801,7 @@
           <w:b w:val="0"/>
           <w:i w:val="0"/>
         </w:rPr>
-        <w:t xml:space="preserve"> from the denominator rather than counted as a failed attack. In our runs this happened 52 times, and each exclusion is recorded with its reason. The 52 split into exactly two kinds, and the split is not the one an earlier draft reported. Forty</w:t>
+        <w:t xml:space="preserve"> from the total rather than counted as a failed attack. In our runs this happened 52 times, and each exclusion is recorded with its reason. The 52 fall into exactly two kinds, and the split is not the one an earlier draft reported. Forty</w:t>
       </w:r>
       <w:r>
         <w:rPr>
@@ -2801,7 +2815,7 @@
           <w:b w:val="0"/>
           <w:i w:val="0"/>
         </w:rPr>
-        <w:t>three are samples the saliency attack</w:t>
+        <w:t>three are samples that the saliency attack</w:t>
       </w:r>
       <w:r>
         <w:rPr>
@@ -2843,7 +2857,7 @@
           <w:b w:val="0"/>
           <w:i w:val="0"/>
         </w:rPr>
-        <w:t xml:space="preserve">3B, which is a channel artefact discussed in </w:t>
+        <w:t xml:space="preserve">3B, a channel problem discussed in </w:t>
       </w:r>
       <w:r>
         <w:rPr>
@@ -2878,7 +2892,7 @@
           <w:b w:val="0"/>
           <w:i w:val="0"/>
         </w:rPr>
-        <w:t>attack samples whose perturbation came out identical to the original, so no edit was measured and there was nothing to score. No original was dropped for any other reason: the generator route never re</w:t>
+        <w:t>attack samples whose edited text came out identical to the original, so no edit was made and there was nothing to score. No original was dropped for any other reason: the generated answer never re</w:t>
       </w:r>
       <w:r>
         <w:rPr>
@@ -2982,7 +2996,7 @@
           <w:b w:val="0"/>
           <w:i w:val="0"/>
         </w:rPr>
-        <w:t>attack comparison across different prompts measures the prompt.</w:t>
+        <w:t>attack comparison across two different prompts would measure the prompt, not the attack.</w:t>
       </w:r>
     </w:p>
     <w:p>
@@ -2990,7 +3004,7 @@
         <w:pStyle w:val="Heading3"/>
       </w:pPr>
       <w:r>
-        <w:t>Rule 3 — one shared budget, exact distance.</w:t>
+        <w:t>Rule 3 — one shared budget, measured exactly.</w:t>
       </w:r>
     </w:p>
     <w:p>
@@ -3016,7 +3030,7 @@
           <w:b w:val="0"/>
           <w:i w:val="0"/>
         </w:rPr>
-        <w:t xml:space="preserve"> budget is a single allowance for the whole perturbation, not one per operation, and the perturbation rate is the exact Levenshtein distance divided by the length of the original. Both details are load</w:t>
+        <w:t xml:space="preserve"> budget is a single allowance for the whole edit, not one per operation, and the edit rate is the exact Levenshtein distance (the smallest number of single</w:t>
       </w:r>
       <w:r>
         <w:rPr>
@@ -3030,7 +3044,7 @@
           <w:b w:val="0"/>
           <w:i w:val="0"/>
         </w:rPr>
-        <w:t>bearing. Giving each operation its own allowance let the real rate reach 22</w:t>
+        <w:t>character insertions, deletions and substitutions that turns one string into the other) divided by the length of the original. Both details matter. Giving each operation its own allowance let the real rate reach 22</w:t>
       </w:r>
       <w:r>
         <w:rPr>
@@ -3148,7 +3162,7 @@
           <w:b w:val="0"/>
           <w:i w:val="0"/>
         </w:rPr>
-        <w:t>set Jaccard overlap and call it Jaccard. No semantic</w:t>
+        <w:t>set Jaccard overlap and call it Jaccard. No sentence</w:t>
       </w:r>
       <w:r>
         <w:rPr>
@@ -3162,7 +3176,21 @@
           <w:b w:val="0"/>
           <w:i w:val="0"/>
         </w:rPr>
-        <w:t>similarity model is used anywhere in this study, so no BERTScore is claimed. For the character attack we additionally note that Jaccard is the wrong instrument: a homoglyph substitution changes the token, so word</w:t>
+        <w:t>similarity model is used anywhere in this study, so no BERTScore is claimed. For the character attack we add that Jaccard is the wrong tool: a look</w:t>
+      </w:r>
+      <w:r>
+        <w:rPr>
+          <w:b w:val="0"/>
+          <w:i w:val="0"/>
+        </w:rPr>
+        <w:t>-</w:t>
+      </w:r>
+      <w:r>
+        <w:rPr>
+          <w:b w:val="0"/>
+          <w:i w:val="0"/>
+        </w:rPr>
+        <w:t>alike substitution changes the token, so word</w:t>
       </w:r>
       <w:r>
         <w:rPr>
@@ -3184,7 +3212,7 @@
         <w:pStyle w:val="Heading2"/>
       </w:pPr>
       <w:r>
-        <w:t>3.3 Perturbations</w:t>
+        <w:t>3.3 Perturbations: what each attack changes</w:t>
       </w:r>
     </w:p>
     <w:p>
@@ -3203,7 +3231,21 @@
           <w:b w:val="0"/>
           <w:i w:val="0"/>
         </w:rPr>
-        <w:t xml:space="preserve"> Four operations share the budget: homoglyph substitution (Latin </w:t>
+        <w:t xml:space="preserve"> Four operations share the budget: look</w:t>
+      </w:r>
+      <w:r>
+        <w:rPr>
+          <w:b w:val="0"/>
+          <w:i w:val="0"/>
+        </w:rPr>
+        <w:t>-</w:t>
+      </w:r>
+      <w:r>
+        <w:rPr>
+          <w:b w:val="0"/>
+          <w:i w:val="0"/>
+        </w:rPr>
+        <w:t xml:space="preserve">alike substitution (the Latin letters </w:t>
       </w:r>
       <w:r>
         <w:rPr>
@@ -3455,21 +3497,7 @@
           <w:b w:val="0"/>
           <w:i w:val="0"/>
         </w:rPr>
-        <w:t xml:space="preserve"> replaced by Cyrillic codepoints), random deletion, random insertion of lowercase letters, and adjacent</w:t>
-      </w:r>
-      <w:r>
-        <w:rPr>
-          <w:b w:val="0"/>
-          <w:i w:val="0"/>
-        </w:rPr>
-        <w:t>-</w:t>
-      </w:r>
-      <w:r>
-        <w:rPr>
-          <w:b w:val="0"/>
-          <w:i w:val="0"/>
-        </w:rPr>
-        <w:t>position swap (costing two edits).</w:t>
+        <w:t xml:space="preserve"> replaced by Cyrillic characters that print the same), random deletion, random insertion of lowercase letters, and swapping two neighbouring characters (counting as two edits).</w:t>
       </w:r>
     </w:p>
     <w:p>
@@ -3488,7 +3516,7 @@
           <w:b w:val="0"/>
           <w:i w:val="0"/>
         </w:rPr>
-        <w:t xml:space="preserve"> Four operations share the budget: replacement of a word by one of its listed synonyms from a hand</w:t>
+        <w:t xml:space="preserve"> Four operations share the budget: replacing a word with one of its listed synonyms from a hand</w:t>
       </w:r>
       <w:r>
         <w:rPr>
@@ -3535,7 +3563,7 @@
           <w:b w:val="0"/>
           <w:i w:val="0"/>
         </w:rPr>
-        <w:t xml:space="preserve"> The two random attacks give each sample up to three independent attempts with a per</w:t>
+        <w:t xml:space="preserve"> The two random attacks give each sample up to three independent attempts from a per</w:t>
       </w:r>
       <w:r>
         <w:rPr>
@@ -3549,7 +3577,7 @@
           <w:b w:val="0"/>
           <w:i w:val="0"/>
         </w:rPr>
-        <w:t>sample seeded random generator, stopping at the first flip, so a message can cost one to four queries: one for the re</w:t>
+        <w:t>sample seeded random generator, stopping at the first flip, so one message can cost one to four queries: one for the re</w:t>
       </w:r>
       <w:r>
         <w:rPr>
@@ -3633,7 +3661,7 @@
           <w:b w:val="0"/>
           <w:i w:val="0"/>
         </w:rPr>
-        <w:t xml:space="preserve">queries after each accepted edit, 22.9 queries per message on average. The earlier draft of this paragraph said </w:t>
+        <w:t xml:space="preserve">queries after each accepted edit, 22.9 queries per message on average. An earlier draft of this paragraph said </w:t>
       </w:r>
       <w:r>
         <w:rPr>
@@ -3701,7 +3729,7 @@
           <w:b w:val="0"/>
           <w:i w:val="0"/>
         </w:rPr>
-        <w:t>s perturbed text, verdict, edit count and rate is written to the per</w:t>
+        <w:t>s edited text, verdict, edit count and rate is written to the per</w:t>
       </w:r>
       <w:r>
         <w:rPr>
@@ -3763,7 +3791,7 @@
           <w:b w:val="0"/>
           <w:i w:val="0"/>
         </w:rPr>
-        <w:t xml:space="preserve"> attacks is a binomial proportion. We report the 95</w:t>
+        <w:t xml:space="preserve"> attacks is a share of a fixed number of attempts. We report the 95</w:t>
       </w:r>
       <w:r>
         <w:rPr>
@@ -3791,7 +3819,7 @@
           <w:b w:val="0"/>
           <w:i w:val="0"/>
         </w:rPr>
-        <w:t xml:space="preserve"> and, crucially, does not collapse at the boundary: a row with </w:t>
+        <w:t xml:space="preserve"> and, more importantly, does not collapse at the edge: a row with </w:t>
       </w:r>
       <w:r>
         <w:rPr>
@@ -3847,7 +3875,21 @@
           <w:b w:val="0"/>
           <w:i w:val="0"/>
         </w:rPr>
-        <w:t>. A percentile bootstrap over the same rows (10</w:t>
+        <w:t>. As a cross</w:t>
+      </w:r>
+      <w:r>
+        <w:rPr>
+          <w:b w:val="0"/>
+          <w:i w:val="0"/>
+        </w:rPr>
+        <w:t>-</w:t>
+      </w:r>
+      <w:r>
+        <w:rPr>
+          <w:b w:val="0"/>
+          <w:i w:val="0"/>
+        </w:rPr>
+        <w:t>check we also compute a percentile bootstrap over the same rows (10</w:t>
       </w:r>
       <w:r>
         <w:rPr>
@@ -3861,21 +3903,7 @@
           <w:b w:val="0"/>
           <w:i w:val="0"/>
         </w:rPr>
-        <w:t>000 resamples, fixed seed) is computed as a cross</w:t>
-      </w:r>
-      <w:r>
-        <w:rPr>
-          <w:b w:val="0"/>
-          <w:i w:val="0"/>
-        </w:rPr>
-        <w:t>-</w:t>
-      </w:r>
-      <w:r>
-        <w:rPr>
-          <w:b w:val="0"/>
-          <w:i w:val="0"/>
-        </w:rPr>
-        <w:t xml:space="preserve">check and agrees with Wilson wherever </w:t>
+        <w:t xml:space="preserve">000 resamples, fixed seed), which agrees with Wilson wherever </w:t>
       </w:r>
       <w:r>
         <w:rPr>
@@ -3903,7 +3931,7 @@
           <w:b w:val="0"/>
           <w:i w:val="0"/>
         </w:rPr>
-        <w:t xml:space="preserve"> the bootstrap degenerates to </w:t>
+        <w:t xml:space="preserve"> the bootstrap collapses to </w:t>
       </w:r>
       <w:r>
         <w:rPr>
@@ -3917,7 +3945,7 @@
           <w:b w:val="0"/>
           <w:i w:val="0"/>
         </w:rPr>
-        <w:t xml:space="preserve"> and we quote Wilson instead. The interval covers sampling variability over </w:t>
+        <w:t xml:space="preserve"> and we quote Wilson instead. The interval covers sampling variation over </w:t>
       </w:r>
       <w:r>
         <w:rPr>
@@ -3931,7 +3959,7 @@
           <w:b w:val="0"/>
           <w:i w:val="0"/>
         </w:rPr>
-        <w:t>, not variation of the perturbation seed; estimating the latter requires a second run over the same samples, which is what the seed sweep below does.</w:t>
+        <w:t>, not variation of the perturbation seed; measuring the latter needs a second run over the same samples, which is what the seed sweep below does.</w:t>
       </w:r>
     </w:p>
     <w:p>
@@ -4035,35 +4063,7 @@
           <w:b w:val="0"/>
           <w:i w:val="0"/>
         </w:rPr>
-        <w:t>runs one arm at several seeds, so the seed</w:t>
-      </w:r>
-      <w:r>
-        <w:rPr>
-          <w:b w:val="0"/>
-          <w:i w:val="0"/>
-        </w:rPr>
-        <w:t>-</w:t>
-      </w:r>
-      <w:r>
-        <w:rPr>
-          <w:b w:val="0"/>
-          <w:i w:val="0"/>
-        </w:rPr>
-        <w:t>to</w:t>
-      </w:r>
-      <w:r>
-        <w:rPr>
-          <w:b w:val="0"/>
-          <w:i w:val="0"/>
-        </w:rPr>
-        <w:t>-</w:t>
-      </w:r>
-      <w:r>
-        <w:rPr>
-          <w:b w:val="0"/>
-          <w:i w:val="0"/>
-        </w:rPr>
-        <w:t xml:space="preserve">seed spread can be reported next to the sampling interval rather than absorbed into it. The sweep is implemented; its cells are not part of the numbers in this version, and </w:t>
+        <w:t xml:space="preserve">runs one arm at several seeds, so the spread between seeds can be reported next to the sampling interval rather than absorbed into it. The sweep is implemented; its cells are not part of the numbers in this version, and </w:t>
       </w:r>
       <w:r>
         <w:rPr>
@@ -4112,7 +4112,7 @@
           <w:b w:val="0"/>
           <w:i w:val="0"/>
         </w:rPr>
-        <w:t xml:space="preserve">Two triage tasks. </w:t>
+        <w:t xml:space="preserve">Two sorting tasks. </w:t>
       </w:r>
       <w:r>
         <w:rPr>
@@ -4182,35 +4182,7 @@
           <w:b w:val="0"/>
           <w:i w:val="0"/>
         </w:rPr>
-        <w:t>s spam class is dominated by scam and prize messages rather than by credential</w:t>
-      </w:r>
-      <w:r>
-        <w:rPr>
-          <w:b w:val="0"/>
-          <w:i w:val="0"/>
-        </w:rPr>
-        <w:t>-</w:t>
-      </w:r>
-      <w:r>
-        <w:rPr>
-          <w:b w:val="0"/>
-          <w:i w:val="0"/>
-        </w:rPr>
-        <w:t>harvesting links, and we flag this as a construct</w:t>
-      </w:r>
-      <w:r>
-        <w:rPr>
-          <w:b w:val="0"/>
-          <w:i w:val="0"/>
-        </w:rPr>
-        <w:t>-</w:t>
-      </w:r>
-      <w:r>
-        <w:rPr>
-          <w:b w:val="0"/>
-          <w:i w:val="0"/>
-        </w:rPr>
-        <w:t xml:space="preserve">validity limit rather than hide it. </w:t>
+        <w:t xml:space="preserve">s spam class is mostly scam and prize messages rather than messages that steal passwords, and we state that as a limit on what the label means instead of hiding it. </w:t>
       </w:r>
       <w:r>
         <w:rPr>
@@ -4377,7 +4349,35 @@
           <w:b w:val="0"/>
           <w:i w:val="0"/>
         </w:rPr>
-        <w:t>The evaluation split is balanced and frozen: 200 benign and 200 malicious rows per task, 800 rows in total, drawn with seed 42. The split is byte</w:t>
+        <w:t>The evaluation split is balanced and frozen: 200 benign and 200 malicious rows per task, 800 rows in total, drawn with seed 42. The split is identical in every run, and its hash is checked by the artefact</w:t>
+      </w:r>
+      <w:r>
+        <w:rPr>
+          <w:b w:val="0"/>
+          <w:i w:val="0"/>
+        </w:rPr>
+        <w:t>’</w:t>
+      </w:r>
+      <w:r>
+        <w:rPr>
+          <w:b w:val="0"/>
+          <w:i w:val="0"/>
+        </w:rPr>
+        <w:t xml:space="preserve">s setup step, so a run that uses different data fails before it can report a number. Attacks are launched on the caught subset </w:t>
+      </w:r>
+      <w:r>
+        <w:rPr>
+          <w:b w:val="0"/>
+          <w:i/>
+        </w:rPr>
+        <w:t>of this evaluation split</w:t>
+      </w:r>
+      <w:r>
+        <w:rPr>
+          <w:b w:val="0"/>
+          <w:i w:val="0"/>
+        </w:rPr>
+        <w:t>, which is a within</w:t>
       </w:r>
       <w:r>
         <w:rPr>
@@ -4391,49 +4391,7 @@
           <w:b w:val="0"/>
           <w:i w:val="0"/>
         </w:rPr>
-        <w:t>identical across every run, and its fingerprint is asserted by the artefact</w:t>
-      </w:r>
-      <w:r>
-        <w:rPr>
-          <w:b w:val="0"/>
-          <w:i w:val="0"/>
-        </w:rPr>
-        <w:t>’</w:t>
-      </w:r>
-      <w:r>
-        <w:rPr>
-          <w:b w:val="0"/>
-          <w:i w:val="0"/>
-        </w:rPr>
-        <w:t xml:space="preserve">s bootstrap step, so a run that uses different data fails before it can report a number. Attacks are launched on the caught subset </w:t>
-      </w:r>
-      <w:r>
-        <w:rPr>
-          <w:b w:val="0"/>
-          <w:i/>
-        </w:rPr>
-        <w:t>of this evaluation split</w:t>
-      </w:r>
-      <w:r>
-        <w:rPr>
-          <w:b w:val="0"/>
-          <w:i w:val="0"/>
-        </w:rPr>
-        <w:t>, which is a within</w:t>
-      </w:r>
-      <w:r>
-        <w:rPr>
-          <w:b w:val="0"/>
-          <w:i w:val="0"/>
-        </w:rPr>
-        <w:t>-</w:t>
-      </w:r>
-      <w:r>
-        <w:rPr>
-          <w:b w:val="0"/>
-          <w:i w:val="0"/>
-        </w:rPr>
-        <w:t>sample design: the same 800 rows supply both the baseline and the attack set. We state this because it means the ASR is not an out</w:t>
+        <w:t>sample design: the same 800 rows supply both the baseline and the attack set. We say so because it means the ASR is not an out</w:t>
       </w:r>
       <w:r>
         <w:rPr>
@@ -4509,7 +4467,7 @@
           <w:b w:val="0"/>
           <w:i w:val="0"/>
         </w:rPr>
-        <w:t>tuned models, all quantisation</w:t>
+        <w:t>tuned models, none of them compressed at inference: Qwen2.5</w:t>
       </w:r>
       <w:r>
         <w:rPr>
@@ -4523,7 +4481,7 @@
           <w:b w:val="0"/>
           <w:i w:val="0"/>
         </w:rPr>
-        <w:t>free at inference: Qwen2.5</w:t>
+        <w:t>3B</w:t>
       </w:r>
       <w:r>
         <w:rPr>
@@ -4537,6 +4495,104 @@
           <w:b w:val="0"/>
           <w:i w:val="0"/>
         </w:rPr>
+        <w:t>Instruct, SmolLM2</w:t>
+      </w:r>
+      <w:r>
+        <w:rPr>
+          <w:b w:val="0"/>
+          <w:i w:val="0"/>
+        </w:rPr>
+        <w:t>-</w:t>
+      </w:r>
+      <w:r>
+        <w:rPr>
+          <w:b w:val="0"/>
+          <w:i w:val="0"/>
+        </w:rPr>
+        <w:t>1.7B</w:t>
+      </w:r>
+      <w:r>
+        <w:rPr>
+          <w:b w:val="0"/>
+          <w:i w:val="0"/>
+        </w:rPr>
+        <w:t>-</w:t>
+      </w:r>
+      <w:r>
+        <w:rPr>
+          <w:b w:val="0"/>
+          <w:i w:val="0"/>
+        </w:rPr>
+        <w:t>Instruct and Phi</w:t>
+      </w:r>
+      <w:r>
+        <w:rPr>
+          <w:b w:val="0"/>
+          <w:i w:val="0"/>
+        </w:rPr>
+        <w:t>-</w:t>
+      </w:r>
+      <w:r>
+        <w:rPr>
+          <w:b w:val="0"/>
+          <w:i w:val="0"/>
+        </w:rPr>
+        <w:t>3.5</w:t>
+      </w:r>
+      <w:r>
+        <w:rPr>
+          <w:b w:val="0"/>
+          <w:i w:val="0"/>
+        </w:rPr>
+        <w:t>-</w:t>
+      </w:r>
+      <w:r>
+        <w:rPr>
+          <w:b w:val="0"/>
+          <w:i w:val="0"/>
+        </w:rPr>
+        <w:t>mini</w:t>
+      </w:r>
+      <w:r>
+        <w:rPr>
+          <w:b w:val="0"/>
+          <w:i w:val="0"/>
+        </w:rPr>
+        <w:t>-</w:t>
+      </w:r>
+      <w:r>
+        <w:rPr>
+          <w:b w:val="0"/>
+          <w:i w:val="0"/>
+        </w:rPr>
+        <w:t>instruct (3.8B). A fourth model, Llama</w:t>
+      </w:r>
+      <w:r>
+        <w:rPr>
+          <w:b w:val="0"/>
+          <w:i w:val="0"/>
+        </w:rPr>
+        <w:t>-</w:t>
+      </w:r>
+      <w:r>
+        <w:rPr>
+          <w:b w:val="0"/>
+          <w:i w:val="0"/>
+        </w:rPr>
+        <w:t>3.2</w:t>
+      </w:r>
+      <w:r>
+        <w:rPr>
+          <w:b w:val="0"/>
+          <w:i w:val="0"/>
+        </w:rPr>
+        <w:t>-</w:t>
+      </w:r>
+      <w:r>
+        <w:rPr>
+          <w:b w:val="0"/>
+          <w:i w:val="0"/>
+        </w:rPr>
         <w:t>3B</w:t>
       </w:r>
       <w:r>
@@ -4551,119 +4607,7 @@
           <w:b w:val="0"/>
           <w:i w:val="0"/>
         </w:rPr>
-        <w:t>Instruct, SmolLM2</w:t>
-      </w:r>
-      <w:r>
-        <w:rPr>
-          <w:b w:val="0"/>
-          <w:i w:val="0"/>
-        </w:rPr>
-        <w:t>-</w:t>
-      </w:r>
-      <w:r>
-        <w:rPr>
-          <w:b w:val="0"/>
-          <w:i w:val="0"/>
-        </w:rPr>
-        <w:t>1.7B</w:t>
-      </w:r>
-      <w:r>
-        <w:rPr>
-          <w:b w:val="0"/>
-          <w:i w:val="0"/>
-        </w:rPr>
-        <w:t>-</w:t>
-      </w:r>
-      <w:r>
-        <w:rPr>
-          <w:b w:val="0"/>
-          <w:i w:val="0"/>
-        </w:rPr>
-        <w:t>Instruct and Phi</w:t>
-      </w:r>
-      <w:r>
-        <w:rPr>
-          <w:b w:val="0"/>
-          <w:i w:val="0"/>
-        </w:rPr>
-        <w:t>-</w:t>
-      </w:r>
-      <w:r>
-        <w:rPr>
-          <w:b w:val="0"/>
-          <w:i w:val="0"/>
-        </w:rPr>
-        <w:t>3.5</w:t>
-      </w:r>
-      <w:r>
-        <w:rPr>
-          <w:b w:val="0"/>
-          <w:i w:val="0"/>
-        </w:rPr>
-        <w:t>-</w:t>
-      </w:r>
-      <w:r>
-        <w:rPr>
-          <w:b w:val="0"/>
-          <w:i w:val="0"/>
-        </w:rPr>
-        <w:t>mini</w:t>
-      </w:r>
-      <w:r>
-        <w:rPr>
-          <w:b w:val="0"/>
-          <w:i w:val="0"/>
-        </w:rPr>
-        <w:t>-</w:t>
-      </w:r>
-      <w:r>
-        <w:rPr>
-          <w:b w:val="0"/>
-          <w:i w:val="0"/>
-        </w:rPr>
-        <w:t>instruct (3.8B). A fourth model, Llama</w:t>
-      </w:r>
-      <w:r>
-        <w:rPr>
-          <w:b w:val="0"/>
-          <w:i w:val="0"/>
-        </w:rPr>
-        <w:t>-</w:t>
-      </w:r>
-      <w:r>
-        <w:rPr>
-          <w:b w:val="0"/>
-          <w:i w:val="0"/>
-        </w:rPr>
-        <w:t>3.2</w:t>
-      </w:r>
-      <w:r>
-        <w:rPr>
-          <w:b w:val="0"/>
-          <w:i w:val="0"/>
-        </w:rPr>
-        <w:t>-</w:t>
-      </w:r>
-      <w:r>
-        <w:rPr>
-          <w:b w:val="0"/>
-          <w:i w:val="0"/>
-        </w:rPr>
-        <w:t>3B</w:t>
-      </w:r>
-      <w:r>
-        <w:rPr>
-          <w:b w:val="0"/>
-          <w:i w:val="0"/>
-        </w:rPr>
-        <w:t>-</w:t>
-      </w:r>
-      <w:r>
-        <w:rPr>
-          <w:b w:val="0"/>
-          <w:i w:val="0"/>
-        </w:rPr>
-        <w:t>Instruct, was planned but is gated behind a licence acceptance and is not part of any number reported here.</w:t>
+        <w:t>Instruct, was planned but sits behind a licence acceptance and is not part of any number reported here.</w:t>
       </w:r>
     </w:p>
     <w:p>
@@ -4697,7 +4641,7 @@
           <w:b w:val="0"/>
           <w:i w:val="0"/>
         </w:rPr>
-        <w:t>compatible endpoint and queried with the same message list. Generation is greedy (temperature 0), capped at 8 new tokens, with a single</w:t>
+        <w:t>compatible endpoint and queried with the same list of messages. Generation is greedy (temperature 0), capped at 8 new tokens, with a single</w:t>
       </w:r>
       <w:r>
         <w:rPr>
@@ -4725,7 +4669,7 @@
           <w:b w:val="0"/>
           <w:i w:val="0"/>
         </w:rPr>
-        <w:t>; unparsed verdicts are counted separately and never guessed. In the runs reported here, no verdict failed to parse. Models are loaded in half precision on one T4 GPU with automatic device placement.</w:t>
+        <w:t>; unparsed answers are counted separately and never guessed. In the runs reported here, no answer failed to parse. Models are loaded at half precision on one T4 GPU with automatic device placement.</w:t>
       </w:r>
     </w:p>
     <w:p>
@@ -4856,7 +4800,7 @@
           <w:b w:val="0"/>
           <w:i w:val="0"/>
         </w:rPr>
-        <w:t>queries the model. The results are then evaluated for transfer and defense robustness.</w:t>
+        <w:t>queries the model. The results are then evaluated for transfer to other models and for defenses.</w:t>
       </w:r>
     </w:p>
     <w:p>
@@ -4962,21 +4906,7 @@
           <w:b w:val="0"/>
           <w:i w:val="0"/>
         </w:rPr>
-        <w:t>sample perturbation seeds are fixed. The study was run twice end to end (two independent GPU sessions); per</w:t>
-      </w:r>
-      <w:r>
-        <w:rPr>
-          <w:b w:val="0"/>
-          <w:i w:val="0"/>
-        </w:rPr>
-        <w:t>-</w:t>
-      </w:r>
-      <w:r>
-        <w:rPr>
-          <w:b w:val="0"/>
-          <w:i w:val="0"/>
-        </w:rPr>
-        <w:t>sample comparison of the two runs, joined on sample id, gives identical attacked ids and identical success flags in all six result files, with differences only in empty cells of the excluded rows. The second run is the one whose outputs are reported here.</w:t>
+        <w:t>sample perturbation seeds are fixed. The study was run twice from start to finish (two independent GPU sessions); comparing the two runs sample by sample, joined on sample id, gives identical attacked ids and identical success flags in all six result files, with differences only in empty cells of the excluded rows. The second run is the one whose outputs are reported here.</w:t>
       </w:r>
     </w:p>
     <w:p>
@@ -5039,7 +4969,7 @@
           <w:b w:val="0"/>
           <w:i w:val="0"/>
         </w:rPr>
-        <w:t>shot baseline. Two rows matter more than the accuracy column.</w:t>
+        <w:t>shot baseline, before any attack. Two rows matter more than the accuracy column.</w:t>
       </w:r>
     </w:p>
     <w:p>
@@ -5079,7 +5009,7 @@
           <w:b/>
           <w:i w:val="0"/>
         </w:rPr>
-        <w:t>mini is a conservative detector on e</w:t>
+        <w:t>mini is a cautious detector on e</w:t>
       </w:r>
       <w:r>
         <w:rPr>
@@ -5114,7 +5044,7 @@
           <w:b w:val="0"/>
           <w:i w:val="0"/>
         </w:rPr>
-        <w:t>. It is the model that leaves most malicious mail in the analyst</w:t>
+        <w:t>. It is the model that leaves the most malicious mail in the analyst</w:t>
       </w:r>
       <w:r>
         <w:rPr>
@@ -5203,7 +5133,7 @@
           <w:b w:val="0"/>
           <w:i w:val="0"/>
         </w:rPr>
-        <w:t xml:space="preserve"> almost always is trivially hard to flip towards </w:t>
+        <w:t xml:space="preserve"> almost always is easy to flip towards </w:t>
       </w:r>
       <w:r>
         <w:rPr>
@@ -6859,7 +6789,7 @@
           <w:b w:val="0"/>
           <w:i w:val="0"/>
         </w:rPr>
-        <w:t xml:space="preserve"> budget the mean perturbation actually spent was 13.3</w:t>
+        <w:t xml:space="preserve"> budget the mean edit actually spent was 13.3</w:t>
       </w:r>
       <w:r>
         <w:rPr>
@@ -7039,7 +6969,7 @@
           <w:b w:val="0"/>
           <w:i w:val="0"/>
         </w:rPr>
-        <w:t>3B) flips once in 191 attacks, and on SMS it flips zero times in 188 attempts. A zero is reported as a bounded measurement, not a proof: the Wilson upper bound for that row is 2.0</w:t>
+        <w:t>3B) flips once in 191 attacks, and on SMS it flips zero times in 188 attempts. A zero is reported as a bounded measurement, not as a proof: the Wilson upper bound for that row is 2.0</w:t>
       </w:r>
       <w:r>
         <w:rPr>
@@ -9032,21 +8962,7 @@
           <w:b w:val="0"/>
           <w:i w:val="0"/>
         </w:rPr>
-        <w:t>0.950, i.e.</w:t>
-      </w:r>
-      <w:r>
-        <w:rPr>
-          <w:b w:val="0"/>
-          <w:i w:val="0"/>
-        </w:rPr>
-        <w:t xml:space="preserve"> </w:t>
-      </w:r>
-      <w:r>
-        <w:rPr>
-          <w:b w:val="0"/>
-          <w:i w:val="0"/>
-        </w:rPr>
-        <w:t>the messages are 92</w:t>
+        <w:t>0.950, so the messages are 92</w:t>
       </w:r>
       <w:r>
         <w:rPr>
@@ -9142,21 +9058,7 @@
           <w:b w:val="0"/>
           <w:i w:val="0"/>
         </w:rPr>
-        <w:t>6.9). Word</w:t>
-      </w:r>
-      <w:r>
-        <w:rPr>
-          <w:b w:val="0"/>
-          <w:i w:val="0"/>
-        </w:rPr>
-        <w:t>-</w:t>
-      </w:r>
-      <w:r>
-        <w:rPr>
-          <w:b w:val="0"/>
-          <w:i w:val="0"/>
-        </w:rPr>
-        <w:t>level changes carry semantic weight that a single glyph does not: replacing a suspicious verb with a neutral synonym, or deleting the word that carried the urgency, moves a verdict that typo noise does not.</w:t>
+        <w:t>6.9). A replaced word carries meaning that a single letter does not: swapping a suspicious verb for a neutral synonym, or deleting the word that carried the urgency, moves a verdict that typo noise leaves alone.</w:t>
       </w:r>
     </w:p>
     <w:p>
@@ -11044,7 +10946,7 @@
           <w:b w:val="0"/>
           <w:i w:val="0"/>
         </w:rPr>
-        <w:t xml:space="preserve"> is the same accounting drawn instead of summed: one point per model, task and attack, spent budget on the horizontal axis. Both modes stay inside the shared budget, and the word attack reaches a comparable number of flips with about half the fraction of units changed. That asymmetry is the paper</w:t>
+        <w:t xml:space="preserve"> draws the same accounting instead of summing it: one point per model, task and attack, with the budget spent on the horizontal axis. Both modes stay inside the shared budget, and the word attack reaches a similar number of flips with about half the share of units changed. That imbalance is the paper</w:t>
       </w:r>
       <w:r>
         <w:rPr>
@@ -11058,7 +10960,7 @@
           <w:b w:val="0"/>
           <w:i w:val="0"/>
         </w:rPr>
-        <w:t xml:space="preserve">s main empirical point: for these models, </w:t>
+        <w:t xml:space="preserve">s main measured point: for these models, </w:t>
       </w:r>
       <w:r>
         <w:rPr>
@@ -11717,7 +11619,7 @@
           <w:i/>
           <w:sz w:val="18"/>
         </w:rPr>
-        <w:t>Each point is one (model, task, attack) cell: the perturbation actually spent on the horizontal axis, the ASR with its 95</w:t>
+        <w:t>Each point is one (model, task, attack) cell: the edit actually spent on the horizontal axis, the ASR with its 95</w:t>
       </w:r>
       <w:r>
         <w:rPr>
@@ -11909,23 +11811,7 @@
           <w:i/>
           <w:sz w:val="18"/>
         </w:rPr>
-        <w:t>, which is drawn here for comparison but costs 22.9 model queries per message against 3.9 for the two random attacks, so the bars are not a cost</w:t>
-      </w:r>
-      <w:r>
-        <w:rPr>
-          <w:b w:val="0"/>
-          <w:i/>
-          <w:sz w:val="18"/>
-        </w:rPr>
-        <w:t>-</w:t>
-      </w:r>
-      <w:r>
-        <w:rPr>
-          <w:b w:val="0"/>
-          <w:i/>
-          <w:sz w:val="18"/>
-        </w:rPr>
-        <w:t>matched comparison. The number above each interval is the denominator: the messages that model had caught on the clean text and that were therefore attacked. A cell at zero is drawn with its interval, not as a point at the origin, because 0/188 is a bounded measurement rather than a proof of robustness.</w:t>
+        <w:t>, which is drawn here for comparison but costs 22.9 model queries per message against 3.9 for the two random attacks, so the bars are not a comparison at equal cost. The number above each interval is the total count: the messages that model had caught on the clean text and that were therefore attacked. A cell at zero is drawn with its interval, not as a point at the origin, because 0/188 is a bounded measurement rather than a proof of robustness.</w:t>
       </w:r>
     </w:p>
     <w:p>
@@ -11959,7 +11845,7 @@
           <w:b w:val="0"/>
           <w:i w:val="0"/>
         </w:rPr>
-        <w:t>task cells, the ASR orders by proximity to the decision boundary rather than by accuracy. Phi</w:t>
+        <w:t>task cells, the ASR follows how close a model sits to its decision boundary rather than how accurate it is. Phi</w:t>
       </w:r>
       <w:r>
         <w:rPr>
@@ -12071,7 +11957,7 @@
           <w:b w:val="0"/>
           <w:i w:val="0"/>
         </w:rPr>
-        <w:t xml:space="preserve"> because its decision rule is nearly constant. A small perturbation either does nothing or, in the case of the 2 of 196 word attacks that flipped it, pushes a barely</w:t>
+        <w:t xml:space="preserve"> because its decision rule is nearly constant. A small edit either does nothing or, as in the case of the 2 of 196 word attacks that flipped it, pushes a barely</w:t>
       </w:r>
       <w:r>
         <w:rPr>
@@ -12381,7 +12267,7 @@
           <w:b w:val="0"/>
           <w:i w:val="0"/>
         </w:rPr>
-        <w:t>perturbation cell exceeds 10.7</w:t>
+        <w:t>edit cell exceeds 10.7</w:t>
       </w:r>
       <w:r>
         <w:rPr>
@@ -12472,7 +12358,7 @@
           <w:b w:val="0"/>
           <w:i w:val="0"/>
         </w:rPr>
-        <w:t xml:space="preserve"> edit budget a random perturbation leaves these models close to robust</w:t>
+        <w:t xml:space="preserve"> edit budget a random edit leaves these models close to robust</w:t>
       </w:r>
       <w:r>
         <w:rPr>
@@ -12590,7 +12476,7 @@
           <w:b w:val="0"/>
           <w:i w:val="0"/>
         </w:rPr>
-        <w:t>sample outcomes on the message identifier and report the discordant counts, an exact McNemar test, and a paired bootstrap of the risk difference over messages.</w:t>
+        <w:t>sample outcomes on the message identifier and report the counts of messages the two attacks disagree on, an exact McNemar test, and a paired bootstrap of the difference in risk over messages.</w:t>
       </w:r>
     </w:p>
     <w:p>
@@ -15961,7 +15847,7 @@
           <w:b w:val="0"/>
           <w:i w:val="0"/>
         </w:rPr>
-        <w:t xml:space="preserve"> but only one cell is separately significant, because there the character attack flipped nothing at all. What survives is a pooled statement about this corpus and these three models, not a per</w:t>
+        <w:t xml:space="preserve"> but only one cell is significant on its own, because there the character attack flipped nothing at all. What survives is a pooled statement about this corpus and these three models, not a per</w:t>
       </w:r>
       <w:r>
         <w:rPr>
@@ -16037,7 +15923,7 @@
           <w:b w:val="0"/>
           <w:i w:val="0"/>
         </w:rPr>
-        <w:t xml:space="preserve"> draws its substitution uniformly at random from a small synonym table. It answers </w:t>
+        <w:t xml:space="preserve"> picks its replacement at random from a small synonym table. It answers </w:t>
       </w:r>
       <w:r>
         <w:rPr>
@@ -16093,7 +15979,7 @@
           <w:b w:val="0"/>
           <w:i w:val="0"/>
         </w:rPr>
-        <w:t xml:space="preserve"> and leaves the distribution of fragility unmeasured: a flip caused by deleting the word </w:t>
+        <w:t xml:space="preserve"> and leaves the location of the weakness unmeasured: a flip caused by deleting the word </w:t>
       </w:r>
       <w:r>
         <w:rPr>
@@ -16141,7 +16027,7 @@
           <w:b w:val="0"/>
           <w:i w:val="0"/>
         </w:rPr>
-        <w:t>We implement the ordering of PWWS</w:t>
+        <w:t>We use the ordering of PWWS</w:t>
       </w:r>
       <w:r>
         <w:rPr>
@@ -16311,7 +16197,7 @@
           <w:b w:val="0"/>
           <w:i w:val="0"/>
         </w:rPr>
-        <w:t xml:space="preserve"> be measured with the same prompt. Word saliency and the substitution priority are</w:t>
+        <w:t xml:space="preserve"> be measured with the same prompt. The importance of a word (its saliency) and the priority of a substitution are</w:t>
       </w:r>
     </w:p>
     <w:p>
@@ -16592,21 +16478,7 @@
           <w:b w:val="0"/>
           <w:i w:val="0"/>
         </w:rPr>
-        <w:t>; after each accepted edit the verdict is re</w:t>
-      </w:r>
-      <w:r>
-        <w:rPr>
-          <w:b w:val="0"/>
-          <w:i w:val="0"/>
-        </w:rPr>
-        <w:t>-</w:t>
-      </w:r>
-      <w:r>
-        <w:rPr>
-          <w:b w:val="0"/>
-          <w:i w:val="0"/>
-        </w:rPr>
-        <w:t>queried, and the attack stops at the first flip or when the shared 15</w:t>
+        <w:t>; after each accepted edit the verdict is queried again, and the attack stops at the first flip or when the shared 15</w:t>
       </w:r>
       <w:r>
         <w:rPr>
@@ -16620,7 +16492,7 @@
           <w:b w:val="0"/>
           <w:i w:val="0"/>
         </w:rPr>
-        <w:t xml:space="preserve"> word budget is exhausted.</w:t>
+        <w:t xml:space="preserve"> word budget is used up.</w:t>
       </w:r>
     </w:p>
     <w:p>
@@ -16632,7 +16504,7 @@
           <w:b w:val="0"/>
           <w:i w:val="0"/>
         </w:rPr>
-        <w:t xml:space="preserve">The normalisation of </w:t>
+        <w:t xml:space="preserve">The normalization of </w:t>
       </w:r>
       <w:r>
         <w:rPr>
@@ -16646,7 +16518,7 @@
           <w:b w:val="0"/>
           <w:i w:val="0"/>
         </w:rPr>
-        <w:t xml:space="preserve"> is not cosmetic. With raw saliency and </w:t>
+        <w:t xml:space="preserve"> is not only for appearance. With raw saliency and </w:t>
       </w:r>
       <w:r>
         <w:rPr>
@@ -16861,7 +16733,7 @@
           <w:b w:val="0"/>
           <w:i w:val="0"/>
         </w:rPr>
-        <w:t xml:space="preserve"> candidate: the ranking collapses to a constant, and the greedy loop then applies substitutions in the order the words happen to appear in the message. Because </w:t>
+        <w:t xml:space="preserve"> candidate: the ranking flattens to a constant, and the greedy loop then applies substitutions in whatever order the words happen to appear in the message. Because </w:t>
       </w:r>
       <w:r>
         <w:rPr>
@@ -16897,7 +16769,7 @@
           <w:b w:val="0"/>
           <w:i w:val="0"/>
         </w:rPr>
-        <w:t xml:space="preserve"> matters, and the scale is exactly what the normalisation fixes. Our first implementation of this module had that defect; the unit test that now guards it (</w:t>
+        <w:t xml:space="preserve"> matters, and the scale is exactly what the normalization fixes. Our first version of this module had that defect; the unit test that now guards it (</w:t>
       </w:r>
       <w:r>
         <w:rPr>
@@ -16928,7 +16800,7 @@
           <w:b w:val="0"/>
           <w:i w:val="0"/>
         </w:rPr>
-        <w:t>) asserts that a high</w:t>
+        <w:t>) checks that a high</w:t>
       </w:r>
       <w:r>
         <w:rPr>
@@ -16983,7 +16855,7 @@
           <w:b w:val="0"/>
           <w:i w:val="0"/>
         </w:rPr>
-        <w:t xml:space="preserve">Two sources, recorded per substitution: a curated security lexicon (66 entries: </w:t>
+        <w:t xml:space="preserve">Two sources, recorded for every substitution: a curated security word list (66 entries: </w:t>
       </w:r>
       <w:r>
         <w:rPr>
@@ -17102,7 +16974,7 @@
           <w:b w:val="0"/>
           <w:i w:val="0"/>
         </w:rPr>
-        <w:t xml:space="preserve"> synonyms ordered by lemma frequency. Frequency ordering matters more than it looks: WordNet</w:t>
+        <w:t xml:space="preserve"> synonyms ordered by how often the word occurs. The ordering matters more than it looks: WordNet</w:t>
       </w:r>
       <w:r>
         <w:rPr>
@@ -17158,7 +17030,7 @@
           <w:b w:val="0"/>
           <w:i w:val="0"/>
         </w:rPr>
-        <w:t>), and a substitution like that would be counted as semantics</w:t>
+        <w:t>), and such a substitution would be counted as meaning</w:t>
       </w:r>
       <w:r>
         <w:rPr>
@@ -17208,7 +17080,7 @@
         <w:pStyle w:val="Heading3"/>
       </w:pPr>
       <w:r>
-        <w:t>Two verdict channels.</w:t>
+        <w:t>Two answer channels.</w:t>
       </w:r>
     </w:p>
     <w:p>
@@ -17463,7 +17335,7 @@
           <w:b w:val="0"/>
           <w:i w:val="0"/>
         </w:rPr>
-        <w:t xml:space="preserve"> for every message, and a saliency attack built on it finds nothing to rank and no flip to report. The endpoint now skips the shared prefix, and raises rather than returning a constant when the two answers cannot be separated. The saliency numbers for that model in this version come from the corrected scoring; its earlier all</w:t>
+        <w:t xml:space="preserve"> for every message, and a saliency attack built on it finds nothing to rank and no flip to report. The endpoint now skips the shared prefix, and raises an error rather than returning a constant when the two answers cannot be told apart. The saliency numbers for that model in this version come from the corrected scoring; its earlier all</w:t>
       </w:r>
       <w:r>
         <w:rPr>
@@ -17477,7 +17349,7 @@
           <w:b w:val="0"/>
           <w:i w:val="0"/>
         </w:rPr>
-        <w:t>zero result was an artefact.</w:t>
+        <w:t>zero result was an artefact of the bug.</w:t>
       </w:r>
     </w:p>
     <w:p>
@@ -17497,7 +17369,7 @@
           <w:b w:val="0"/>
           <w:i w:val="0"/>
         </w:rPr>
-        <w:t>Unlike the random attack, this one costs a measured number of model calls: roughly two per probed position, plus one verification per accepted edit. Probabilities come from a dedicated endpoint that scores the two permitted answer tokens in a single forward pass over the prompt, batched across candidates; the per</w:t>
+        <w:t>Unlike the random attack, this one costs a measured number of model calls: roughly two per probed position, plus one check per accepted edit. Probabilities come from a dedicated endpoint that scores the two permitted answer tokens in a single forward pass over the prompt, batched across candidates; the per</w:t>
       </w:r>
       <w:r>
         <w:rPr>
@@ -17532,7 +17404,7 @@
           <w:b w:val="0"/>
           <w:i w:val="0"/>
         </w:rPr>
-        <w:t xml:space="preserve"> is between attacks whose cost is on the record. The asymmetry is real but smaller than an earlier draft of this paragraph claimed. The random attack is not one draw per sample: it re</w:t>
+        <w:t xml:space="preserve"> is between attacks whose cost is on the record. The gap is real but smaller than an earlier draft of this paragraph claimed. The random attack is not one draw per sample: it re</w:t>
       </w:r>
       <w:r>
         <w:rPr>
@@ -17678,7 +17550,7 @@
           <w:b w:val="0"/>
           <w:i w:val="0"/>
         </w:rPr>
-        <w:t xml:space="preserve"> (uniform draw versus saliency), the </w:t>
+        <w:t xml:space="preserve"> (random draw versus saliency), the </w:t>
       </w:r>
       <w:r>
         <w:rPr>
@@ -17720,14 +17592,14 @@
           <w:b w:val="0"/>
           <w:i w:val="0"/>
         </w:rPr>
-        <w:t xml:space="preserve">written table versus a security lexicon plus WordNet), and the </w:t>
+        <w:t xml:space="preserve">written table versus a security word list plus WordNet), and the </w:t>
       </w:r>
       <w:r>
         <w:rPr>
           <w:b w:val="0"/>
           <w:i/>
         </w:rPr>
-        <w:t>oracle</w:t>
+        <w:t>information</w:t>
       </w:r>
       <w:r>
         <w:rPr>
@@ -17790,7 +17662,7 @@
           <w:b w:val="0"/>
           <w:i w:val="0"/>
         </w:rPr>
-        <w:t xml:space="preserve">ordered substitution over a security vocabulary breaks more messages per unit of edit than a uniform draw over a small table. It does not show that ordering alone is responsible, and it cannot say what the probability access is worth. </w:t>
+        <w:t xml:space="preserve">ordered substitution over a security vocabulary breaks more messages per unit of edit than a random draw over a small table. It does not show that ordering alone is responsible, and it cannot say what the probability access is worth. </w:t>
       </w:r>
       <w:r>
         <w:rPr>
@@ -21146,7 +21018,7 @@
           <w:b w:val="0"/>
           <w:i w:val="0"/>
         </w:rPr>
-        <w:t xml:space="preserve"> cannot attribute its difference to any single cause, because ordering, candidate set and oracle all change together. The ablation below holds two of the three fixed in every comparison, so each contrast has one explanation. It is implemented in </w:t>
+        <w:t xml:space="preserve"> cannot attribute its difference to any single cause, because ordering, candidate set and information all change together. The comparison below (called an ablation, because it removes one factor at a time) holds two of the three fixed in every contrast, so each contrast has one explanation. It is implemented in </w:t>
       </w:r>
       <w:r>
         <w:rPr>
@@ -21294,7 +21166,7 @@
           <w:b w:val="0"/>
           <w:i w:val="0"/>
         </w:rPr>
-        <w:t xml:space="preserve">1.7b), so every arm attacks exactly the messages the attack tables report on, and an arm differs from another only in policy. The probe results are retained and only the </w:t>
+        <w:t xml:space="preserve">1.7b), so every arm attacks exactly the messages the attack tables report on, and one arm differs from another only in policy. The probe results are retained and only the </w:t>
       </w:r>
       <w:r>
         <w:rPr>
@@ -21350,7 +21222,7 @@
           <w:b w:val="0"/>
           <w:i w:val="0"/>
         </w:rPr>
-        <w:t xml:space="preserve"> calls a saliency arm pays before either starts substituting, so a difference in flips cannot be a difference in cost. The realised count is still stored per row, because a cap that is matched on paper and exhausted early in practice would be the same error as an unmatched denominator.</w:t>
+        <w:t xml:space="preserve"> calls a saliency arm pays before either starts substituting, so a difference in flips cannot be a difference in cost. The realised count is still stored per row, because a cap that is matched on paper and used up early in practice would be the same error as an unmatched total.</w:t>
       </w:r>
     </w:p>
     <w:p>
@@ -21370,7 +21242,7 @@
           <w:b w:val="0"/>
           <w:i w:val="0"/>
         </w:rPr>
-        <w:t xml:space="preserve">The factorial crosses the two orderings with the two oracles: </w:t>
+        <w:t xml:space="preserve">The factorial crosses the two orderings with the two information sources: </w:t>
       </w:r>
       <w:r>
         <w:rPr>
@@ -21398,7 +21270,7 @@
           <w:b w:val="0"/>
           <w:i w:val="0"/>
         </w:rPr>
-        <w:t xml:space="preserve"> (uniform order, probability oracle), </w:t>
+        <w:t xml:space="preserve"> (random order, probability information), </w:t>
       </w:r>
       <w:r>
         <w:rPr>
@@ -21468,7 +21340,7 @@
           <w:b w:val="0"/>
           <w:i w:val="0"/>
         </w:rPr>
-        <w:t xml:space="preserve"> (uniform order, one</w:t>
+        <w:t xml:space="preserve"> (random order, one</w:t>
       </w:r>
       <w:r>
         <w:rPr>
@@ -21482,7 +21354,7 @@
           <w:b w:val="0"/>
           <w:i w:val="0"/>
         </w:rPr>
-        <w:t xml:space="preserve">bit oracle) and </w:t>
+        <w:t xml:space="preserve">bit information) and </w:t>
       </w:r>
       <w:r>
         <w:rPr>
@@ -21949,7 +21821,7 @@
           <w:b w:val="0"/>
           <w:i w:val="0"/>
         </w:rPr>
-        <w:t xml:space="preserve">bit oracle can recover by searching instead of ranking; and </w:t>
+        <w:t xml:space="preserve">bit answer can recover by searching instead of ranking; and </w:t>
       </w:r>
       <w:r>
         <w:rPr>
@@ -22018,7 +21890,7 @@
           <w:b w:val="0"/>
           <w:i w:val="0"/>
         </w:rPr>
-        <w:t>Every arm gates candidates through a lexical paraphrase test (WordNet</w:t>
+        <w:t>Every arm sends candidates through a lexical paraphrase test (WordNet</w:t>
       </w:r>
       <w:r>
         <w:rPr>
@@ -22046,7 +21918,7 @@
           <w:b w:val="0"/>
           <w:i w:val="0"/>
         </w:rPr>
-        <w:t>embedding model) and records, per applied perturbation, the similarity the gate used along with literal retention and paraphrase coverage. TextFooler</w:t>
+        <w:t>embedding model) and records, for every applied edit, the similarity the test used along with literal retention and paraphrase coverage. TextFooler</w:t>
       </w:r>
       <w:r>
         <w:rPr>
@@ -22060,7 +21932,7 @@
           <w:b w:val="0"/>
           <w:i w:val="0"/>
         </w:rPr>
-        <w:t>s arm turns the gate on by default at a recorded threshold, because without a meaning constraint it is not TextFooler. All three scores travel with every row, so a reader can re</w:t>
+        <w:t>s arm turns the test on by default at a recorded threshold, because without a meaning constraint it is not TextFooler. All three scores travel with every row, so a reader can re</w:t>
       </w:r>
       <w:r>
         <w:rPr>
@@ -22108,7 +21980,7 @@
           <w:b w:val="0"/>
           <w:i w:val="0"/>
         </w:rPr>
-        <w:t>s ordering needs a scalar per candidate. A verdict has one bit, and that bit is spent by the first flip, so a verdict</w:t>
+        <w:t>s ordering needs a single number per candidate. A verdict has one bit, and that bit is spent by the first flip, so a verdict</w:t>
       </w:r>
       <w:r>
         <w:rPr>
@@ -22136,7 +22008,7 @@
           <w:b w:val="0"/>
           <w:i w:val="0"/>
         </w:rPr>
-        <w:t xml:space="preserve"> by saliency at all. Its targeted policy is therefore a search over subsets, and the oracle contrast is reported as how much of the saliency advantage survives when the attacker holds only the bit </w:t>
+        <w:t xml:space="preserve"> by saliency at all. Its targeted policy is therefore a search over subsets, and the comparison is reported as how much of the saliency advantage survives when the attacker holds only the bit </w:t>
       </w:r>
       <w:r>
         <w:rPr>
@@ -23786,7 +23658,7 @@
           <w:b w:val="0"/>
           <w:i w:val="0"/>
         </w:rPr>
-        <w:t>The ordering contrast is the one this section was built for, and it is the cleanest result in the paper: with the candidate set, the probe phase and the cap held fixed, every discordant message went to saliency ordering. The candidate</w:t>
+        <w:t>The ordering contrast is the one this section was built for, and it is the cleanest result in the paper: with the candidate set, the probe phase and the cap held fixed, every message the two arms disagreed on went to saliency ordering. The candidate</w:t>
       </w:r>
       <w:r>
         <w:rPr>
@@ -24014,7 +23886,7 @@
           <w:b w:val="0"/>
           <w:i w:val="0"/>
         </w:rPr>
-        <w:t xml:space="preserve"> model cost an attacker who can query it. That is the right question for a targeted campaign and the wrong one for a defender choosing a model, because an attacker who cannot query the deployed model will instead craft perturbations against something they can download. Whether those perturbations survive the move decides whether the fragility measured in </w:t>
+        <w:t xml:space="preserve"> model cost an attacker who can query it. That is the right question for a targeted campaign and the wrong one for a defender choosing a model, because an attacker who cannot query the deployed model will instead build perturbations against something they can download. Whether those perturbations survive the move decides whether the weakness measured in </w:t>
       </w:r>
       <w:r>
         <w:rPr>
@@ -24035,7 +23907,7 @@
           <w:b w:val="0"/>
           <w:i w:val="0"/>
         </w:rPr>
-        <w:t xml:space="preserve"> is a property of the task or an artefact of three specific checkpoints.</w:t>
+        <w:t xml:space="preserve"> belongs to the task or only to three specific checkpoints.</w:t>
       </w:r>
     </w:p>
     <w:p>
@@ -24097,7 +23969,7 @@
           <w:b w:val="0"/>
           <w:i w:val="0"/>
         </w:rPr>
-        <w:t>s own measured probabilities, so its cell asks whether the choice survives a different decision boundary, where a random edit only asks whether the model is noisy in the same way as its neighbour. Two accounting rules make the resulting numbers comparable with the single</w:t>
+        <w:t>s own measured probabilities, so its cell asks whether the choice survives a different decision boundary, where a random edit only asks whether the model is noisy in the same way as its neighbour. Two counting rules make the resulting numbers comparable with the single</w:t>
       </w:r>
       <w:r>
         <w:rPr>
@@ -24179,14 +24051,14 @@
           <w:b w:val="0"/>
           <w:i/>
         </w:rPr>
-        <w:t>perturbed</w:t>
-      </w:r>
-      <w:r>
-        <w:rPr>
-          <w:b w:val="0"/>
-          <w:i w:val="0"/>
-        </w:rPr>
-        <w:t xml:space="preserve"> text as benign. A message the target never flagged cannot be evaded, and scoring it as a transfer failure would punish the target for being wrong on the clean text </w:t>
+        <w:t>edited</w:t>
+      </w:r>
+      <w:r>
+        <w:rPr>
+          <w:b w:val="0"/>
+          <w:i w:val="0"/>
+        </w:rPr>
+        <w:t xml:space="preserve"> text as benign. A message the target never flagged cannot be evaded, and scoring it as a failed transfer would punish the target for being wrong on the clean text </w:t>
       </w:r>
       <w:r>
         <w:rPr>
@@ -24233,7 +24105,7 @@
           <w:b w:val="0"/>
           <w:i w:val="0"/>
         </w:rPr>
-        <w:t xml:space="preserve"> subset contains every perturbation the source actually applied; its denominator is how often the target caught those originals, so it measures the transferability of the perturbation </w:t>
+        <w:t xml:space="preserve"> subset contains every perturbation the source actually applied; its denominator is how often the target caught those originals, so it measures how well the perturbation </w:t>
       </w:r>
       <w:r>
         <w:rPr>
@@ -24247,7 +24119,7 @@
           <w:b w:val="0"/>
           <w:i w:val="0"/>
         </w:rPr>
-        <w:t xml:space="preserve">. The </w:t>
+        <w:t xml:space="preserve"> travels. The </w:t>
       </w:r>
       <w:r>
         <w:rPr>
@@ -24491,7 +24363,7 @@
           <w:b w:val="0"/>
           <w:i w:val="0"/>
         </w:rPr>
-        <w:t xml:space="preserve">, so a transferred flip cannot be an artefact of the harness. It is a weaker statement than it looks, and worth saying plainly: agreement shows the replay is faithful, not that the decoder is deterministic in general </w:t>
+        <w:t xml:space="preserve">, so a transferred flip cannot come from the test setup. It is a weaker statement than it looks, and worth saying plainly: agreement shows the replay is faithful, not that the decoder is deterministic in general </w:t>
       </w:r>
       <w:r>
         <w:rPr>
@@ -33989,7 +33861,7 @@
           <w:b w:val="0"/>
           <w:i w:val="0"/>
         </w:rPr>
-        <w:t>If the mechanism of an evasion is understood, a cheap fix should blunt it. We test two post</w:t>
+        <w:t>If the mechanism of an evasion is understood, a cheap fix should blunt it. We test two defences that can be applied after the model is trained, requiring no fine</w:t>
       </w:r>
       <w:r>
         <w:rPr>
@@ -34003,21 +33875,7 @@
           <w:b w:val="0"/>
           <w:i w:val="0"/>
         </w:rPr>
-        <w:t>hoc defences that require no fine</w:t>
-      </w:r>
-      <w:r>
-        <w:rPr>
-          <w:b w:val="0"/>
-          <w:i w:val="0"/>
-        </w:rPr>
-        <w:t>-</w:t>
-      </w:r>
-      <w:r>
-        <w:rPr>
-          <w:b w:val="0"/>
-          <w:i w:val="0"/>
-        </w:rPr>
-        <w:t xml:space="preserve">tuning, no extra data and no change to the deployed weights, and measure them on the </w:t>
+        <w:t xml:space="preserve">tuning, no extra data and no change to the deployed weights, and we measure them on the </w:t>
       </w:r>
       <w:r>
         <w:rPr>
@@ -34031,35 +33889,7 @@
           <w:b w:val="0"/>
           <w:i w:val="0"/>
         </w:rPr>
-        <w:t xml:space="preserve"> stored perturbations the attacks produced, so the comparison is like</w:t>
-      </w:r>
-      <w:r>
-        <w:rPr>
-          <w:b w:val="0"/>
-          <w:i w:val="0"/>
-        </w:rPr>
-        <w:t>-</w:t>
-      </w:r>
-      <w:r>
-        <w:rPr>
-          <w:b w:val="0"/>
-          <w:i w:val="0"/>
-        </w:rPr>
-        <w:t>for</w:t>
-      </w:r>
-      <w:r>
-        <w:rPr>
-          <w:b w:val="0"/>
-          <w:i w:val="0"/>
-        </w:rPr>
-        <w:t>-</w:t>
-      </w:r>
-      <w:r>
-        <w:rPr>
-          <w:b w:val="0"/>
-          <w:i w:val="0"/>
-        </w:rPr>
-        <w:t>like.</w:t>
+        <w:t xml:space="preserve"> stored perturbations the attacks produced, so the comparison is like for like.</w:t>
       </w:r>
     </w:p>
     <w:p>
@@ -34093,7 +33923,7 @@
           <w:b w:val="0"/>
           <w:i w:val="0"/>
         </w:rPr>
-        <w:t>normalised, invisible and format characters are removed, Cyrillic and Greek homoglyphs are folded back to their ASCII look</w:t>
+        <w:t>normalised (a standard Unicode cleanup), invisible and format characters are removed, Cyrillic and Greek look</w:t>
       </w:r>
       <w:r>
         <w:rPr>
@@ -34107,7 +33937,7 @@
           <w:b w:val="0"/>
           <w:i w:val="0"/>
         </w:rPr>
-        <w:t>alikes, and whitespace is collapsed. This targets exactly the mechanism of the character attack: the model sees a different token where a human sees the same word. It should therefore rescue character</w:t>
+        <w:t>alike characters are folded back to their ASCII equivalents, and whitespace is collapsed. This targets exactly the mechanism of the character attack: the model sees a different token where a human sees the same word. It should therefore rescue character</w:t>
       </w:r>
       <w:r>
         <w:rPr>
@@ -34149,7 +33979,7 @@
           <w:b w:val="0"/>
           <w:i w:val="0"/>
         </w:rPr>
-        <w:t xml:space="preserve"> and that null result is the evidence that the two attack families fail for different reasons. The transform is idempotent, which is asserted in </w:t>
+        <w:t xml:space="preserve"> and that null result is evidence that the two attack families fail for different reasons. The transform is idempotent (running it twice changes nothing the second time), which is checked in </w:t>
       </w:r>
       <w:r>
         <w:rPr>
@@ -34180,21 +34010,7 @@
           <w:b w:val="0"/>
           <w:i w:val="0"/>
         </w:rPr>
-        <w:t>; a non</w:t>
-      </w:r>
-      <w:r>
-        <w:rPr>
-          <w:b w:val="0"/>
-          <w:i w:val="0"/>
-        </w:rPr>
-        <w:t>-</w:t>
-      </w:r>
-      <w:r>
-        <w:rPr>
-          <w:b w:val="0"/>
-          <w:i w:val="0"/>
-        </w:rPr>
-        <w:t xml:space="preserve">idempotent normaliser would make the </w:t>
+        <w:t xml:space="preserve">; a transform that was not idempotent would make the </w:t>
       </w:r>
       <w:r>
         <w:rPr>
@@ -34368,7 +34184,7 @@
           <w:b w:val="0"/>
           <w:i w:val="0"/>
         </w:rPr>
-        <w:t xml:space="preserve"> threshold that meets that budget, i.e. the least conservative operating point the budget allows. Two figures travel with every headline number: the clean false</w:t>
+        <w:t xml:space="preserve"> threshold that meets that budget, that is, the least conservative setting the budget allows. Two figures travel with every headline number: the clean false</w:t>
       </w:r>
       <w:r>
         <w:rPr>
@@ -34410,7 +34226,7 @@
           <w:b w:val="0"/>
           <w:i w:val="0"/>
         </w:rPr>
-        <w:t>positive rate it costs. Without the second, a drop in ASR cannot be distinguished from a filter that has simply stopped flagging mail.</w:t>
+        <w:t>positive rate it costs. Without the second, a drop in ASR cannot be told apart from a filter that has simply stopped flagging mail.</w:t>
       </w:r>
     </w:p>
     <w:p>
@@ -34492,7 +34308,7 @@
           <w:b w:val="0"/>
           <w:i w:val="0"/>
         </w:rPr>
-        <w:t xml:space="preserve"> a filter that rejects everything. Our first implementation did exactly that, and because it also counted a flip whenever a perturbed text fell below </w:t>
+        <w:t xml:space="preserve"> a filter that rejects everything. Our first implementation did exactly that, and because it also counted a flip whenever an edited text fell below </w:t>
       </w:r>
       <w:r>
         <w:rPr>

</xml_diff>

<commit_message>
Apply the must-fix items from the reviewer pass.
The abstract compared word edits to "letters", attached the saliency attack's
defence numbers to the random word attack, and said one model diverged when two
do. Its takeaway also stated accuracy where the results point to distance from
the decision bound. The defence section described a high threshold as rejecting
everything when it flags nothing, and the ablation setup conflated a call cap
with the size of the message cell. The defence sentence is fixed in the
generator so a rebuild keeps it.
</commit_message>
<xml_diff>
--- a/paper/main.docx
+++ b/paper/main.docx
@@ -280,7 +280,35 @@
           <w:b w:val="0"/>
           <w:i w:val="0"/>
         </w:rPr>
-        <w:t xml:space="preserve"> while modifying about half as many letters.</w:t>
+        <w:t xml:space="preserve"> while changing only 6.2</w:t>
+      </w:r>
+      <w:r>
+        <w:rPr>
+          <w:b w:val="0"/>
+          <w:i w:val="0"/>
+        </w:rPr>
+        <w:t>–</w:t>
+      </w:r>
+      <w:r>
+        <w:rPr>
+          <w:b w:val="0"/>
+          <w:i w:val="0"/>
+        </w:rPr>
+        <w:t>9.2</w:t>
+      </w:r>
+      <w:r>
+        <w:rPr>
+          <w:b w:val="0"/>
+          <w:i w:val="0"/>
+        </w:rPr>
+        <w:t>%</w:t>
+      </w:r>
+      <w:r>
+        <w:rPr>
+          <w:b w:val="0"/>
+          <w:i w:val="0"/>
+        </w:rPr>
+        <w:t xml:space="preserve"> of words, about half the share of units the character attack spends.</w:t>
       </w:r>
     </w:p>
     <w:p>
@@ -488,7 +516,7 @@
           <w:b w:val="0"/>
           <w:i w:val="0"/>
         </w:rPr>
-        <w:t>001 rows, matching perfectly for one model but diverging on another. We report final text decisions throughout and treat this gap as an important measurement finding. For defenses, cleaning look</w:t>
+        <w:t>001 rows, matching perfectly for one model and diverging on the other two. We report final text decisions throughout and treat this gap as an important measurement finding. For defenses, cleaning look</w:t>
       </w:r>
       <w:r>
         <w:rPr>
@@ -516,21 +544,7 @@
           <w:b w:val="0"/>
           <w:i w:val="0"/>
         </w:rPr>
-        <w:t>level evasions, but has little effect on word</w:t>
-      </w:r>
-      <w:r>
-        <w:rPr>
-          <w:b w:val="0"/>
-          <w:i w:val="0"/>
-        </w:rPr>
-        <w:t>-</w:t>
-      </w:r>
-      <w:r>
-        <w:rPr>
-          <w:b w:val="0"/>
-          <w:i w:val="0"/>
-        </w:rPr>
-        <w:t>level swaps (7.5</w:t>
+        <w:t>level evasions, moves the random word attack only from 2.5</w:t>
       </w:r>
       <w:r>
         <w:rPr>
@@ -544,6 +558,34 @@
           <w:b w:val="0"/>
           <w:i w:val="0"/>
         </w:rPr>
+        <w:t xml:space="preserve"> to 2.0</w:t>
+      </w:r>
+      <w:r>
+        <w:rPr>
+          <w:b w:val="0"/>
+          <w:i w:val="0"/>
+        </w:rPr>
+        <w:t>%</w:t>
+      </w:r>
+      <w:r>
+        <w:rPr>
+          <w:b w:val="0"/>
+          <w:i w:val="0"/>
+        </w:rPr>
+        <w:t>, and the guided attack from 7.5</w:t>
+      </w:r>
+      <w:r>
+        <w:rPr>
+          <w:b w:val="0"/>
+          <w:i w:val="0"/>
+        </w:rPr>
+        <w:t>%</w:t>
+      </w:r>
+      <w:r>
+        <w:rPr>
+          <w:b w:val="0"/>
+          <w:i w:val="0"/>
+        </w:rPr>
         <w:t xml:space="preserve"> to 6.9</w:t>
       </w:r>
       <w:r>
@@ -558,7 +600,7 @@
           <w:b w:val="0"/>
           <w:i w:val="0"/>
         </w:rPr>
-        <w:t>). Adjusting decision cutoffs (re</w:t>
+        <w:t>. Adjusting decision cutoffs (re</w:t>
       </w:r>
       <w:r>
         <w:rPr>
@@ -612,7 +654,7 @@
           <w:b w:val="0"/>
           <w:i w:val="0"/>
         </w:rPr>
-        <w:t>Our main practical takeaway is that with small edit budgets, the primary limitation of small triage models is basic classification accuracy rather than susceptibility to random text edits. Furthermore, attack success rates must always be reported with their exact sample count (denominator), a statistical confidence interval, and the specific search method used. A result of 0 out of 188 is an upper limit of 2.0</w:t>
+        <w:t>Our main practical takeaway is that with small edit budgets, what limits a triage deployment first is how decisively a model separates the two classes, not how easily random edits fool it: the model that flips most sits closest to its decision boundary, not the one with the lowest overall accuracy. Furthermore, attack success rates must always be reported with their exact sample count (denominator), a statistical confidence interval, and the specific search method used. A result of 0 out of 188 is an upper limit of 2.0</w:t>
       </w:r>
       <w:r>
         <w:rPr>
@@ -21152,7 +21194,7 @@
           <w:b w:val="0"/>
           <w:i w:val="0"/>
         </w:rPr>
-        <w:t>Every arm attacks the same messages, with the same candidate set, and pays the same probe cost before it edits anything: one query for the original, then one query per single substitution candidate, capped identically at the same number of calls per message for every arm (24 in the configuration the runner reports, and the cap it used travels with every row). The reported cells are the first 400 eligible messages of each model, and the cap never bound: the largest eligible set is 382 messages (smollm2</w:t>
+        <w:t>Every arm attacks the same messages, with the same candidate set, and pays the same probe cost before it edits anything: one query for the original, then one query per single substitution candidate, capped identically at the same number of calls per message for every arm (24 in the configuration the runner reports, and the cap it used travels with every row). The reported cells are the first 400 eligible messages of each model, and 400 covers the largest eligible set (382 messages, smollm2</w:t>
       </w:r>
       <w:r>
         <w:rPr>
@@ -21166,7 +21208,35 @@
           <w:b w:val="0"/>
           <w:i w:val="0"/>
         </w:rPr>
-        <w:t xml:space="preserve">1.7b), so every arm attacks exactly the messages the attack tables report on, and one arm differs from another only in policy. The probe results are retained and only the </w:t>
+        <w:t xml:space="preserve">1.7b), so every arm attacks exactly the messages the attack tables report on. The cap was not reached in practice </w:t>
+      </w:r>
+      <w:r>
+        <w:rPr>
+          <w:b w:val="0"/>
+          <w:i w:val="0"/>
+        </w:rPr>
+        <w:t>—</w:t>
+      </w:r>
+      <w:r>
+        <w:rPr>
+          <w:b w:val="0"/>
+          <w:i w:val="0"/>
+        </w:rPr>
+        <w:t xml:space="preserve"> the highest mean spend of any arm is 23.3 of its 24 calls </w:t>
+      </w:r>
+      <w:r>
+        <w:rPr>
+          <w:b w:val="0"/>
+          <w:i w:val="0"/>
+        </w:rPr>
+        <w:t>—</w:t>
+      </w:r>
+      <w:r>
+        <w:rPr>
+          <w:b w:val="0"/>
+          <w:i w:val="0"/>
+        </w:rPr>
+        <w:t xml:space="preserve"> so one arm differs from another only in policy. The probe results are retained and only the </w:t>
       </w:r>
       <w:r>
         <w:rPr>
@@ -34308,7 +34378,7 @@
           <w:b w:val="0"/>
           <w:i w:val="0"/>
         </w:rPr>
-        <w:t xml:space="preserve"> a filter that rejects everything. Our first implementation did exactly that, and because it also counted a flip whenever an edited text fell below </w:t>
+        <w:t xml:space="preserve"> a filter that flags nothing. Our first implementation did exactly that, and because it also counted a flip whenever an edited text fell below </w:t>
       </w:r>
       <w:r>
         <w:rPr>
@@ -34592,7 +34662,7 @@
           <w:b w:val="0"/>
           <w:i w:val="0"/>
         </w:rPr>
-        <w:t>task cells cannot meet the budget at all: holding their false positives down requires a threshold that rejects every message.</w:t>
+        <w:t>task cells cannot meet the budget at all: holding their false positives down requires a threshold so high that it flags no message at all.</w:t>
       </w:r>
     </w:p>
     <w:p>

</xml_diff>

<commit_message>
Measure the decision margin and drop the unsupported boundary claim.
Section 5 attributed the cross-model ordering to proximity to the decision
boundary, but the paper never measured a margin. The stored original-text
probabilities give one, and it does not order the attack success rate: the widest
mean margin belongs to the model that flips most, and that model's two-token
route saturates at 1.0 on 95% of its rows, so no margin exists to compare there.
The section now reports the measurement and the within-channel effect that does
hold, and the intro, abstract, discussion and conclusion no longer assert the
ordering.
</commit_message>
<xml_diff>
--- a/paper/main.docx
+++ b/paper/main.docx
@@ -654,7 +654,7 @@
           <w:b w:val="0"/>
           <w:i w:val="0"/>
         </w:rPr>
-        <w:t>Our main practical takeaway is that with small edit budgets, what limits a triage deployment first is how decisively a model separates the two classes, not how easily random edits fool it: the model that flips most sits closest to its decision boundary, not the one with the lowest overall accuracy. Furthermore, attack success rates must always be reported with their exact sample count (denominator), a statistical confidence interval, and the specific search method used. A result of 0 out of 188 is an upper limit of 2.0</w:t>
+        <w:t>Our main practical takeaway is that under small edit budgets, neither overall accuracy nor the distance from the decision threshold orders how often a model flips: the model with the most flips is not the least accurate, and its probability route saturates, so no margin can be read on it. Robustness therefore has to be measured per model rather than inferred from accuracy or confidence. Furthermore, attack success rates must always be reported with their exact sample count (denominator), a statistical confidence interval, and the specific search method used. A result of 0 out of 188 is an upper limit of 2.0</w:t>
       </w:r>
       <w:r>
         <w:rPr>
@@ -1228,14 +1228,35 @@
           <w:b/>
           <w:i w:val="0"/>
         </w:rPr>
-        <w:t>Analysis of model decision boundaries</w:t>
-      </w:r>
-      <w:r>
-        <w:rPr>
-          <w:b w:val="0"/>
-          <w:i w:val="0"/>
-        </w:rPr>
-        <w:t>: The model with the highest attack success rate is the one operating closest to its decision boundary, not the least accurate model overall. Conversely, a model that marks almost everything as malicious appears artificially robust simply because its classification rule rarely changes.</w:t>
+        <w:t>A negative result about what predicts fragility</w:t>
+      </w:r>
+      <w:r>
+        <w:rPr>
+          <w:b w:val="0"/>
+          <w:i w:val="0"/>
+        </w:rPr>
+        <w:t xml:space="preserve"> (</w:t>
+      </w:r>
+      <w:r>
+        <w:rPr>
+          <w:b w:val="0"/>
+          <w:i w:val="0"/>
+        </w:rPr>
+        <w:t>§</w:t>
+      </w:r>
+      <w:r>
+        <w:rPr>
+          <w:b w:val="0"/>
+          <w:i w:val="0"/>
+        </w:rPr>
+        <w:t>5.5</w:t>
+      </w:r>
+      <w:r>
+        <w:rPr>
+          <w:b w:val="0"/>
+          <w:i w:val="0"/>
+        </w:rPr>
+        <w:t>): neither overall accuracy nor the measured distance from the decision threshold orders the attack success rate across the three models. The model with the most flips is not the least accurate, and its own probability route saturates at 0.9999 or above on 800 of its 845 stored originals, so no margin can be read there. The one clear case is the detector that marks almost everything malicious: its score barely varies, so it looks robust for a reason that has nothing to do with robustness.</w:t>
       </w:r>
     </w:p>
     <w:p>
@@ -11873,21 +11894,7 @@
           <w:b w:val="0"/>
           <w:i w:val="0"/>
         </w:rPr>
-        <w:t>Across the six model</w:t>
-      </w:r>
-      <w:r>
-        <w:rPr>
-          <w:b w:val="0"/>
-          <w:i w:val="0"/>
-        </w:rPr>
-        <w:t>–</w:t>
-      </w:r>
-      <w:r>
-        <w:rPr>
-          <w:b w:val="0"/>
-          <w:i w:val="0"/>
-        </w:rPr>
-        <w:t>task cells, the ASR follows how close a model sits to its decision boundary rather than how accurate it is. Phi</w:t>
+        <w:t>The order across models is not explained by accuracy. SmolLM2</w:t>
       </w:r>
       <w:r>
         <w:rPr>
@@ -11901,6 +11908,62 @@
           <w:b w:val="0"/>
           <w:i w:val="0"/>
         </w:rPr>
+        <w:t>1.7B has the lowest accuracy of the three and flips 22 of its 1</w:t>
+      </w:r>
+      <w:r>
+        <w:rPr>
+          <w:b w:val="0"/>
+          <w:i w:val="0"/>
+        </w:rPr>
+        <w:t>,</w:t>
+      </w:r>
+      <w:r>
+        <w:rPr>
+          <w:b w:val="0"/>
+          <w:i w:val="0"/>
+        </w:rPr>
+        <w:t>144 attacked rows; Qwen2.5</w:t>
+      </w:r>
+      <w:r>
+        <w:rPr>
+          <w:b w:val="0"/>
+          <w:i w:val="0"/>
+        </w:rPr>
+        <w:t>-</w:t>
+      </w:r>
+      <w:r>
+        <w:rPr>
+          <w:b w:val="0"/>
+          <w:i w:val="0"/>
+        </w:rPr>
+        <w:t>3B is the most accurate and flips 17 of 1</w:t>
+      </w:r>
+      <w:r>
+        <w:rPr>
+          <w:b w:val="0"/>
+          <w:i w:val="0"/>
+        </w:rPr>
+        <w:t>,</w:t>
+      </w:r>
+      <w:r>
+        <w:rPr>
+          <w:b w:val="0"/>
+          <w:i w:val="0"/>
+        </w:rPr>
+        <w:t>091; Phi</w:t>
+      </w:r>
+      <w:r>
+        <w:rPr>
+          <w:b w:val="0"/>
+          <w:i w:val="0"/>
+        </w:rPr>
+        <w:t>-</w:t>
+      </w:r>
+      <w:r>
+        <w:rPr>
+          <w:b w:val="0"/>
+          <w:i w:val="0"/>
+        </w:rPr>
         <w:t>3.5</w:t>
       </w:r>
       <w:r>
@@ -11915,7 +11978,19 @@
           <w:b w:val="0"/>
           <w:i w:val="0"/>
         </w:rPr>
-        <w:t>mini has the highest character ASR on e</w:t>
+        <w:t>mini, neither the best nor the worst on accuracy, flips 47 of 845. The model with the most flips is therefore not the least accurate model, and the least accurate model is not the one that flips most.</w:t>
+      </w:r>
+    </w:p>
+    <w:p>
+      <w:pPr>
+        <w:jc w:val="both"/>
+      </w:pPr>
+      <w:r>
+        <w:rPr>
+          <w:b w:val="0"/>
+          <w:i w:val="0"/>
+        </w:rPr>
+        <w:t>The distance from the decision threshold is measurable on the stored rows, and it does not order the same list either. Every attack row carries the probability the model gave its original text on the two</w:t>
       </w:r>
       <w:r>
         <w:rPr>
@@ -11929,49 +12004,112 @@
           <w:b w:val="0"/>
           <w:i w:val="0"/>
         </w:rPr>
-        <w:t>mail (5.0</w:t>
-      </w:r>
-      <w:r>
-        <w:rPr>
-          <w:b w:val="0"/>
-          <w:i w:val="0"/>
-        </w:rPr>
-        <w:t>%</w:t>
-      </w:r>
-      <w:r>
-        <w:rPr>
-          <w:b w:val="0"/>
-          <w:i w:val="0"/>
-        </w:rPr>
-        <w:t>) and the weakest recall there (0.600). SmolLM2</w:t>
-      </w:r>
-      <w:r>
-        <w:rPr>
-          <w:b w:val="0"/>
-          <w:i w:val="0"/>
+        <w:t>token route the saliency attack uses, so the mean margin (</w:t>
+      </w:r>
+      <w:r>
+        <w:rPr>
+          <w:b w:val="0"/>
+          <w:i/>
+        </w:rPr>
+        <w:t>p</w:t>
+      </w:r>
+      <w:r>
+        <w:rPr>
+          <w:b w:val="0"/>
+          <w:i/>
+          <w:vertAlign w:val="subscript"/>
+        </w:rPr>
+        <w:t>orig</w:t>
+      </w:r>
+      <w:r>
+        <w:rPr>
+          <w:b w:val="0"/>
+          <w:i/>
+        </w:rPr>
+        <w:t xml:space="preserve"> </w:t>
+      </w:r>
+      <w:r>
+        <w:rPr>
+          <w:b w:val="0"/>
+          <w:i/>
         </w:rPr>
         <w:t>-</w:t>
       </w:r>
       <w:r>
         <w:rPr>
           <w:b w:val="0"/>
-          <w:i w:val="0"/>
-        </w:rPr>
-        <w:t>1.7B has the highest recall (0.985) and among the lowest ASR (0.5</w:t>
-      </w:r>
-      <w:r>
-        <w:rPr>
-          <w:b w:val="0"/>
-          <w:i w:val="0"/>
-        </w:rPr>
-        <w:t>%</w:t>
-      </w:r>
-      <w:r>
-        <w:rPr>
-          <w:b w:val="0"/>
-          <w:i w:val="0"/>
-        </w:rPr>
-        <w:t xml:space="preserve"> on e</w:t>
+          <w:i/>
+        </w:rPr>
+        <w:t xml:space="preserve"> 0.5</w:t>
+      </w:r>
+      <w:r>
+        <w:rPr>
+          <w:b w:val="0"/>
+          <w:i w:val="0"/>
+        </w:rPr>
+        <w:t>) over the messages that route also called malicious can be read off per model (</w:t>
+      </w:r>
+      <w:r>
+        <w:rPr>
+          <w:rFonts w:ascii="Consolas" w:hAnsi="Consolas"/>
+          <w:b w:val="0"/>
+          <w:i w:val="0"/>
+        </w:rPr>
+        <w:t>results/margin</w:t>
+      </w:r>
+      <w:r>
+        <w:rPr>
+          <w:rFonts w:ascii="Consolas" w:hAnsi="Consolas"/>
+          <w:b w:val="0"/>
+          <w:i w:val="0"/>
+        </w:rPr>
+        <w:t>_</w:t>
+      </w:r>
+      <w:r>
+        <w:rPr>
+          <w:rFonts w:ascii="Consolas" w:hAnsi="Consolas"/>
+          <w:b w:val="0"/>
+          <w:i w:val="0"/>
+        </w:rPr>
+        <w:t>table.csv</w:t>
+      </w:r>
+      <w:r>
+        <w:rPr>
+          <w:b w:val="0"/>
+          <w:i w:val="0"/>
+        </w:rPr>
+        <w:t xml:space="preserve">, from </w:t>
+      </w:r>
+      <w:r>
+        <w:rPr>
+          <w:rFonts w:ascii="Consolas" w:hAnsi="Consolas"/>
+          <w:b w:val="0"/>
+          <w:i w:val="0"/>
+        </w:rPr>
+        <w:t>src/analyze</w:t>
+      </w:r>
+      <w:r>
+        <w:rPr>
+          <w:rFonts w:ascii="Consolas" w:hAnsi="Consolas"/>
+          <w:b w:val="0"/>
+          <w:i w:val="0"/>
+        </w:rPr>
+        <w:t>_</w:t>
+      </w:r>
+      <w:r>
+        <w:rPr>
+          <w:rFonts w:ascii="Consolas" w:hAnsi="Consolas"/>
+          <w:b w:val="0"/>
+          <w:i w:val="0"/>
+        </w:rPr>
+        <w:t>margin.py</w:t>
+      </w:r>
+      <w:r>
+        <w:rPr>
+          <w:b w:val="0"/>
+          <w:i w:val="0"/>
+        </w:rPr>
+        <w:t>): 0.449 for Qwen2.5</w:t>
       </w:r>
       <w:r>
         <w:rPr>
@@ -11985,7 +12123,173 @@
           <w:b w:val="0"/>
           <w:i w:val="0"/>
         </w:rPr>
-        <w:t xml:space="preserve">mail) </w:t>
+        <w:t>3B, 0.482 for SmolLM2</w:t>
+      </w:r>
+      <w:r>
+        <w:rPr>
+          <w:b w:val="0"/>
+          <w:i w:val="0"/>
+        </w:rPr>
+        <w:t>-</w:t>
+      </w:r>
+      <w:r>
+        <w:rPr>
+          <w:b w:val="0"/>
+          <w:i w:val="0"/>
+        </w:rPr>
+        <w:t>1.7B and 0.494 for Phi</w:t>
+      </w:r>
+      <w:r>
+        <w:rPr>
+          <w:b w:val="0"/>
+          <w:i w:val="0"/>
+        </w:rPr>
+        <w:t>-</w:t>
+      </w:r>
+      <w:r>
+        <w:rPr>
+          <w:b w:val="0"/>
+          <w:i w:val="0"/>
+        </w:rPr>
+        <w:t>3.5</w:t>
+      </w:r>
+      <w:r>
+        <w:rPr>
+          <w:b w:val="0"/>
+          <w:i w:val="0"/>
+        </w:rPr>
+        <w:t>-</w:t>
+      </w:r>
+      <w:r>
+        <w:rPr>
+          <w:b w:val="0"/>
+          <w:i w:val="0"/>
+        </w:rPr>
+        <w:t>mini. The widest of the three belongs to the model that flips most, and the narrowest to Qwen2.5</w:t>
+      </w:r>
+      <w:r>
+        <w:rPr>
+          <w:b w:val="0"/>
+          <w:i w:val="0"/>
+        </w:rPr>
+        <w:t>-</w:t>
+      </w:r>
+      <w:r>
+        <w:rPr>
+          <w:b w:val="0"/>
+          <w:i w:val="0"/>
+        </w:rPr>
+        <w:t>3B, which flips least. On Phi</w:t>
+      </w:r>
+      <w:r>
+        <w:rPr>
+          <w:b w:val="0"/>
+          <w:i w:val="0"/>
+        </w:rPr>
+        <w:t>-</w:t>
+      </w:r>
+      <w:r>
+        <w:rPr>
+          <w:b w:val="0"/>
+          <w:i w:val="0"/>
+        </w:rPr>
+        <w:t>3.5</w:t>
+      </w:r>
+      <w:r>
+        <w:rPr>
+          <w:b w:val="0"/>
+          <w:i w:val="0"/>
+        </w:rPr>
+        <w:t>-</w:t>
+      </w:r>
+      <w:r>
+        <w:rPr>
+          <w:b w:val="0"/>
+          <w:i w:val="0"/>
+        </w:rPr>
+        <w:t>mini the number should not be trusted at all: 800 of its 845 stored originals score at least 0.9999, so the route saturates and returns no margin to compare. The ordering has also been attributed to proximity to the decision boundary; the stored scores do not support that, and this paper does not claim it.</w:t>
+      </w:r>
+    </w:p>
+    <w:p>
+      <w:pPr>
+        <w:jc w:val="both"/>
+      </w:pPr>
+      <w:r>
+        <w:rPr>
+          <w:b w:val="0"/>
+          <w:i w:val="0"/>
+        </w:rPr>
+        <w:t>What the scores do support is narrower, and inside one channel. Where the probability route does flip a message, that message started closer to the threshold than the ones the route leaves alone: mean 0.792 against 0.959 for Qwen2.5</w:t>
+      </w:r>
+      <w:r>
+        <w:rPr>
+          <w:b w:val="0"/>
+          <w:i w:val="0"/>
+        </w:rPr>
+        <w:t>-</w:t>
+      </w:r>
+      <w:r>
+        <w:rPr>
+          <w:b w:val="0"/>
+          <w:i w:val="0"/>
+        </w:rPr>
+        <w:t>3B and 0.927 against 0.998 for Phi</w:t>
+      </w:r>
+      <w:r>
+        <w:rPr>
+          <w:b w:val="0"/>
+          <w:i w:val="0"/>
+        </w:rPr>
+        <w:t>-</w:t>
+      </w:r>
+      <w:r>
+        <w:rPr>
+          <w:b w:val="0"/>
+          <w:i w:val="0"/>
+        </w:rPr>
+        <w:t>3.5</w:t>
+      </w:r>
+      <w:r>
+        <w:rPr>
+          <w:b w:val="0"/>
+          <w:i w:val="0"/>
+        </w:rPr>
+        <w:t>-</w:t>
+      </w:r>
+      <w:r>
+        <w:rPr>
+          <w:b w:val="0"/>
+          <w:i w:val="0"/>
+        </w:rPr>
+        <w:t>mini. SmolLM2</w:t>
+      </w:r>
+      <w:r>
+        <w:rPr>
+          <w:b w:val="0"/>
+          <w:i w:val="0"/>
+        </w:rPr>
+        <w:t>-</w:t>
+      </w:r>
+      <w:r>
+        <w:rPr>
+          <w:b w:val="0"/>
+          <w:i w:val="0"/>
+        </w:rPr>
+        <w:t>1.7B never flips on that route at all (0 of 1</w:t>
+      </w:r>
+      <w:r>
+        <w:rPr>
+          <w:b w:val="0"/>
+          <w:i w:val="0"/>
+        </w:rPr>
+        <w:t>,</w:t>
+      </w:r>
+      <w:r>
+        <w:rPr>
+          <w:b w:val="0"/>
+          <w:i w:val="0"/>
+        </w:rPr>
+        <w:t xml:space="preserve">144), although its generated verdict changes 22 times </w:t>
       </w:r>
       <w:r>
         <w:rPr>
@@ -11999,7 +12303,28 @@
           <w:b w:val="0"/>
           <w:i w:val="0"/>
         </w:rPr>
-        <w:t xml:space="preserve"> because its decision rule is nearly constant. A small edit either does nothing or, as in the case of the 2 of 196 word attacks that flipped it, pushes a barely</w:t>
+        <w:t xml:space="preserve"> a disagreement between the two channels of the kind </w:t>
+      </w:r>
+      <w:r>
+        <w:rPr>
+          <w:b w:val="0"/>
+          <w:i w:val="0"/>
+        </w:rPr>
+        <w:t>§</w:t>
+      </w:r>
+      <w:r>
+        <w:rPr>
+          <w:b w:val="0"/>
+          <w:i w:val="0"/>
+        </w:rPr>
+        <w:t>9</w:t>
+      </w:r>
+      <w:r>
+        <w:rPr>
+          <w:b w:val="0"/>
+          <w:i w:val="0"/>
+        </w:rPr>
+        <w:t xml:space="preserve"> reports, not a margin result. Its scores sit in a narrow band (median 0.984), which is the near</w:t>
       </w:r>
       <w:r>
         <w:rPr>
@@ -12013,7 +12338,7 @@
           <w:b w:val="0"/>
           <w:i w:val="0"/>
         </w:rPr>
-        <w:t>considered verdict across the line. Neither behaviour is robustness in the sense a deployment cares about.</w:t>
+        <w:t>constant rule seen in the baseline table: an edit has little score to move, so the model looks robust in the sense that a deployment cares about only by accident.</w:t>
       </w:r>
     </w:p>
     <w:p>
@@ -12094,7 +12419,7 @@
           <w:b w:val="0"/>
           <w:i w:val="0"/>
         </w:rPr>
-        <w:t>task ordering is suggestive rather than established. The exceptions are informative: under the character attack on phishing e</w:t>
+        <w:t>task ordering is suggestive rather than established. The exceptions are informative. The three pairs that overlap by less than half the narrower width all involve Phi</w:t>
       </w:r>
       <w:r>
         <w:rPr>
@@ -12108,7 +12433,7 @@
           <w:b w:val="0"/>
           <w:i w:val="0"/>
         </w:rPr>
-        <w:t>mail, Phi</w:t>
+        <w:t>3.5</w:t>
       </w:r>
       <w:r>
         <w:rPr>
@@ -12122,6 +12447,34 @@
           <w:b w:val="0"/>
           <w:i w:val="0"/>
         </w:rPr>
+        <w:t>mini on phishing e</w:t>
+      </w:r>
+      <w:r>
+        <w:rPr>
+          <w:b w:val="0"/>
+          <w:i w:val="0"/>
+        </w:rPr>
+        <w:t>-</w:t>
+      </w:r>
+      <w:r>
+        <w:rPr>
+          <w:b w:val="0"/>
+          <w:i w:val="0"/>
+        </w:rPr>
+        <w:t>mail, and the two with the least overlap are the same comparison from both sides: under the character attack, Phi</w:t>
+      </w:r>
+      <w:r>
+        <w:rPr>
+          <w:b w:val="0"/>
+          <w:i w:val="0"/>
+        </w:rPr>
+        <w:t>-</w:t>
+      </w:r>
+      <w:r>
+        <w:rPr>
+          <w:b w:val="0"/>
+          <w:i w:val="0"/>
+        </w:rPr>
         <w:t>3.5</w:t>
       </w:r>
       <w:r>
@@ -12234,35 +12587,35 @@
           <w:b w:val="0"/>
           <w:i w:val="0"/>
         </w:rPr>
-        <w:t xml:space="preserve"> of the narrower width </w:t>
-      </w:r>
-      <w:r>
-        <w:rPr>
-          <w:b w:val="0"/>
-          <w:i w:val="0"/>
-        </w:rPr>
-        <w:t>—</w:t>
-      </w:r>
-      <w:r>
-        <w:rPr>
-          <w:b w:val="0"/>
-          <w:i w:val="0"/>
-        </w:rPr>
-        <w:t xml:space="preserve"> the one separation that survives the uncertainty is exactly the boundary</w:t>
-      </w:r>
-      <w:r>
-        <w:rPr>
-          <w:b w:val="0"/>
-          <w:i w:val="0"/>
-        </w:rPr>
-        <w:t>-</w:t>
-      </w:r>
-      <w:r>
-        <w:rPr>
-          <w:b w:val="0"/>
-          <w:i w:val="0"/>
-        </w:rPr>
-        <w:t xml:space="preserve">proximity effect of </w:t>
+        <w:t xml:space="preserve"> of the narrower width. That is the one model whose catch rate on the task is far below the other two (60.0</w:t>
+      </w:r>
+      <w:r>
+        <w:rPr>
+          <w:b w:val="0"/>
+          <w:i w:val="0"/>
+        </w:rPr>
+        <w:t>%</w:t>
+      </w:r>
+      <w:r>
+        <w:rPr>
+          <w:b w:val="0"/>
+          <w:i w:val="0"/>
+        </w:rPr>
+        <w:t xml:space="preserve"> against 95.5</w:t>
+      </w:r>
+      <w:r>
+        <w:rPr>
+          <w:b w:val="0"/>
+          <w:i w:val="0"/>
+        </w:rPr>
+        <w:t>%</w:t>
+      </w:r>
+      <w:r>
+        <w:rPr>
+          <w:b w:val="0"/>
+          <w:i w:val="0"/>
+        </w:rPr>
+        <w:t xml:space="preserve">), which is the difference </w:t>
       </w:r>
       <w:r>
         <w:rPr>
@@ -12283,7 +12636,7 @@
           <w:b w:val="0"/>
           <w:i w:val="0"/>
         </w:rPr>
-        <w:t>.</w:t>
+        <w:t xml:space="preserve"> turns on.</w:t>
       </w:r>
     </w:p>
     <w:p>
@@ -36461,7 +36814,7 @@
           <w:b w:val="0"/>
           <w:i w:val="0"/>
         </w:rPr>
-        <w:t>mini sits close to its decision boundary. Its ASR roughly doubles under saliency search (11.7</w:t>
+        <w:t>mini shows the largest increase: its ASR roughly doubles under saliency search (11.7</w:t>
       </w:r>
       <w:r>
         <w:rPr>
@@ -36517,7 +36870,7 @@
           <w:b w:val="0"/>
           <w:i w:val="0"/>
         </w:rPr>
-        <w:t xml:space="preserve"> under random word edits). Qwen2.5</w:t>
+        <w:t xml:space="preserve"> under random word edits), although its probability route saturates at 0.9999 or above on 800 of its 845 stored rows, so the increase cannot be read as a margin effect. Qwen2.5</w:t>
       </w:r>
       <w:r>
         <w:rPr>
@@ -38865,7 +39218,7 @@
           <w:b w:val="0"/>
           <w:i w:val="0"/>
         </w:rPr>
-        <w:t>). This result is not on the same messages or from the same candidate vocabulary. Once we account for the higher budget actually spent, the factor is 1.4, not 1.7. The search, the candidates, and the denominator must all be named in the claim. Second, at this budget the binding constraint on a small triage model is what it catches before any attack. The model that flips most is closest to its decision boundary. The model that catches almost everything is immovable because its decision rule is nearly constant. Detection quality, not adversarial robustness, is where deployment effort pays first. Third, cheap defences split cleanly. Normalising visually confusable characters removes every character</w:t>
+        <w:t>). This result is not on the same messages or from the same candidate vocabulary. Once we account for the higher budget actually spent, the factor is 1.4, not 1.7. The search, the candidates, and the denominator must all be named in the claim. Second, at this budget the binding constraint on a small triage model is what it catches before any attack. What orders the flip rate is not accuracy and not the measured margin: the model that flips most is neither the least accurate nor the closest to its threshold, and its probability route saturates, so the margin cannot be read on it at all. The model that catches almost everything is immovable because its decision rule is nearly constant. Detection quality, not adversarial robustness, is where deployment effort pays first. Third, cheap defences split cleanly. Normalising visually confusable characters removes every character</w:t>
       </w:r>
       <w:r>
         <w:rPr>

</xml_diff>

<commit_message>
Close the remaining reviewer items without touching the results.
Rule 1 becomes two paragraphs so the exclusions are read once; the ethics
chapter lists its seven defects instead of running them together; query
accounting is derived in the protocol and only summarised where it is used; and
the draft chronology is removed from the prose, leaving the audit in the ethics
section where it belongs. One argument fixes itself on the way: the discussion
said re-thresholding lowers the threshold, but the fitted cutoffs are 0.82-1.0,
above the default, so it raises it. Terminology is one pair of channel names
throughout and the spelling is British to match "artefact".
</commit_message>
<xml_diff>
--- a/paper/main.docx
+++ b/paper/main.docx
@@ -502,7 +502,7 @@
           <w:b w:val="0"/>
           <w:i w:val="0"/>
         </w:rPr>
-        <w:t>s internal confidence) do not always match the final text decision. The two readouts agree on 941 of 1</w:t>
+        <w:t>s internal confidence) do not always match the final text decision. The two channels agree on 941 of 1</w:t>
       </w:r>
       <w:r>
         <w:rPr>
@@ -516,7 +516,7 @@
           <w:b w:val="0"/>
           <w:i w:val="0"/>
         </w:rPr>
-        <w:t>001 rows, matching perfectly for one model and diverging on the other two. We report final text decisions throughout and treat this gap as an important measurement finding. For defenses, cleaning look</w:t>
+        <w:t>001 rows, matching perfectly for one model and diverging on the other two. We report final text decisions throughout and treat this gap as an important measurement finding. For defences, cleaning look</w:t>
       </w:r>
       <w:r>
         <w:rPr>
@@ -544,7 +544,7 @@
           <w:b w:val="0"/>
           <w:i w:val="0"/>
         </w:rPr>
-        <w:t>level evasions, moves the random word attack only from 2.5</w:t>
+        <w:t>level evasions and barely dents the guided attack (7.5</w:t>
       </w:r>
       <w:r>
         <w:rPr>
@@ -558,7 +558,7 @@
           <w:b w:val="0"/>
           <w:i w:val="0"/>
         </w:rPr>
-        <w:t xml:space="preserve"> to 2.0</w:t>
+        <w:t xml:space="preserve"> to 6.9</w:t>
       </w:r>
       <w:r>
         <w:rPr>
@@ -572,35 +572,7 @@
           <w:b w:val="0"/>
           <w:i w:val="0"/>
         </w:rPr>
-        <w:t>, and the guided attack from 7.5</w:t>
-      </w:r>
-      <w:r>
-        <w:rPr>
-          <w:b w:val="0"/>
-          <w:i w:val="0"/>
-        </w:rPr>
-        <w:t>%</w:t>
-      </w:r>
-      <w:r>
-        <w:rPr>
-          <w:b w:val="0"/>
-          <w:i w:val="0"/>
-        </w:rPr>
-        <w:t xml:space="preserve"> to 6.9</w:t>
-      </w:r>
-      <w:r>
-        <w:rPr>
-          <w:b w:val="0"/>
-          <w:i w:val="0"/>
-        </w:rPr>
-        <w:t>%</w:t>
-      </w:r>
-      <w:r>
-        <w:rPr>
-          <w:b w:val="0"/>
-          <w:i w:val="0"/>
-        </w:rPr>
-        <w:t>. Adjusting decision cutoffs (re</w:t>
+        <w:t>). Adjusting decision cutoffs (re</w:t>
       </w:r>
       <w:r>
         <w:rPr>
@@ -654,7 +626,7 @@
           <w:b w:val="0"/>
           <w:i w:val="0"/>
         </w:rPr>
-        <w:t>Our main practical takeaway is that under small edit budgets, neither overall accuracy nor the distance from the decision threshold orders how often a model flips: the model with the most flips is not the least accurate, and its probability route saturates, so no margin can be read on it. Robustness therefore has to be measured per model rather than inferred from accuracy or confidence. Furthermore, attack success rates must always be reported with their exact sample count (denominator), a statistical confidence interval, and the specific search method used. A result of 0 out of 188 is an upper limit of 2.0</w:t>
+        <w:t>Our main practical takeaway is that under small edit budgets, neither overall accuracy nor the distance from the decision threshold orders how often a model flips: the model with the most flips is not the least accurate, and its probability channel saturates, so no margin can be read on it. Robustness therefore has to be measured per model rather than inferred from accuracy or confidence. Furthermore, attack success rates must always be reported with their exact sample count (denominator), a statistical confidence interval, and the specific search method used. A result of 0 out of 188 is an upper limit of 2.0</w:t>
       </w:r>
       <w:r>
         <w:rPr>
@@ -987,7 +959,28 @@
           <w:b w:val="0"/>
           <w:i w:val="0"/>
         </w:rPr>
-        <w:t>047 model queries resulted in 40 total decision flips. We test character</w:t>
+        <w:t xml:space="preserve">047 model queries gave 40 decision flips under the two random attacks; the guided attack has its own totals in </w:t>
+      </w:r>
+      <w:r>
+        <w:rPr>
+          <w:b w:val="0"/>
+          <w:i w:val="0"/>
+        </w:rPr>
+        <w:t>§</w:t>
+      </w:r>
+      <w:r>
+        <w:rPr>
+          <w:b w:val="0"/>
+          <w:i w:val="0"/>
+        </w:rPr>
+        <w:t>6</w:t>
+      </w:r>
+      <w:r>
+        <w:rPr>
+          <w:b w:val="0"/>
+          <w:i w:val="0"/>
+        </w:rPr>
+        <w:t>. We test character</w:t>
       </w:r>
       <w:r>
         <w:rPr>
@@ -1043,28 +1036,7 @@
           <w:b w:val="0"/>
           <w:i w:val="0"/>
         </w:rPr>
-        <w:t>guided attack that spends more queries to rank word importance (</w:t>
-      </w:r>
-      <w:r>
-        <w:rPr>
-          <w:b w:val="0"/>
-          <w:i w:val="0"/>
-        </w:rPr>
-        <w:t>§</w:t>
-      </w:r>
-      <w:r>
-        <w:rPr>
-          <w:b w:val="0"/>
-          <w:i w:val="0"/>
-        </w:rPr>
-        <w:t>6</w:t>
-      </w:r>
-      <w:r>
-        <w:rPr>
-          <w:b w:val="0"/>
-          <w:i w:val="0"/>
-        </w:rPr>
-        <w:t>).</w:t>
+        <w:t>guided attack that spends more queries to rank word importance.</w:t>
       </w:r>
     </w:p>
     <w:p>
@@ -1256,7 +1228,7 @@
           <w:b w:val="0"/>
           <w:i w:val="0"/>
         </w:rPr>
-        <w:t>): neither overall accuracy nor the measured distance from the decision threshold orders the attack success rate across the three models. The model with the most flips is not the least accurate, and its own probability route saturates at 0.9999 or above on 800 of its 845 stored originals, so no margin can be read there. The one clear case is the detector that marks almost everything malicious: its score barely varies, so it looks robust for a reason that has nothing to do with robustness.</w:t>
+        <w:t>): neither overall accuracy nor the measured distance from the decision threshold orders the attack success rate across the three models. The model with the most flips is not the least accurate, and its own probability channel saturates at 0.9999 or above on 800 of its 845 stored originals, so no margin can be read there. The one clear case is the detector that marks almost everything malicious: its score barely varies, so it looks robust for a reason that has nothing to do with robustness.</w:t>
       </w:r>
     </w:p>
     <w:p>
@@ -1323,7 +1295,7 @@
           <w:b w:val="0"/>
           <w:i w:val="0"/>
         </w:rPr>
-        <w:t>box attacks with full access to model internal weights, nor do we evaluate adaptive attackers who know the defense beforehand. Our saliency search selects words using model feedback, but it also uses a larger dictionary than the random word baseline. Therefore, the gap between them is not due to word ordering alone (</w:t>
+        <w:t>box attacks with full access to model internal weights, nor do we evaluate adaptive attackers who know the defence beforehand. Our saliency attack selects words using model feedback, but it also uses a larger dictionary than the random word baseline. Therefore, the gap between them is not due to word ordering alone (</w:t>
       </w:r>
       <w:r>
         <w:rPr>
@@ -2363,7 +2335,7 @@
           <w:b w:val="0"/>
           <w:i w:val="0"/>
         </w:rPr>
-        <w:t>used active tests to find weaknesses in 11 of 13 published defenses</w:t>
+        <w:t>used active tests to find weaknesses in 11 of 13 published defences</w:t>
       </w:r>
       <w:r>
         <w:rPr>
@@ -2532,7 +2504,7 @@
         <w:pStyle w:val="Heading3"/>
       </w:pPr>
       <w:r>
-        <w:t>Two levels of access, reported separately.</w:t>
+        <w:t>Two channels, reported separately.</w:t>
       </w:r>
     </w:p>
     <w:p>
@@ -2544,14 +2516,14 @@
           <w:b w:val="0"/>
           <w:i w:val="0"/>
         </w:rPr>
-        <w:t xml:space="preserve">Not every attack in this paper assumes the same interface, and the paper never adds them together. </w:t>
+        <w:t xml:space="preserve">Not every attack in this paper assumes the same interface, and the paper never adds them together. The </w:t>
       </w:r>
       <w:r>
         <w:rPr>
           <w:b w:val="0"/>
           <w:i/>
         </w:rPr>
-        <w:t>Verdict access</w:t>
+        <w:t>verdict channel</w:t>
       </w:r>
       <w:r>
         <w:rPr>
@@ -2607,14 +2579,14 @@
           <w:b w:val="0"/>
           <w:i w:val="0"/>
         </w:rPr>
-        <w:t xml:space="preserve">). </w:t>
+        <w:t xml:space="preserve">). The </w:t>
       </w:r>
       <w:r>
         <w:rPr>
           <w:b w:val="0"/>
           <w:i/>
         </w:rPr>
-        <w:t>Probability access</w:t>
+        <w:t>probability channel</w:t>
       </w:r>
       <w:r>
         <w:rPr>
@@ -2754,7 +2726,7 @@
           <w:b w:val="0"/>
           <w:i w:val="0"/>
         </w:rPr>
-        <w:t xml:space="preserve"> holds the information source fixed across arms, precisely so that the cost of dropping from probability access to verdict access is measured rather than assumed.</w:t>
+        <w:t xml:space="preserve"> holds the information source fixed across arms, precisely so that the cost of dropping from the probability channel to the verdict channel is measured rather than assumed.</w:t>
       </w:r>
     </w:p>
     <w:p>
@@ -2864,126 +2836,7 @@
           <w:b w:val="0"/>
           <w:i w:val="0"/>
         </w:rPr>
-        <w:t xml:space="preserve"> from the total rather than counted as a failed attack. In our runs this happened 52 times, and each exclusion is recorded with its reason. The 52 fall into exactly two kinds, and the split is not the one an earlier draft reported. Forty</w:t>
-      </w:r>
-      <w:r>
-        <w:rPr>
-          <w:b w:val="0"/>
-          <w:i w:val="0"/>
-        </w:rPr>
-        <w:t>-</w:t>
-      </w:r>
-      <w:r>
-        <w:rPr>
-          <w:b w:val="0"/>
-          <w:i w:val="0"/>
-        </w:rPr>
-        <w:t>three are samples that the saliency attack</w:t>
-      </w:r>
-      <w:r>
-        <w:rPr>
-          <w:b w:val="0"/>
-          <w:i w:val="0"/>
-        </w:rPr>
-        <w:t>’</w:t>
-      </w:r>
-      <w:r>
-        <w:rPr>
-          <w:b w:val="0"/>
-          <w:i w:val="0"/>
-        </w:rPr>
-        <w:t xml:space="preserve">s probability route read as benign on the original </w:t>
-      </w:r>
-      <w:r>
-        <w:rPr>
-          <w:b w:val="0"/>
-          <w:i w:val="0"/>
-        </w:rPr>
-        <w:t>—</w:t>
-      </w:r>
-      <w:r>
-        <w:rPr>
-          <w:b w:val="0"/>
-          <w:i w:val="0"/>
-        </w:rPr>
-        <w:t xml:space="preserve"> all of them on Qwen2.5</w:t>
-      </w:r>
-      <w:r>
-        <w:rPr>
-          <w:b w:val="0"/>
-          <w:i w:val="0"/>
-        </w:rPr>
-        <w:t>-</w:t>
-      </w:r>
-      <w:r>
-        <w:rPr>
-          <w:b w:val="0"/>
-          <w:i w:val="0"/>
-        </w:rPr>
-        <w:t xml:space="preserve">3B, a channel problem discussed in </w:t>
-      </w:r>
-      <w:r>
-        <w:rPr>
-          <w:b w:val="0"/>
-          <w:i w:val="0"/>
-        </w:rPr>
-        <w:t>§</w:t>
-      </w:r>
-      <w:r>
-        <w:rPr>
-          <w:b w:val="0"/>
-          <w:i w:val="0"/>
-        </w:rPr>
-        <w:t>9</w:t>
-      </w:r>
-      <w:r>
-        <w:rPr>
-          <w:b w:val="0"/>
-          <w:i w:val="0"/>
-        </w:rPr>
-        <w:t>. The other nine are word</w:t>
-      </w:r>
-      <w:r>
-        <w:rPr>
-          <w:b w:val="0"/>
-          <w:i w:val="0"/>
-        </w:rPr>
-        <w:t>-</w:t>
-      </w:r>
-      <w:r>
-        <w:rPr>
-          <w:b w:val="0"/>
-          <w:i w:val="0"/>
-        </w:rPr>
-        <w:t>attack samples whose edited text came out identical to the original, so no edit was made and there was nothing to score. No original was dropped for any other reason: the generated answer never re</w:t>
-      </w:r>
-      <w:r>
-        <w:rPr>
-          <w:b w:val="0"/>
-          <w:i w:val="0"/>
-        </w:rPr>
-        <w:t>-</w:t>
-      </w:r>
-      <w:r>
-        <w:rPr>
-          <w:b w:val="0"/>
-          <w:i w:val="0"/>
-        </w:rPr>
-        <w:t>read a baseline</w:t>
-      </w:r>
-      <w:r>
-        <w:rPr>
-          <w:b w:val="0"/>
-          <w:i w:val="0"/>
-        </w:rPr>
-        <w:t>-</w:t>
-      </w:r>
-      <w:r>
-        <w:rPr>
-          <w:b w:val="0"/>
-          <w:i w:val="0"/>
-        </w:rPr>
-        <w:t>caught message as benign, so the character and saliency runs on the other two models exclude nothing at all.</w:t>
+        <w:t xml:space="preserve"> from the total rather than counted as a failed attack. In our runs this happened 52 times, and each exclusion is recorded with its reason.</w:t>
       </w:r>
     </w:p>
     <w:p>
@@ -2991,7 +2844,7 @@
         <w:pStyle w:val="Heading3"/>
       </w:pPr>
       <w:r>
-        <w:t>Rule 2 — the same prompt on both sides.</w:t>
+        <w:t>Where the 52 exclusions come from.</w:t>
       </w:r>
     </w:p>
     <w:p>
@@ -3003,7 +2856,21 @@
           <w:b w:val="0"/>
           <w:i w:val="0"/>
         </w:rPr>
-        <w:t>The baseline and the attack call the identical message template, including the sample</w:t>
+        <w:t>They fall into exactly two kinds. Forty</w:t>
+      </w:r>
+      <w:r>
+        <w:rPr>
+          <w:b w:val="0"/>
+          <w:i w:val="0"/>
+        </w:rPr>
+        <w:t>-</w:t>
+      </w:r>
+      <w:r>
+        <w:rPr>
+          <w:b w:val="0"/>
+          <w:i w:val="0"/>
+        </w:rPr>
+        <w:t>three are samples that the saliency attack</w:t>
       </w:r>
       <w:r>
         <w:rPr>
@@ -3017,7 +2884,21 @@
           <w:b w:val="0"/>
           <w:i w:val="0"/>
         </w:rPr>
-        <w:t>s own task description, so an e</w:t>
+        <w:t xml:space="preserve">s probability channel read as benign on the original </w:t>
+      </w:r>
+      <w:r>
+        <w:rPr>
+          <w:b w:val="0"/>
+          <w:i w:val="0"/>
+        </w:rPr>
+        <w:t>—</w:t>
+      </w:r>
+      <w:r>
+        <w:rPr>
+          <w:b w:val="0"/>
+          <w:i w:val="0"/>
+        </w:rPr>
+        <w:t xml:space="preserve"> all of them on Qwen2.5</w:t>
       </w:r>
       <w:r>
         <w:rPr>
@@ -3031,7 +2912,28 @@
           <w:b w:val="0"/>
           <w:i w:val="0"/>
         </w:rPr>
-        <w:t>mail is never scored with the SMS prompt. A baseline</w:t>
+        <w:t xml:space="preserve">3B, a channel problem discussed in </w:t>
+      </w:r>
+      <w:r>
+        <w:rPr>
+          <w:b w:val="0"/>
+          <w:i w:val="0"/>
+        </w:rPr>
+        <w:t>§</w:t>
+      </w:r>
+      <w:r>
+        <w:rPr>
+          <w:b w:val="0"/>
+          <w:i w:val="0"/>
+        </w:rPr>
+        <w:t>9</w:t>
+      </w:r>
+      <w:r>
+        <w:rPr>
+          <w:b w:val="0"/>
+          <w:i w:val="0"/>
+        </w:rPr>
+        <w:t>. The other nine are word</w:t>
       </w:r>
       <w:r>
         <w:rPr>
@@ -3045,7 +2947,7 @@
           <w:b w:val="0"/>
           <w:i w:val="0"/>
         </w:rPr>
-        <w:t>versus</w:t>
+        <w:t>attack samples whose edited text came out identical to the original, so no edit was made and there was nothing to score. No original was dropped for any other reason: the verdict channel never re</w:t>
       </w:r>
       <w:r>
         <w:rPr>
@@ -3059,7 +2961,21 @@
           <w:b w:val="0"/>
           <w:i w:val="0"/>
         </w:rPr>
-        <w:t>attack comparison across two different prompts would measure the prompt, not the attack.</w:t>
+        <w:t>read a baseline</w:t>
+      </w:r>
+      <w:r>
+        <w:rPr>
+          <w:b w:val="0"/>
+          <w:i w:val="0"/>
+        </w:rPr>
+        <w:t>-</w:t>
+      </w:r>
+      <w:r>
+        <w:rPr>
+          <w:b w:val="0"/>
+          <w:i w:val="0"/>
+        </w:rPr>
+        <w:t>caught message as benign, so the character and saliency runs on the other two models exclude nothing at all.</w:t>
       </w:r>
     </w:p>
     <w:p>
@@ -3067,7 +2983,7 @@
         <w:pStyle w:val="Heading3"/>
       </w:pPr>
       <w:r>
-        <w:t>Rule 3 — one shared budget, measured exactly.</w:t>
+        <w:t>Rule 2 — the same prompt on both sides.</w:t>
       </w:r>
     </w:p>
     <w:p>
@@ -3079,21 +2995,21 @@
           <w:b w:val="0"/>
           <w:i w:val="0"/>
         </w:rPr>
-        <w:t>The 15</w:t>
-      </w:r>
-      <w:r>
-        <w:rPr>
-          <w:b w:val="0"/>
-          <w:i w:val="0"/>
-        </w:rPr>
-        <w:t>%</w:t>
-      </w:r>
-      <w:r>
-        <w:rPr>
-          <w:b w:val="0"/>
-          <w:i w:val="0"/>
-        </w:rPr>
-        <w:t xml:space="preserve"> budget is a single allowance for the whole edit, not one per operation, and the edit rate is the exact Levenshtein distance (the smallest number of single</w:t>
+        <w:t>The baseline and the attack call the identical message template, including the sample</w:t>
+      </w:r>
+      <w:r>
+        <w:rPr>
+          <w:b w:val="0"/>
+          <w:i w:val="0"/>
+        </w:rPr>
+        <w:t>’</w:t>
+      </w:r>
+      <w:r>
+        <w:rPr>
+          <w:b w:val="0"/>
+          <w:i w:val="0"/>
+        </w:rPr>
+        <w:t>s own task description, so an e</w:t>
       </w:r>
       <w:r>
         <w:rPr>
@@ -3107,91 +3023,35 @@
           <w:b w:val="0"/>
           <w:i w:val="0"/>
         </w:rPr>
-        <w:t>character insertions, deletions and substitutions that turns one string into the other) divided by the length of the original. Both details matter. Giving each operation its own allowance let the real rate reach 22</w:t>
-      </w:r>
-      <w:r>
-        <w:rPr>
-          <w:b w:val="0"/>
-          <w:i w:val="0"/>
-        </w:rPr>
-        <w:t>%</w:t>
-      </w:r>
-      <w:r>
-        <w:rPr>
-          <w:b w:val="0"/>
-          <w:i w:val="0"/>
-        </w:rPr>
-        <w:t xml:space="preserve"> while the paper called it 15</w:t>
-      </w:r>
-      <w:r>
-        <w:rPr>
-          <w:b w:val="0"/>
-          <w:i w:val="0"/>
-        </w:rPr>
-        <w:t>%</w:t>
-      </w:r>
-      <w:r>
-        <w:rPr>
-          <w:b w:val="0"/>
-          <w:i w:val="0"/>
-        </w:rPr>
-        <w:t xml:space="preserve">; and estimating the distance from a </w:t>
-      </w:r>
-      <w:r>
-        <w:rPr>
-          <w:b w:val="0"/>
-          <w:i w:val="0"/>
-        </w:rPr>
-        <w:t>‘</w:t>
-      </w:r>
-      <w:r>
-        <w:rPr>
-          <w:b w:val="0"/>
-          <w:i w:val="0"/>
-        </w:rPr>
-        <w:t>difflib</w:t>
-      </w:r>
-      <w:r>
-        <w:rPr>
-          <w:b w:val="0"/>
-          <w:i w:val="0"/>
-        </w:rPr>
-        <w:t>’</w:t>
-      </w:r>
-      <w:r>
-        <w:rPr>
-          <w:b w:val="0"/>
-          <w:i w:val="0"/>
-        </w:rPr>
-        <w:t xml:space="preserve"> opcode tally reported 204 edits for 56 deleted characters on a repetitive message, because </w:t>
-      </w:r>
-      <w:r>
-        <w:rPr>
-          <w:b w:val="0"/>
-          <w:i w:val="0"/>
-        </w:rPr>
-        <w:t>‘</w:t>
-      </w:r>
-      <w:r>
-        <w:rPr>
-          <w:b w:val="0"/>
-          <w:i w:val="0"/>
-        </w:rPr>
-        <w:t>difflib</w:t>
-      </w:r>
-      <w:r>
-        <w:rPr>
-          <w:b w:val="0"/>
-          <w:i w:val="0"/>
-        </w:rPr>
-        <w:t>’</w:t>
-      </w:r>
-      <w:r>
-        <w:rPr>
-          <w:b w:val="0"/>
-          <w:i w:val="0"/>
-        </w:rPr>
-        <w:t xml:space="preserve"> does not compute a minimal edit script.</w:t>
+        <w:t>mail is never scored with the SMS prompt. A baseline</w:t>
+      </w:r>
+      <w:r>
+        <w:rPr>
+          <w:b w:val="0"/>
+          <w:i w:val="0"/>
+        </w:rPr>
+        <w:t>-</w:t>
+      </w:r>
+      <w:r>
+        <w:rPr>
+          <w:b w:val="0"/>
+          <w:i w:val="0"/>
+        </w:rPr>
+        <w:t>versus</w:t>
+      </w:r>
+      <w:r>
+        <w:rPr>
+          <w:b w:val="0"/>
+          <w:i w:val="0"/>
+        </w:rPr>
+        <w:t>-</w:t>
+      </w:r>
+      <w:r>
+        <w:rPr>
+          <w:b w:val="0"/>
+          <w:i w:val="0"/>
+        </w:rPr>
+        <w:t>attack comparison across two different prompts would measure the prompt, not the attack.</w:t>
       </w:r>
     </w:p>
     <w:p>
@@ -3199,7 +3059,7 @@
         <w:pStyle w:val="Heading3"/>
       </w:pPr>
       <w:r>
-        <w:t>Rule 4 — name the similarity you actually computed.</w:t>
+        <w:t>Rule 3 — one shared budget, measured exactly.</w:t>
       </w:r>
     </w:p>
     <w:p>
@@ -3211,6 +3071,138 @@
           <w:b w:val="0"/>
           <w:i w:val="0"/>
         </w:rPr>
+        <w:t>The 15</w:t>
+      </w:r>
+      <w:r>
+        <w:rPr>
+          <w:b w:val="0"/>
+          <w:i w:val="0"/>
+        </w:rPr>
+        <w:t>%</w:t>
+      </w:r>
+      <w:r>
+        <w:rPr>
+          <w:b w:val="0"/>
+          <w:i w:val="0"/>
+        </w:rPr>
+        <w:t xml:space="preserve"> budget is a single allowance for the whole edit, not one per operation, and the edit rate is the exact Levenshtein distance (the smallest number of single</w:t>
+      </w:r>
+      <w:r>
+        <w:rPr>
+          <w:b w:val="0"/>
+          <w:i w:val="0"/>
+        </w:rPr>
+        <w:t>-</w:t>
+      </w:r>
+      <w:r>
+        <w:rPr>
+          <w:b w:val="0"/>
+          <w:i w:val="0"/>
+        </w:rPr>
+        <w:t>character insertions, deletions and substitutions that turns one string into the other) divided by the length of the original. Both details matter. Giving each operation its own allowance let the real rate reach 22</w:t>
+      </w:r>
+      <w:r>
+        <w:rPr>
+          <w:b w:val="0"/>
+          <w:i w:val="0"/>
+        </w:rPr>
+        <w:t>%</w:t>
+      </w:r>
+      <w:r>
+        <w:rPr>
+          <w:b w:val="0"/>
+          <w:i w:val="0"/>
+        </w:rPr>
+        <w:t xml:space="preserve"> while the paper called it 15</w:t>
+      </w:r>
+      <w:r>
+        <w:rPr>
+          <w:b w:val="0"/>
+          <w:i w:val="0"/>
+        </w:rPr>
+        <w:t>%</w:t>
+      </w:r>
+      <w:r>
+        <w:rPr>
+          <w:b w:val="0"/>
+          <w:i w:val="0"/>
+        </w:rPr>
+        <w:t xml:space="preserve">; and estimating the distance from a </w:t>
+      </w:r>
+      <w:r>
+        <w:rPr>
+          <w:b w:val="0"/>
+          <w:i w:val="0"/>
+        </w:rPr>
+        <w:t>‘</w:t>
+      </w:r>
+      <w:r>
+        <w:rPr>
+          <w:b w:val="0"/>
+          <w:i w:val="0"/>
+        </w:rPr>
+        <w:t>difflib</w:t>
+      </w:r>
+      <w:r>
+        <w:rPr>
+          <w:b w:val="0"/>
+          <w:i w:val="0"/>
+        </w:rPr>
+        <w:t>’</w:t>
+      </w:r>
+      <w:r>
+        <w:rPr>
+          <w:b w:val="0"/>
+          <w:i w:val="0"/>
+        </w:rPr>
+        <w:t xml:space="preserve"> opcode tally reported 204 edits for 56 deleted characters on a repetitive message, because </w:t>
+      </w:r>
+      <w:r>
+        <w:rPr>
+          <w:b w:val="0"/>
+          <w:i w:val="0"/>
+        </w:rPr>
+        <w:t>‘</w:t>
+      </w:r>
+      <w:r>
+        <w:rPr>
+          <w:b w:val="0"/>
+          <w:i w:val="0"/>
+        </w:rPr>
+        <w:t>difflib</w:t>
+      </w:r>
+      <w:r>
+        <w:rPr>
+          <w:b w:val="0"/>
+          <w:i w:val="0"/>
+        </w:rPr>
+        <w:t>’</w:t>
+      </w:r>
+      <w:r>
+        <w:rPr>
+          <w:b w:val="0"/>
+          <w:i w:val="0"/>
+        </w:rPr>
+        <w:t xml:space="preserve"> does not compute a minimal edit script.</w:t>
+      </w:r>
+    </w:p>
+    <w:p>
+      <w:pPr>
+        <w:pStyle w:val="Heading3"/>
+      </w:pPr>
+      <w:r>
+        <w:t>Rule 4 — name the similarity you actually computed.</w:t>
+      </w:r>
+    </w:p>
+    <w:p>
+      <w:pPr>
+        <w:jc w:val="both"/>
+      </w:pPr>
+      <w:r>
+        <w:rPr>
+          <w:b w:val="0"/>
+          <w:i w:val="0"/>
+        </w:rPr>
         <w:t>We report word</w:t>
       </w:r>
       <w:r>
@@ -3724,49 +3716,7 @@
           <w:b w:val="0"/>
           <w:i w:val="0"/>
         </w:rPr>
-        <w:t xml:space="preserve">queries after each accepted edit, 22.9 queries per message on average. An earlier draft of this paragraph said </w:t>
-      </w:r>
-      <w:r>
-        <w:rPr>
-          <w:b w:val="0"/>
-          <w:i w:val="0"/>
-        </w:rPr>
-        <w:t>“</w:t>
-      </w:r>
-      <w:r>
-        <w:rPr>
-          <w:b w:val="0"/>
-          <w:i w:val="0"/>
-        </w:rPr>
-        <w:t>one attempt per sample</w:t>
-      </w:r>
-      <w:r>
-        <w:rPr>
-          <w:b w:val="0"/>
-          <w:i w:val="0"/>
-        </w:rPr>
-        <w:t>”</w:t>
-      </w:r>
-      <w:r>
-        <w:rPr>
-          <w:b w:val="0"/>
-          <w:i w:val="0"/>
-        </w:rPr>
-        <w:t>, which the per</w:t>
-      </w:r>
-      <w:r>
-        <w:rPr>
-          <w:b w:val="0"/>
-          <w:i w:val="0"/>
-        </w:rPr>
-        <w:t>-</w:t>
-      </w:r>
-      <w:r>
-        <w:rPr>
-          <w:b w:val="0"/>
-          <w:i w:val="0"/>
-        </w:rPr>
-        <w:t>sample records contradict; the attempt column in every row is the correction.</w:t>
+        <w:t>queries after each accepted edit, 22.9 queries per message on average. The attempt column in every row carries how many tries a message actually took, which is why the count above is measured rather than assumed.</w:t>
       </w:r>
     </w:p>
     <w:p>
@@ -4863,7 +4813,7 @@
           <w:b w:val="0"/>
           <w:i w:val="0"/>
         </w:rPr>
-        <w:t>queries the model. The results are then evaluated for transfer to other models and for defenses.</w:t>
+        <w:t>queries the model. The results are then evaluated for transfer to other models and for defences.</w:t>
       </w:r>
     </w:p>
     <w:p>
@@ -12004,7 +11954,7 @@
           <w:b w:val="0"/>
           <w:i w:val="0"/>
         </w:rPr>
-        <w:t>token route the saliency attack uses, so the mean margin (</w:t>
+        <w:t>token channel the saliency attack uses, so the mean margin (</w:t>
       </w:r>
       <w:r>
         <w:rPr>
@@ -12047,7 +11997,7 @@
           <w:b w:val="0"/>
           <w:i w:val="0"/>
         </w:rPr>
-        <w:t>) over the messages that route also called malicious can be read off per model (</w:t>
+        <w:t>) over the messages that channel also called malicious can be read off per model (</w:t>
       </w:r>
       <w:r>
         <w:rPr>
@@ -12207,7 +12157,7 @@
           <w:b w:val="0"/>
           <w:i w:val="0"/>
         </w:rPr>
-        <w:t>mini the number should not be trusted at all: 800 of its 845 stored originals score at least 0.9999, so the route saturates and returns no margin to compare. The ordering has also been attributed to proximity to the decision boundary; the stored scores do not support that, and this paper does not claim it.</w:t>
+        <w:t>mini the number should not be trusted at all: 800 of its 845 stored originals score at least 0.9999, so the channel saturates and returns no margin to compare. The ordering has also been attributed to proximity to the decision boundary; the stored scores do not support that, and this paper does not claim it.</w:t>
       </w:r>
     </w:p>
     <w:p>
@@ -12219,7 +12169,7 @@
           <w:b w:val="0"/>
           <w:i w:val="0"/>
         </w:rPr>
-        <w:t>What the scores do support is narrower, and inside one channel. Where the probability route does flip a message, that message started closer to the threshold than the ones the route leaves alone: mean 0.792 against 0.959 for Qwen2.5</w:t>
+        <w:t>What the scores do support is narrower, and inside one channel. Where the probability channel does flip a message, that message started closer to the threshold than the ones the channel leaves alone: mean 0.792 against 0.959 for Qwen2.5</w:t>
       </w:r>
       <w:r>
         <w:rPr>
@@ -12275,7 +12225,7 @@
           <w:b w:val="0"/>
           <w:i w:val="0"/>
         </w:rPr>
-        <w:t>1.7B never flips on that route at all (0 of 1</w:t>
+        <w:t>1.7B never flips on that channel at all (0 of 1</w:t>
       </w:r>
       <w:r>
         <w:rPr>
@@ -16899,7 +16849,7 @@
           <w:b w:val="0"/>
           <w:i w:val="0"/>
         </w:rPr>
-        <w:t xml:space="preserve">The normalization of </w:t>
+        <w:t xml:space="preserve">The normalisation of </w:t>
       </w:r>
       <w:r>
         <w:rPr>
@@ -17164,7 +17114,7 @@
           <w:b w:val="0"/>
           <w:i w:val="0"/>
         </w:rPr>
-        <w:t xml:space="preserve"> matters, and the scale is exactly what the normalization fixes. Our first version of this module had that defect; the unit test that now guards it (</w:t>
+        <w:t xml:space="preserve"> matters, and the scale is exactly what the normalisation fixes. The unit test that guards against that defect (</w:t>
       </w:r>
       <w:r>
         <w:rPr>
@@ -17475,7 +17425,7 @@
         <w:pStyle w:val="Heading3"/>
       </w:pPr>
       <w:r>
-        <w:t>Two answer channels.</w:t>
+        <w:t>Two channels.</w:t>
       </w:r>
     </w:p>
     <w:p>
@@ -17543,7 +17493,7 @@
           <w:b w:val="0"/>
           <w:i w:val="0"/>
         </w:rPr>
-        <w:t>word reply instead. Those are two readouts of the same model, and comparing their ASRs without checking that they agree would be comparing a ruler with a scale. Every stored saliency row is therefore re</w:t>
+        <w:t>word reply instead. Those are two channels of the same model, and comparing their ASRs without checking that they agree would be comparing a ruler with a scale. Every stored saliency row is therefore re</w:t>
       </w:r>
       <w:r>
         <w:rPr>
@@ -17557,7 +17507,7 @@
           <w:b w:val="0"/>
           <w:i w:val="0"/>
         </w:rPr>
-        <w:t>scored through the generation route, and Table</w:t>
+        <w:t>scored through the verdict channel, and Table</w:t>
       </w:r>
       <w:r>
         <w:rPr>
@@ -17578,7 +17528,7 @@
           <w:b w:val="0"/>
           <w:i w:val="0"/>
         </w:rPr>
-        <w:t xml:space="preserve"> reports the generation verdict; the artefact keeps both columns and the probability</w:t>
+        <w:t xml:space="preserve"> reports the verdict; the artefact keeps both columns and the probability</w:t>
       </w:r>
       <w:r>
         <w:rPr>
@@ -17592,7 +17542,7 @@
           <w:b w:val="0"/>
           <w:i w:val="0"/>
         </w:rPr>
-        <w:t xml:space="preserve">route count, and we do not treat a disagreement between them as a bug to be tuned away </w:t>
+        <w:t xml:space="preserve">channel count, and we do not treat a disagreement between them as a bug to be tuned away </w:t>
       </w:r>
       <w:r>
         <w:rPr>
@@ -17618,7 +17568,7 @@
           <w:b w:val="0"/>
           <w:i w:val="0"/>
         </w:rPr>
-        <w:t>The probability route also has a failure mode worth recording, because it is silent. The answer tokens are chosen per tokenizer, and Phi</w:t>
+        <w:t>The probability channel also has a failure mode worth recording, because it is silent. The answer tokens are chosen per tokenizer, and Phi</w:t>
       </w:r>
       <w:r>
         <w:rPr>
@@ -17799,91 +17749,28 @@
           <w:b w:val="0"/>
           <w:i w:val="0"/>
         </w:rPr>
-        <w:t xml:space="preserve"> is between attacks whose cost is on the record. The gap is real but smaller than an earlier draft of this paragraph claimed. The random attack is not one draw per sample: it re</w:t>
-      </w:r>
-      <w:r>
-        <w:rPr>
-          <w:b w:val="0"/>
-          <w:i w:val="0"/>
-        </w:rPr>
-        <w:t>-</w:t>
-      </w:r>
-      <w:r>
-        <w:rPr>
-          <w:b w:val="0"/>
-          <w:i w:val="0"/>
-        </w:rPr>
-        <w:t>queries every original and spends one query per attempt, up to three, which is 3.9 queries per message and 8</w:t>
-      </w:r>
-      <w:r>
-        <w:rPr>
-          <w:b w:val="0"/>
-          <w:i w:val="0"/>
-        </w:rPr>
-        <w:t>,</w:t>
-      </w:r>
-      <w:r>
-        <w:rPr>
-          <w:b w:val="0"/>
-          <w:i w:val="0"/>
-        </w:rPr>
-        <w:t>047 queries for the 2</w:t>
-      </w:r>
-      <w:r>
-        <w:rPr>
-          <w:b w:val="0"/>
-          <w:i w:val="0"/>
-        </w:rPr>
-        <w:t>,</w:t>
-      </w:r>
-      <w:r>
-        <w:rPr>
-          <w:b w:val="0"/>
-          <w:i w:val="0"/>
-        </w:rPr>
-        <w:t xml:space="preserve">079 messages it attacks. The saliency attack spends 22.9 per message </w:t>
-      </w:r>
-      <w:r>
-        <w:rPr>
-          <w:b w:val="0"/>
-          <w:i w:val="0"/>
-        </w:rPr>
-        <w:t>—</w:t>
-      </w:r>
-      <w:r>
-        <w:rPr>
-          <w:b w:val="0"/>
-          <w:i w:val="0"/>
-        </w:rPr>
-        <w:t xml:space="preserve"> 22</w:t>
-      </w:r>
-      <w:r>
-        <w:rPr>
-          <w:b w:val="0"/>
-          <w:i w:val="0"/>
-        </w:rPr>
-        <w:t>,</w:t>
-      </w:r>
-      <w:r>
-        <w:rPr>
-          <w:b w:val="0"/>
-          <w:i w:val="0"/>
-        </w:rPr>
-        <w:t>964 queries for 1</w:t>
-      </w:r>
-      <w:r>
-        <w:rPr>
-          <w:b w:val="0"/>
-          <w:i w:val="0"/>
-        </w:rPr>
-        <w:t>,</w:t>
-      </w:r>
-      <w:r>
-        <w:rPr>
-          <w:b w:val="0"/>
-          <w:i w:val="0"/>
-        </w:rPr>
-        <w:t>001 messages, six times as many calls for 1.6 times as many flips. The paper therefore does not claim equal cost, and it no longer claims the random attack was capped at one draw.</w:t>
+        <w:t xml:space="preserve"> is between attacks whose cost is on the record. The saliency attack spends 22.9 queries per message, six times what the random attack spends per message (</w:t>
+      </w:r>
+      <w:r>
+        <w:rPr>
+          <w:b w:val="0"/>
+          <w:i w:val="0"/>
+        </w:rPr>
+        <w:t>§</w:t>
+      </w:r>
+      <w:r>
+        <w:rPr>
+          <w:b w:val="0"/>
+          <w:i w:val="0"/>
+        </w:rPr>
+        <w:t>3</w:t>
+      </w:r>
+      <w:r>
+        <w:rPr>
+          <w:b w:val="0"/>
+          <w:i w:val="0"/>
+        </w:rPr>
+        <w:t>), for 1.6 times as many flips. The paper therefore does not claim equal cost.</w:t>
       </w:r>
     </w:p>
     <w:p>
@@ -22050,7 +21937,7 @@
           <w:b w:val="0"/>
           <w:i w:val="0"/>
         </w:rPr>
-        <w:t>s candidates predicted in one batch, accepting a flip that passes the meaning check and otherwise keeping the candidate that lowers the malicious confidence most. It costs one extra query per position, so it is matched by the cap rather than by construction and is reported as a stronger reference point, not as a fifth cell of the factorial.</w:t>
+        <w:t>s candidates predicted in one batch, accepting a flip that passes the meaning check and otherwise keeping the candidate that lowers the malicious confidence most. It costs one extra query per position, so it is matched by the cap rather than by construction.</w:t>
       </w:r>
     </w:p>
     <w:p>
@@ -24137,7 +24024,7 @@
           <w:b w:val="0"/>
           <w:i w:val="0"/>
         </w:rPr>
-        <w:t>s two rows is vocabulary, not intelligence, so the unmatched comparison overstates what ordering buys. Probability access, the thing a saliency attack is supposed to need, is the weakest of the three: an attacker holding only the one</w:t>
+        <w:t>s two rows is vocabulary, not intelligence, so the unmatched comparison overstates what ordering buys. The probability channel, the thing a saliency attack is supposed to need, is the weakest of the three: an attacker holding only the one</w:t>
       </w:r>
       <w:r>
         <w:rPr>
@@ -34731,7 +34618,7 @@
           <w:b w:val="0"/>
           <w:i w:val="0"/>
         </w:rPr>
-        <w:t xml:space="preserve"> a filter that flags nothing. Our first implementation did exactly that, and because it also counted a flip whenever an edited text fell below </w:t>
+        <w:t xml:space="preserve"> a filter that flags nothing. That is the failure mode the code now prevents: maximising </w:t>
       </w:r>
       <w:r>
         <w:rPr>
@@ -34745,7 +34632,21 @@
           <w:b w:val="0"/>
           <w:i w:val="0"/>
         </w:rPr>
-        <w:t>, without asking whether the original was above it, it reported a 100</w:t>
+        <w:t xml:space="preserve">, and counting a flip whenever an edited text falls below </w:t>
+      </w:r>
+      <w:r>
+        <w:rPr>
+          <w:b w:val="0"/>
+          <w:i/>
+        </w:rPr>
+        <w:t>τ</w:t>
+      </w:r>
+      <w:r>
+        <w:rPr>
+          <w:b w:val="0"/>
+          <w:i w:val="0"/>
+        </w:rPr>
+        <w:t xml:space="preserve"> without asking whether the original was above it, reports a 100</w:t>
       </w:r>
       <w:r>
         <w:rPr>
@@ -34759,7 +34660,7 @@
           <w:b w:val="0"/>
           <w:i w:val="0"/>
         </w:rPr>
-        <w:t xml:space="preserve"> ASR for the defence. Both rules are now enforced in code: </w:t>
+        <w:t xml:space="preserve"> ASR for the defence. Both rules are enforced in code: </w:t>
       </w:r>
       <w:r>
         <w:rPr>
@@ -36725,7 +36626,7 @@
           <w:b w:val="0"/>
           <w:i w:val="0"/>
         </w:rPr>
-        <w:t>The saliency attack confirms this behavior. Most evasions require only two or three targeted word substitutions. However, the saliency attack edits more words on average (9.3</w:t>
+        <w:t>The saliency attack confirms this behaviour. Most evasions require only two or three targeted word substitutions. However, the saliency attack edits more words on average (9.3</w:t>
       </w:r>
       <w:r>
         <w:rPr>
@@ -36814,7 +36715,7 @@
           <w:b w:val="0"/>
           <w:i w:val="0"/>
         </w:rPr>
-        <w:t>mini shows the largest increase: its ASR roughly doubles under saliency search (11.7</w:t>
+        <w:t>mini shows the largest increase: its ASR roughly doubles under the saliency attack (11.7</w:t>
       </w:r>
       <w:r>
         <w:rPr>
@@ -36870,7 +36771,7 @@
           <w:b w:val="0"/>
           <w:i w:val="0"/>
         </w:rPr>
-        <w:t xml:space="preserve"> under random word edits), although its probability route saturates at 0.9999 or above on 800 of its 845 stored rows, so the increase cannot be read as a margin effect. Qwen2.5</w:t>
+        <w:t xml:space="preserve"> under random word edits), although its probability channel saturates at 0.9999 or above on 800 of its 845 stored rows, so the increase cannot be read as a margin effect. Qwen2.5</w:t>
       </w:r>
       <w:r>
         <w:rPr>
@@ -36948,7 +36849,7 @@
         <w:pStyle w:val="Heading2"/>
       </w:pPr>
       <w:r>
-        <w:t>9.4 Two readouts of one model are not one measurement</w:t>
+        <w:t>9.4 Two channels of one model are not one measurement</w:t>
       </w:r>
     </w:p>
     <w:p>
@@ -37072,7 +36973,7 @@
           <w:b w:val="0"/>
           <w:i w:val="0"/>
         </w:rPr>
-        <w:t>1.7B, generation claims 15 flips that the probability route misses.</w:t>
+        <w:t>1.7B, generation claims 15 flips that the probability channel misses.</w:t>
       </w:r>
     </w:p>
     <w:p>
@@ -37098,7 +36999,7 @@
           <w:b w:val="0"/>
           <w:i w:val="0"/>
         </w:rPr>
-        <w:t>token probability readout does not match free</w:t>
+        <w:t>token probability channel does not match free</w:t>
       </w:r>
       <w:r>
         <w:rPr>
@@ -37244,7 +37145,21 @@
           <w:b w:val="0"/>
           <w:i w:val="0"/>
         </w:rPr>
-        <w:t>zero, and 27 of 31 cells hold fewer than ten caught originals.</w:t>
+        <w:t>zero, 27 of 31 cells hold fewer than ten caught originals, and every non</w:t>
+      </w:r>
+      <w:r>
+        <w:rPr>
+          <w:b w:val="0"/>
+          <w:i w:val="0"/>
+        </w:rPr>
+        <w:t>-</w:t>
+      </w:r>
+      <w:r>
+        <w:rPr>
+          <w:b w:val="0"/>
+          <w:i w:val="0"/>
+        </w:rPr>
+        <w:t>zero cell there carries one or two flips.</w:t>
       </w:r>
     </w:p>
     <w:p>
@@ -37306,7 +37221,7 @@
         <w:pStyle w:val="Heading2"/>
       </w:pPr>
       <w:r>
-        <w:t>9.6 Defenses: character cleaning succeeds while re-thresholding fails</w:t>
+        <w:t>9.6 Defences: character cleaning succeeds while re-thresholding fails</w:t>
       </w:r>
     </w:p>
     <w:p>
@@ -37318,7 +37233,7 @@
           <w:b w:val="0"/>
           <w:i w:val="0"/>
         </w:rPr>
-        <w:t>Character normalization cleans visually confusable characters. It removes every character</w:t>
+        <w:t>Character normalisation cleans visually confusable characters. It removes every character</w:t>
       </w:r>
       <w:r>
         <w:rPr>
@@ -37568,7 +37483,7 @@
           <w:b w:val="0"/>
           <w:i w:val="0"/>
         </w:rPr>
-        <w:t xml:space="preserve"> on SMS. Lowering the threshold places the decision cutoff inside perturbation noise. It also lowers clean recall on SmolLM2</w:t>
+        <w:t xml:space="preserve"> on SMS. There the fitted threshold sits inside the cluster of clean scores, so a small edit is enough to push a message below the cutoff. It also lowers clean recall on SmolLM2</w:t>
       </w:r>
       <w:r>
         <w:rPr>
@@ -37624,7 +37539,7 @@
           <w:b w:val="0"/>
           <w:i w:val="0"/>
         </w:rPr>
-        <w:t>). For one task cell, the budget cannot be met without rejecting all messages.</w:t>
+        <w:t>). For one task cell, the budget cannot be met without a threshold that flags nothing at all.</w:t>
       </w:r>
     </w:p>
     <w:p>
@@ -37798,7 +37713,7 @@
         <w:pStyle w:val="Heading3"/>
       </w:pPr>
       <w:r>
-        <w:t>Defense operating point.</w:t>
+        <w:t>Defence operating point.</w:t>
       </w:r>
     </w:p>
     <w:p>
@@ -37810,7 +37725,7 @@
           <w:b w:val="0"/>
           <w:i w:val="0"/>
         </w:rPr>
-        <w:t>The defense probe evaluates a 5</w:t>
+        <w:t>The defence probe evaluates a 5</w:t>
       </w:r>
       <w:r>
         <w:rPr>
@@ -37858,7 +37773,56 @@
           <w:b w:val="0"/>
           <w:i w:val="0"/>
         </w:rPr>
-        <w:t>The saliency attack excludes 43 originals that its probability channel classified as benign (all on Qwen2.5</w:t>
+        <w:t>Its 1</w:t>
+      </w:r>
+      <w:r>
+        <w:rPr>
+          <w:b w:val="0"/>
+          <w:i w:val="0"/>
+        </w:rPr>
+        <w:t>,</w:t>
+      </w:r>
+      <w:r>
+        <w:rPr>
+          <w:b w:val="0"/>
+          <w:i w:val="0"/>
+        </w:rPr>
+        <w:t>001 messages against 2</w:t>
+      </w:r>
+      <w:r>
+        <w:rPr>
+          <w:b w:val="0"/>
+          <w:i w:val="0"/>
+        </w:rPr>
+        <w:t>,</w:t>
+      </w:r>
+      <w:r>
+        <w:rPr>
+          <w:b w:val="0"/>
+          <w:i w:val="0"/>
+        </w:rPr>
+        <w:t xml:space="preserve">079 for the random attacks follow from the 52 exclusions of </w:t>
+      </w:r>
+      <w:r>
+        <w:rPr>
+          <w:b w:val="0"/>
+          <w:i w:val="0"/>
+        </w:rPr>
+        <w:t>§</w:t>
+      </w:r>
+      <w:r>
+        <w:rPr>
+          <w:b w:val="0"/>
+          <w:i w:val="0"/>
+        </w:rPr>
+        <w:t>3</w:t>
+      </w:r>
+      <w:r>
+        <w:rPr>
+          <w:b w:val="0"/>
+          <w:i w:val="0"/>
+        </w:rPr>
+        <w:t>: 43 saliency originals that the probability channel read as benign (all on Qwen2.5</w:t>
       </w:r>
       <w:r>
         <w:rPr>
@@ -37872,35 +37836,35 @@
           <w:b w:val="0"/>
           <w:i w:val="0"/>
         </w:rPr>
-        <w:t>3B). Its denominator is 1</w:t>
-      </w:r>
-      <w:r>
-        <w:rPr>
-          <w:b w:val="0"/>
-          <w:i w:val="0"/>
-        </w:rPr>
-        <w:t>,</w:t>
-      </w:r>
-      <w:r>
-        <w:rPr>
-          <w:b w:val="0"/>
-          <w:i w:val="0"/>
-        </w:rPr>
-        <w:t>001 messages, compared to 2</w:t>
-      </w:r>
-      <w:r>
-        <w:rPr>
-          <w:b w:val="0"/>
-          <w:i w:val="0"/>
-        </w:rPr>
-        <w:t>,</w:t>
-      </w:r>
-      <w:r>
-        <w:rPr>
-          <w:b w:val="0"/>
-          <w:i w:val="0"/>
-        </w:rPr>
-        <w:t>079 for random attacks. Nine additional exclusions in the word attack correspond to identical text transformations (52 exclusions total).</w:t>
+        <w:t>3B) and nine word</w:t>
+      </w:r>
+      <w:r>
+        <w:rPr>
+          <w:b w:val="0"/>
+          <w:i w:val="0"/>
+        </w:rPr>
+        <w:t>-</w:t>
+      </w:r>
+      <w:r>
+        <w:rPr>
+          <w:b w:val="0"/>
+          <w:i w:val="0"/>
+        </w:rPr>
+        <w:t>attack no</w:t>
+      </w:r>
+      <w:r>
+        <w:rPr>
+          <w:b w:val="0"/>
+          <w:i w:val="0"/>
+        </w:rPr>
+        <w:t>-</w:t>
+      </w:r>
+      <w:r>
+        <w:rPr>
+          <w:b w:val="0"/>
+          <w:i w:val="0"/>
+        </w:rPr>
+        <w:t>op edits.</w:t>
       </w:r>
     </w:p>
     <w:p>
@@ -38118,21 +38082,28 @@
           <w:b w:val="0"/>
           <w:i w:val="0"/>
         </w:rPr>
-        <w:t>Paraphrase generation attacks and defense</w:t>
-      </w:r>
-      <w:r>
-        <w:rPr>
-          <w:b w:val="0"/>
-          <w:i w:val="0"/>
-        </w:rPr>
-        <w:t>-</w:t>
-      </w:r>
-      <w:r>
-        <w:rPr>
-          <w:b w:val="0"/>
-          <w:i w:val="0"/>
-        </w:rPr>
-        <w:t>aware adaptive attacks were designed but not run.</w:t>
+        <w:t xml:space="preserve">Two designed attacks were not run; </w:t>
+      </w:r>
+      <w:r>
+        <w:rPr>
+          <w:b w:val="0"/>
+          <w:i w:val="0"/>
+        </w:rPr>
+        <w:t>§</w:t>
+      </w:r>
+      <w:r>
+        <w:rPr>
+          <w:b w:val="0"/>
+          <w:i w:val="0"/>
+        </w:rPr>
+        <w:t>9.8</w:t>
+      </w:r>
+      <w:r>
+        <w:rPr>
+          <w:b w:val="0"/>
+          <w:i w:val="0"/>
+        </w:rPr>
+        <w:t xml:space="preserve"> says what each of them would test.</w:t>
       </w:r>
     </w:p>
     <w:p>
@@ -38566,7 +38537,7 @@
           <w:b w:val="0"/>
           <w:i w:val="0"/>
         </w:rPr>
-        <w:t xml:space="preserve">style importance ranking on the same candidate set. That is a targeted search, and an earlier draft of this section claimed otherwise. It is also not a new capability: PWWS and TextFooler are published, TextAttack implements both, and this implementation is weaker than either </w:t>
+        <w:t xml:space="preserve">style importance ranking on the same candidate set. That is a targeted search. It is also not a new capability: PWWS and TextFooler are published, TextAttack implements both, and this implementation is weaker than either </w:t>
       </w:r>
       <w:r>
         <w:rPr>
@@ -38704,7 +38675,19 @@
           <w:b w:val="0"/>
           <w:i w:val="0"/>
         </w:rPr>
-        <w:t>Seven measurement defects were found and fixed in our own pipeline before the numbers in this paper were produced: per</w:t>
+        <w:t>Seven measurement defects were found and fixed in our own pipeline before the numbers in this paper were produced:</w:t>
+      </w:r>
+    </w:p>
+    <w:p>
+      <w:pPr>
+        <w:pStyle w:val="ListBullet"/>
+      </w:pPr>
+      <w:r>
+        <w:rPr>
+          <w:b w:val="0"/>
+          <w:i w:val="0"/>
+        </w:rPr>
+        <w:t>per</w:t>
       </w:r>
       <w:r>
         <w:rPr>
@@ -38746,7 +38729,55 @@
           <w:b w:val="0"/>
           <w:i w:val="0"/>
         </w:rPr>
-        <w:t xml:space="preserve">; estimated rather than measured edit counts; a similarity metric labelled BERTScore that was word Jaccard; an attack set drawn from messages the model had never caught; a saliency score that is a constant at </w:t>
+        <w:t>;</w:t>
+      </w:r>
+    </w:p>
+    <w:p>
+      <w:pPr>
+        <w:pStyle w:val="ListBullet"/>
+      </w:pPr>
+      <w:r>
+        <w:rPr>
+          <w:b w:val="0"/>
+          <w:i w:val="0"/>
+        </w:rPr>
+        <w:t>estimated rather than measured edit counts;</w:t>
+      </w:r>
+    </w:p>
+    <w:p>
+      <w:pPr>
+        <w:pStyle w:val="ListBullet"/>
+      </w:pPr>
+      <w:r>
+        <w:rPr>
+          <w:b w:val="0"/>
+          <w:i w:val="0"/>
+        </w:rPr>
+        <w:t>a similarity metric labelled BERTScore that was word Jaccard;</w:t>
+      </w:r>
+    </w:p>
+    <w:p>
+      <w:pPr>
+        <w:pStyle w:val="ListBullet"/>
+      </w:pPr>
+      <w:r>
+        <w:rPr>
+          <w:b w:val="0"/>
+          <w:i w:val="0"/>
+        </w:rPr>
+        <w:t>an attack set drawn from messages the model had never caught;</w:t>
+      </w:r>
+    </w:p>
+    <w:p>
+      <w:pPr>
+        <w:pStyle w:val="ListBullet"/>
+      </w:pPr>
+      <w:r>
+        <w:rPr>
+          <w:b w:val="0"/>
+          <w:i w:val="0"/>
+        </w:rPr>
+        <w:t xml:space="preserve">a saliency score that is a constant at </w:t>
       </w:r>
       <w:r>
         <w:rPr>
@@ -38767,7 +38798,19 @@
           <w:b w:val="0"/>
           <w:i w:val="0"/>
         </w:rPr>
-        <w:t xml:space="preserve"> unless it is normalised, which silently reduced the greedy search to applying substitutions left to right; an answer</w:t>
+        <w:t xml:space="preserve"> unless it is normalised, which silently reduced the greedy search to applying substitutions left to right;</w:t>
+      </w:r>
+    </w:p>
+    <w:p>
+      <w:pPr>
+        <w:pStyle w:val="ListBullet"/>
+      </w:pPr>
+      <w:r>
+        <w:rPr>
+          <w:b w:val="0"/>
+          <w:i w:val="0"/>
+        </w:rPr>
+        <w:t>an answer</w:t>
       </w:r>
       <w:r>
         <w:rPr>
@@ -38795,7 +38838,19 @@
           <w:b w:val="0"/>
           <w:i w:val="0"/>
         </w:rPr>
-        <w:t xml:space="preserve"> for every message; and a defence threshold chosen by maximising the cutoff rather than minimising it, which rejected everything and, together with unconditional flip counting, reported a 100</w:t>
+        <w:t xml:space="preserve"> for every message;</w:t>
+      </w:r>
+    </w:p>
+    <w:p>
+      <w:pPr>
+        <w:pStyle w:val="ListBullet"/>
+      </w:pPr>
+      <w:r>
+        <w:rPr>
+          <w:b w:val="0"/>
+          <w:i w:val="0"/>
+        </w:rPr>
+        <w:t>a defence threshold chosen by maximising the cutoff rather than minimising it, which flagged nothing and, together with unconditional flip counting, reported a 100</w:t>
       </w:r>
       <w:r>
         <w:rPr>
@@ -38809,7 +38864,19 @@
           <w:b w:val="0"/>
           <w:i w:val="0"/>
         </w:rPr>
-        <w:t xml:space="preserve"> attack success rate for the defence. The last three were caught by unit tests that check the mechanism rather than the headline number </w:t>
+        <w:t xml:space="preserve"> attack success rate for the defence.</w:t>
+      </w:r>
+    </w:p>
+    <w:p>
+      <w:pPr>
+        <w:jc w:val="both"/>
+      </w:pPr>
+      <w:r>
+        <w:rPr>
+          <w:b w:val="0"/>
+          <w:i w:val="0"/>
+        </w:rPr>
+        <w:t xml:space="preserve">The last three were caught by unit tests that check the mechanism rather than the headline number </w:t>
       </w:r>
       <w:r>
         <w:rPr>
@@ -38962,7 +39029,42 @@
           <w:b w:val="0"/>
           <w:i w:val="0"/>
         </w:rPr>
-        <w:t xml:space="preserve">tier GPU in about two hours. The split fingerprints are published so that a reader can prove their rebuild is the split these numbers came from, and the calibration slice that tunes </w:t>
+        <w:t>tier GPU in about two hours (the random</w:t>
+      </w:r>
+      <w:r>
+        <w:rPr>
+          <w:b w:val="0"/>
+          <w:i w:val="0"/>
+        </w:rPr>
+        <w:t>-</w:t>
+      </w:r>
+      <w:r>
+        <w:rPr>
+          <w:b w:val="0"/>
+          <w:i w:val="0"/>
+        </w:rPr>
+        <w:t xml:space="preserve">attack run of </w:t>
+      </w:r>
+      <w:r>
+        <w:rPr>
+          <w:b w:val="0"/>
+          <w:i w:val="0"/>
+        </w:rPr>
+        <w:t>§</w:t>
+      </w:r>
+      <w:r>
+        <w:rPr>
+          <w:b w:val="0"/>
+          <w:i w:val="0"/>
+        </w:rPr>
+        <w:t>4</w:t>
+      </w:r>
+      <w:r>
+        <w:rPr>
+          <w:b w:val="0"/>
+          <w:i w:val="0"/>
+        </w:rPr>
+        <w:t xml:space="preserve"> is 37.1 minutes of that; the saliency, ablation, transfer and defence passes are the rest). The split fingerprints are published so that a reader can prove their rebuild is the split these numbers came from, and the calibration slice that tunes </w:t>
       </w:r>
       <w:r>
         <w:rPr>
@@ -39218,7 +39320,7 @@
           <w:b w:val="0"/>
           <w:i w:val="0"/>
         </w:rPr>
-        <w:t>). This result is not on the same messages or from the same candidate vocabulary. Once we account for the higher budget actually spent, the factor is 1.4, not 1.7. The search, the candidates, and the denominator must all be named in the claim. Second, at this budget the binding constraint on a small triage model is what it catches before any attack. What orders the flip rate is not accuracy and not the measured margin: the model that flips most is neither the least accurate nor the closest to its threshold, and its probability route saturates, so the margin cannot be read on it at all. The model that catches almost everything is immovable because its decision rule is nearly constant. Detection quality, not adversarial robustness, is where deployment effort pays first. Third, cheap defences split cleanly. Normalising visually confusable characters removes every character</w:t>
+        <w:t>). This result is not on the same messages or from the same candidate vocabulary. Once we account for the higher budget actually spent, the factor is 1.4, not 1.7. The search, the candidates, and the denominator must all be named in the claim. Second, at this budget the binding constraint on a small triage model is what it catches before any attack. What orders the flip rate is not accuracy and not the measured margin: the model that flips most is neither the least accurate nor the closest to its threshold, and its probability channel saturates, so the margin cannot be read on it at all. The model that catches almost everything is immovable because its decision rule is nearly constant. Detection quality, not adversarial robustness, is where deployment effort pays first. Third, cheap defences split cleanly. Normalising visually confusable characters removes every character</w:t>
       </w:r>
       <w:r>
         <w:rPr>
@@ -39342,7 +39444,7 @@
           <w:b w:val="0"/>
           <w:i w:val="0"/>
         </w:rPr>
-        <w:t>model numbers are worth measuring separately. The probability readout and the generated verdict agreed on 941 of 1</w:t>
+        <w:t>model numbers are worth measuring separately. The probability channel and the generated verdict agreed on 941 of 1</w:t>
       </w:r>
       <w:r>
         <w:rPr>
@@ -39356,7 +39458,7 @@
           <w:b w:val="0"/>
           <w:i w:val="0"/>
         </w:rPr>
-        <w:t>001 rows. They diverged systematically on two of three models. A single readout is not a measurement until it is checked against the other. Every tool in this paper reports its denominator, its interval, and the bugs we fixed in our own pipeline. Each bug silently inflated the attack success rate in the direction that makes a paper look interesting.</w:t>
+        <w:t>001 rows. They diverged systematically on two of three models. A single channel is not a measurement until it is checked against the other. Every tool in this paper reports its denominator, its interval, and the bugs we fixed in our own pipeline. Each bug silently inflated the attack success rate in the direction that makes a paper look interesting.</w:t>
       </w:r>
     </w:p>
     <w:p>
@@ -39417,35 +39519,28 @@
           <w:b w:val="0"/>
           <w:i w:val="0"/>
         </w:rPr>
-        <w:t xml:space="preserve"> is the one experiment here that attributes rather than describes. With the candidate set, the probe phase, and the call budget held fixed, it reports what ordering is worth on its own. What it cannot do is turn five contrasts on roughly a thousand paired messages into a ranking of attacks. Next: a sentence</w:t>
-      </w:r>
-      <w:r>
-        <w:rPr>
-          <w:b w:val="0"/>
-          <w:i w:val="0"/>
-        </w:rPr>
-        <w:t>-</w:t>
-      </w:r>
-      <w:r>
-        <w:rPr>
-          <w:b w:val="0"/>
-          <w:i w:val="0"/>
-        </w:rPr>
-        <w:t>level paraphrase attacker and a defence</w:t>
-      </w:r>
-      <w:r>
-        <w:rPr>
-          <w:b w:val="0"/>
-          <w:i w:val="0"/>
-        </w:rPr>
-        <w:t>-</w:t>
-      </w:r>
-      <w:r>
-        <w:rPr>
-          <w:b w:val="0"/>
-          <w:i w:val="0"/>
-        </w:rPr>
-        <w:t>aware attacker that knows the threshold. Neither is claimed here.</w:t>
+        <w:t xml:space="preserve"> is the one experiment here that attributes rather than describes. With the candidate set, the probe phase, and the call budget held fixed, it reports what ordering is worth on its own. What it cannot do is turn five contrasts on roughly a thousand paired messages into a ranking of attacks. </w:t>
+      </w:r>
+      <w:r>
+        <w:rPr>
+          <w:b w:val="0"/>
+          <w:i w:val="0"/>
+        </w:rPr>
+        <w:t>§</w:t>
+      </w:r>
+      <w:r>
+        <w:rPr>
+          <w:b w:val="0"/>
+          <w:i w:val="0"/>
+        </w:rPr>
+        <w:t>9.8</w:t>
+      </w:r>
+      <w:r>
+        <w:rPr>
+          <w:b w:val="0"/>
+          <w:i w:val="0"/>
+        </w:rPr>
+        <w:t xml:space="preserve"> names the two attacks that would test what remains; neither is reported here.</w:t>
       </w:r>
     </w:p>
     <w:p>

</xml_diff>

<commit_message>
Proofread the paper for grammar and sentence flow.
Fixes are wording only: subject-verb agreement ("every ... rate are written",
"1 of 6 shows"), a comma splice in D1 and in the flipped-source sentence,
"different ... from" instead of "than", the missing question mark recast as an
indirect question, and three fragments that began a paragraph without a verb.
American spellings left over from the cleanup (normalized, optimizes,
generalization) and the hyphenated "e-mail" are gone, so the prose is British
throughout and matches "artefact". No number, table, citation or claim changed.
</commit_message>
<xml_diff>
--- a/paper/main.docx
+++ b/paper/main.docx
@@ -390,7 +390,7 @@
           <w:b w:val="0"/>
           <w:i w:val="0"/>
         </w:rPr>
-        <w:t xml:space="preserve">001 attempts, averaging 23 model queries per message. In direct paired comparisons on the exact same messages, the guided attack flips 33 messages that random edits miss, while random edits flip only 7 that guided edits miss (exact McNemar test </w:t>
+        <w:t xml:space="preserve">001 attempts, averaging 23 model queries per message. In paired comparisons on the same messages, the guided attack flips 33 messages that random edits miss, while random edits flip only 7 that guided edits miss (exact McNemar test </w:t>
       </w:r>
       <w:r>
         <w:rPr>
@@ -718,7 +718,7 @@
           <w:b w:val="0"/>
           <w:i w:val="0"/>
         </w:rPr>
-        <w:t>alike characters (such as replacing Latin letters with similar Cyrillic letters), tiny typos, and simple synonyms. The total changes are kept under a strict 15</w:t>
+        <w:t>alike characters (such as replacing Latin letters with similar Cyrillic letters), tiny typos, and simple synonyms. All edits together stay under a strict 15</w:t>
       </w:r>
       <w:r>
         <w:rPr>
@@ -1148,7 +1148,7 @@
           <w:b w:val="0"/>
           <w:i w:val="0"/>
         </w:rPr>
-        <w:t>). Pairing tests on the exact same messages provides an honest comparison.</w:t>
+        <w:t>). Pairing the tests on the same messages provides an honest comparison.</w:t>
       </w:r>
     </w:p>
     <w:p>
@@ -1188,7 +1188,7 @@
           <w:b w:val="0"/>
           <w:i w:val="0"/>
         </w:rPr>
-        <w:t>): Replaying saved text edits across different models flips almost no samples off the diagonal. Transfer rates remain low overall. The edits appear specific to individual models rather than universal. Guided edits transfer slightly better than random edits, but remain ineffective as portable attacks.</w:t>
+        <w:t>): Replaying saved text edits across different models flips almost no samples off the diagonal. Transfer rates remain low overall. The edits appear specific to individual models rather than general. Guided edits transfer slightly better than random edits, but remain ineffective as portable attacks.</w:t>
       </w:r>
     </w:p>
     <w:p>
@@ -1505,7 +1505,7 @@
           <w:b w:val="0"/>
           <w:i w:val="0"/>
         </w:rPr>
-        <w:t>4 on summarized emails</w:t>
+        <w:t>4 on summarised emails</w:t>
       </w:r>
       <w:r>
         <w:rPr>
@@ -1666,7 +1666,7 @@
           <w:b w:val="0"/>
           <w:i w:val="0"/>
         </w:rPr>
-        <w:t>added outside web context to SMS triage inside an agent pipeline and reached 98.8</w:t>
+        <w:t>added external web context to SMS triage inside an agent pipeline and reached 98.8</w:t>
       </w:r>
       <w:r>
         <w:rPr>
@@ -2752,7 +2752,7 @@
           <w:b w:val="0"/>
           <w:i w:val="0"/>
         </w:rPr>
-        <w:t>only adversary is deliberately weak, and for that reason its attack success rate (ASR) is a lower bound. An attacker with weight access, an embedding</w:t>
+        <w:t>only adversary is deliberately weak, and for that reason its ASR is a lower bound. An attacker with weight access, an embedding</w:t>
       </w:r>
       <w:r>
         <w:rPr>
@@ -3009,21 +3009,7 @@
           <w:b w:val="0"/>
           <w:i w:val="0"/>
         </w:rPr>
-        <w:t>s own task description, so an e</w:t>
-      </w:r>
-      <w:r>
-        <w:rPr>
-          <w:b w:val="0"/>
-          <w:i w:val="0"/>
-        </w:rPr>
-        <w:t>-</w:t>
-      </w:r>
-      <w:r>
-        <w:rPr>
-          <w:b w:val="0"/>
-          <w:i w:val="0"/>
-        </w:rPr>
-        <w:t>mail is never scored with the SMS prompt. A baseline</w:t>
+        <w:t>s own task description, so an email is never scored with the SMS prompt. A baseline</w:t>
       </w:r>
       <w:r>
         <w:rPr>
@@ -3113,7 +3099,7 @@
           <w:b w:val="0"/>
           <w:i w:val="0"/>
         </w:rPr>
-        <w:t xml:space="preserve"> while the paper called it 15</w:t>
+        <w:t xml:space="preserve"> while the reported budget was 15</w:t>
       </w:r>
       <w:r>
         <w:rPr>
@@ -3742,7 +3728,7 @@
           <w:b w:val="0"/>
           <w:i w:val="0"/>
         </w:rPr>
-        <w:t>s edited text, verdict, edit count and rate is written to the per</w:t>
+        <w:t>s edited text, verdict, edit count and rate are written to the per</w:t>
       </w:r>
       <w:r>
         <w:rPr>
@@ -4125,7 +4111,7 @@
           <w:b w:val="0"/>
           <w:i w:val="0"/>
         </w:rPr>
-        <w:t xml:space="preserve">Two sorting tasks. </w:t>
+        <w:t xml:space="preserve">We use two sorting tasks. </w:t>
       </w:r>
       <w:r>
         <w:rPr>
@@ -4202,21 +4188,7 @@
           <w:b w:val="0"/>
           <w:i/>
         </w:rPr>
-        <w:t>Phishing e</w:t>
-      </w:r>
-      <w:r>
-        <w:rPr>
-          <w:b w:val="0"/>
-          <w:i/>
-        </w:rPr>
-        <w:t>-</w:t>
-      </w:r>
-      <w:r>
-        <w:rPr>
-          <w:b w:val="0"/>
-          <w:i/>
-        </w:rPr>
-        <w:t>mail</w:t>
+        <w:t>Phishing email</w:t>
       </w:r>
       <w:r>
         <w:rPr>
@@ -4466,7 +4438,7 @@
           <w:b w:val="0"/>
           <w:i w:val="0"/>
         </w:rPr>
-        <w:t>Three open instruction</w:t>
+        <w:t>We evaluate three open instruction</w:t>
       </w:r>
       <w:r>
         <w:rPr>
@@ -4480,7 +4452,7 @@
           <w:b w:val="0"/>
           <w:i w:val="0"/>
         </w:rPr>
-        <w:t>tuned models, none of them compressed at inference: Qwen2.5</w:t>
+        <w:t>tuned models, none compressed at inference: Qwen2.5</w:t>
       </w:r>
       <w:r>
         <w:rPr>
@@ -5022,21 +4994,7 @@
           <w:b/>
           <w:i w:val="0"/>
         </w:rPr>
-        <w:t>mini is a cautious detector on e</w:t>
-      </w:r>
-      <w:r>
-        <w:rPr>
-          <w:b/>
-          <w:i w:val="0"/>
-        </w:rPr>
-        <w:t>-</w:t>
-      </w:r>
-      <w:r>
-        <w:rPr>
-          <w:b/>
-          <w:i w:val="0"/>
-        </w:rPr>
-        <w:t>mail.</w:t>
+        <w:t>mini is a cautious detector on email.</w:t>
       </w:r>
       <w:r>
         <w:rPr>
@@ -5118,21 +5076,7 @@
           <w:b w:val="0"/>
           <w:i w:val="0"/>
         </w:rPr>
-        <w:t xml:space="preserve"> on phishing e</w:t>
-      </w:r>
-      <w:r>
-        <w:rPr>
-          <w:b w:val="0"/>
-          <w:i w:val="0"/>
-        </w:rPr>
-        <w:t>-</w:t>
-      </w:r>
-      <w:r>
-        <w:rPr>
-          <w:b w:val="0"/>
-          <w:i w:val="0"/>
-        </w:rPr>
-        <w:t xml:space="preserve">mail, but its precision is 0.510 and its confusion matrix shows 189 false positives against 11 true negatives on the benign class: it calls nearly every message malicious. A detector that says </w:t>
+        <w:t xml:space="preserve"> on phishing email, but its precision is 0.510 and its confusion matrix shows 189 false positives against 11 true negatives on the benign class: it calls nearly every message malicious. A detector that says </w:t>
       </w:r>
       <w:r>
         <w:rPr>
@@ -5186,21 +5130,7 @@
           <w:b w:val="0"/>
           <w:i w:val="0"/>
         </w:rPr>
-        <w:t>3B is the strongest and most balanced classifier of the three (F1 0.923 on e</w:t>
-      </w:r>
-      <w:r>
-        <w:rPr>
-          <w:b w:val="0"/>
-          <w:i w:val="0"/>
-        </w:rPr>
-        <w:t>-</w:t>
-      </w:r>
-      <w:r>
-        <w:rPr>
-          <w:b w:val="0"/>
-          <w:i w:val="0"/>
-        </w:rPr>
-        <w:t>mail, 0.857 on SMS).</w:t>
+        <w:t>3B is the strongest and most balanced classifier of the three (F1 0.923 on email, 0.857 on SMS).</w:t>
       </w:r>
     </w:p>
     <w:p>
@@ -6802,7 +6732,7 @@
           <w:b w:val="0"/>
           <w:i w:val="0"/>
         </w:rPr>
-        <w:t xml:space="preserve"> budget the mean edit actually spent was 13.3</w:t>
+        <w:t xml:space="preserve"> budget the mean fraction of characters actually edited was 13.3</w:t>
       </w:r>
       <w:r>
         <w:rPr>
@@ -6830,7 +6760,7 @@
           <w:b w:val="0"/>
           <w:i w:val="0"/>
         </w:rPr>
-        <w:t xml:space="preserve"> of characters, with no row above the budget (maximum 13.6</w:t>
+        <w:t>, with no row above the budget (maximum 13.6</w:t>
       </w:r>
       <w:r>
         <w:rPr>
@@ -6884,7 +6814,63 @@
           <w:b w:val="0"/>
           <w:i w:val="0"/>
         </w:rPr>
-        <w:t>mini on phishing e</w:t>
+        <w:t>mini on phishing email: 6 flips in 120 attacked messages, 5.0</w:t>
+      </w:r>
+      <w:r>
+        <w:rPr>
+          <w:b w:val="0"/>
+          <w:i w:val="0"/>
+        </w:rPr>
+        <w:t>%</w:t>
+      </w:r>
+      <w:r>
+        <w:rPr>
+          <w:b w:val="0"/>
+          <w:i w:val="0"/>
+        </w:rPr>
+        <w:t xml:space="preserve"> (95</w:t>
+      </w:r>
+      <w:r>
+        <w:rPr>
+          <w:b w:val="0"/>
+          <w:i w:val="0"/>
+        </w:rPr>
+        <w:t>%</w:t>
+      </w:r>
+      <w:r>
+        <w:rPr>
+          <w:b w:val="0"/>
+          <w:i w:val="0"/>
+        </w:rPr>
+        <w:t xml:space="preserve"> CI 2.3</w:t>
+      </w:r>
+      <w:r>
+        <w:rPr>
+          <w:b w:val="0"/>
+          <w:i w:val="0"/>
+        </w:rPr>
+        <w:t>–</w:t>
+      </w:r>
+      <w:r>
+        <w:rPr>
+          <w:b w:val="0"/>
+          <w:i w:val="0"/>
+        </w:rPr>
+        <w:t>10.5). This is the model with the lowest catch rate on that task. The model that catches 95.5</w:t>
+      </w:r>
+      <w:r>
+        <w:rPr>
+          <w:b w:val="0"/>
+          <w:i w:val="0"/>
+        </w:rPr>
+        <w:t>%</w:t>
+      </w:r>
+      <w:r>
+        <w:rPr>
+          <w:b w:val="0"/>
+          <w:i w:val="0"/>
+        </w:rPr>
+        <w:t xml:space="preserve"> of email (Qwen2.5</w:t>
       </w:r>
       <w:r>
         <w:rPr>
@@ -6898,91 +6884,7 @@
           <w:b w:val="0"/>
           <w:i w:val="0"/>
         </w:rPr>
-        <w:t>mail: 6 flips in 120 attacked messages, 5.0</w:t>
-      </w:r>
-      <w:r>
-        <w:rPr>
-          <w:b w:val="0"/>
-          <w:i w:val="0"/>
-        </w:rPr>
-        <w:t>%</w:t>
-      </w:r>
-      <w:r>
-        <w:rPr>
-          <w:b w:val="0"/>
-          <w:i w:val="0"/>
-        </w:rPr>
-        <w:t xml:space="preserve"> (95</w:t>
-      </w:r>
-      <w:r>
-        <w:rPr>
-          <w:b w:val="0"/>
-          <w:i w:val="0"/>
-        </w:rPr>
-        <w:t>%</w:t>
-      </w:r>
-      <w:r>
-        <w:rPr>
-          <w:b w:val="0"/>
-          <w:i w:val="0"/>
-        </w:rPr>
-        <w:t xml:space="preserve"> CI 2.3</w:t>
-      </w:r>
-      <w:r>
-        <w:rPr>
-          <w:b w:val="0"/>
-          <w:i w:val="0"/>
-        </w:rPr>
-        <w:t>–</w:t>
-      </w:r>
-      <w:r>
-        <w:rPr>
-          <w:b w:val="0"/>
-          <w:i w:val="0"/>
-        </w:rPr>
-        <w:t>10.5). This is the model with the lowest catch rate on that task. The model that catches 95.5</w:t>
-      </w:r>
-      <w:r>
-        <w:rPr>
-          <w:b w:val="0"/>
-          <w:i w:val="0"/>
-        </w:rPr>
-        <w:t>%</w:t>
-      </w:r>
-      <w:r>
-        <w:rPr>
-          <w:b w:val="0"/>
-          <w:i w:val="0"/>
-        </w:rPr>
-        <w:t xml:space="preserve"> of e</w:t>
-      </w:r>
-      <w:r>
-        <w:rPr>
-          <w:b w:val="0"/>
-          <w:i w:val="0"/>
-        </w:rPr>
-        <w:t>-</w:t>
-      </w:r>
-      <w:r>
-        <w:rPr>
-          <w:b w:val="0"/>
-          <w:i w:val="0"/>
-        </w:rPr>
-        <w:t>mail (Qwen2.5</w:t>
-      </w:r>
-      <w:r>
-        <w:rPr>
-          <w:b w:val="0"/>
-          <w:i w:val="0"/>
-        </w:rPr>
-        <w:t>-</w:t>
-      </w:r>
-      <w:r>
-        <w:rPr>
-          <w:b w:val="0"/>
-          <w:i w:val="0"/>
-        </w:rPr>
-        <w:t>3B) flips once in 191 attacks, and on SMS it flips zero times in 188 attempts. A zero is reported as a bounded measurement, not as a proof: the Wilson upper bound for that row is 2.0</w:t>
+        <w:t>3B) flips once in 191 attacks, and on SMS it flips zero times in 188 attempts. A zero is reported as a bounded measurement, not as proof: the Wilson upper bound for that row is 2.0</w:t>
       </w:r>
       <w:r>
         <w:rPr>
@@ -10959,7 +10861,7 @@
           <w:b w:val="0"/>
           <w:i w:val="0"/>
         </w:rPr>
-        <w:t xml:space="preserve"> draws the same accounting instead of summing it: one point per model, task and attack, with the budget spent on the horizontal axis. Both modes stay inside the shared budget, and the word attack reaches a similar number of flips with about half the share of units changed. That imbalance is the paper</w:t>
+        <w:t xml:space="preserve"> draws the same accounting instead of summing it: one point per model, task and attack, with the budget spent on the horizontal axis. Both modes stay inside the shared budget, and the word attack reaches a similar number of flips with about half the units changed. That imbalance is the paper</w:t>
       </w:r>
       <w:r>
         <w:rPr>
@@ -11648,7 +11550,7 @@
           <w:i/>
           <w:sz w:val="18"/>
         </w:rPr>
-        <w:t xml:space="preserve"> Wilson interval on the vertical one. The dotted line is the 15</w:t>
+        <w:t xml:space="preserve"> Wilson interval on the vertical axis. The dotted line is the 15</w:t>
       </w:r>
       <w:r>
         <w:rPr>
@@ -12288,7 +12190,7 @@
           <w:b w:val="0"/>
           <w:i w:val="0"/>
         </w:rPr>
-        <w:t>constant rule seen in the baseline table: an edit has little score to move, so the model looks robust in the sense that a deployment cares about only by accident.</w:t>
+        <w:t>constant rule seen in the baseline table: an edit has little score to move, so the model can look robust, in the sense a deployment cares about, only by accident.</w:t>
       </w:r>
     </w:p>
     <w:p>
@@ -12355,7 +12257,21 @@
           <w:b w:val="0"/>
           <w:i w:val="0"/>
         </w:rPr>
-        <w:t>Because the flip counts are small, we do not rank models on point estimates. Of the twelve pairs of rows sharing a task and one of the two random attack modes, 9 of 12 have intervals that overlap by more than half the narrower interval, so within</w:t>
+        <w:t>Because the flip counts are small, we do not rank models on point estimates. Of the twelve pairs of rows sharing a task and one of the two random attack modes, 9 of 12 have intervals that overlap by more than half the narrower interval</w:t>
+      </w:r>
+      <w:r>
+        <w:rPr>
+          <w:b w:val="0"/>
+          <w:i w:val="0"/>
+        </w:rPr>
+        <w:t>’</w:t>
+      </w:r>
+      <w:r>
+        <w:rPr>
+          <w:b w:val="0"/>
+          <w:i w:val="0"/>
+        </w:rPr>
+        <w:t>s width, so within</w:t>
       </w:r>
       <w:r>
         <w:rPr>
@@ -12397,21 +12313,7 @@
           <w:b w:val="0"/>
           <w:i w:val="0"/>
         </w:rPr>
-        <w:t>mini on phishing e</w:t>
-      </w:r>
-      <w:r>
-        <w:rPr>
-          <w:b w:val="0"/>
-          <w:i w:val="0"/>
-        </w:rPr>
-        <w:t>-</w:t>
-      </w:r>
-      <w:r>
-        <w:rPr>
-          <w:b w:val="0"/>
-          <w:i w:val="0"/>
-        </w:rPr>
-        <w:t>mail, and the two with the least overlap are the same comparison from both sides: under the character attack, Phi</w:t>
+        <w:t>mini on phishing email, and the two with the least overlap are the same comparison from both sides: under the character attack, Phi</w:t>
       </w:r>
       <w:r>
         <w:rPr>
@@ -12847,7 +12749,7 @@
           <w:b w:val="0"/>
           <w:i w:val="0"/>
         </w:rPr>
-        <w:t xml:space="preserve"> over the pooled discordant counts). Per cell, 1 of 6 show a significant paired difference at </w:t>
+        <w:t xml:space="preserve"> over the pooled discordant counts). Per cell, 1 of 6 shows a significant paired difference at </w:t>
       </w:r>
       <w:r>
         <w:rPr>
@@ -16268,21 +16170,7 @@
           <w:b w:val="0"/>
           <w:i w:val="0"/>
         </w:rPr>
-        <w:t xml:space="preserve"> picks its replacement at random from a small synonym table. It answers </w:t>
-      </w:r>
-      <w:r>
-        <w:rPr>
-          <w:b w:val="0"/>
-          <w:i w:val="0"/>
-        </w:rPr>
-        <w:t>“</w:t>
-      </w:r>
-      <w:r>
-        <w:rPr>
-          <w:b w:val="0"/>
-          <w:i w:val="0"/>
-        </w:rPr>
-        <w:t xml:space="preserve">does </w:t>
+        <w:t xml:space="preserve"> picks its replacement at random from a small synonym table. It answers only whether </w:t>
       </w:r>
       <w:r>
         <w:rPr>
@@ -16310,21 +16198,7 @@
           <w:b w:val="0"/>
           <w:i w:val="0"/>
         </w:rPr>
-        <w:t>level edit break the model</w:t>
-      </w:r>
-      <w:r>
-        <w:rPr>
-          <w:b w:val="0"/>
-          <w:i w:val="0"/>
-        </w:rPr>
-        <w:t>”</w:t>
-      </w:r>
-      <w:r>
-        <w:rPr>
-          <w:b w:val="0"/>
-          <w:i w:val="0"/>
-        </w:rPr>
-        <w:t xml:space="preserve"> and leaves the location of the weakness unmeasured: a flip caused by deleting the word </w:t>
+        <w:t xml:space="preserve">level edit breaks the model, and leaves the location of the weakness unmeasured: a flip caused by deleting the word </w:t>
       </w:r>
       <w:r>
         <w:rPr>
@@ -16863,7 +16737,7 @@
           <w:b w:val="0"/>
           <w:i w:val="0"/>
         </w:rPr>
-        <w:t xml:space="preserve"> is not only for appearance. With raw saliency and </w:t>
+        <w:t xml:space="preserve"> matters. With raw saliency and </w:t>
       </w:r>
       <w:r>
         <w:rPr>
@@ -17944,7 +17818,7 @@
           <w:b w:val="0"/>
           <w:i w:val="0"/>
         </w:rPr>
-        <w:t xml:space="preserve">ordered substitution over a security vocabulary breaks more messages per unit of edit than a random draw over a small table. It does not show that ordering alone is responsible, and it cannot say what the probability access is worth. </w:t>
+        <w:t xml:space="preserve">ordered substitution over a security vocabulary breaks more messages per unit of edit than a random draw over a small table. It does not show that ordering alone is responsible, and it cannot say what the probability channel is worth. </w:t>
       </w:r>
       <w:r>
         <w:rPr>
@@ -21362,7 +21236,7 @@
           <w:b w:val="0"/>
           <w:i w:val="0"/>
         </w:rPr>
-        <w:t>, and run; its contrasts are Table</w:t>
+        <w:t>, and run; its contrasts are tabulated in Table</w:t>
       </w:r>
       <w:r>
         <w:rPr>
@@ -21383,7 +21257,7 @@
           <w:b w:val="0"/>
           <w:i w:val="0"/>
         </w:rPr>
-        <w:t xml:space="preserve"> and the paragraph that discusses it, both generated from </w:t>
+        <w:t xml:space="preserve"> and described in the paragraph that follows, both generated from </w:t>
       </w:r>
       <w:r>
         <w:rPr>
@@ -21476,55 +21350,27 @@
           <w:b w:val="0"/>
           <w:i w:val="0"/>
         </w:rPr>
-        <w:t xml:space="preserve"> so one arm differs from another only in policy. The probe results are retained and only the </w:t>
+        <w:t xml:space="preserve"> so one arm differs from another only in policy: what it does with those measurements. Matching the budget by construction rather than by assumption is the point: a random</w:t>
+      </w:r>
+      <w:r>
+        <w:rPr>
+          <w:b w:val="0"/>
+          <w:i w:val="0"/>
+        </w:rPr>
+        <w:t>-</w:t>
+      </w:r>
+      <w:r>
+        <w:rPr>
+          <w:b w:val="0"/>
+          <w:i w:val="0"/>
+        </w:rPr>
+        <w:t xml:space="preserve">order arm pays exactly the 1 + </w:t>
       </w:r>
       <w:r>
         <w:rPr>
           <w:b w:val="0"/>
           <w:i/>
         </w:rPr>
-        <w:t>policy</w:t>
-      </w:r>
-      <w:r>
-        <w:rPr>
-          <w:b w:val="0"/>
-          <w:i w:val="0"/>
-        </w:rPr>
-        <w:t xml:space="preserve"> differs </w:t>
-      </w:r>
-      <w:r>
-        <w:rPr>
-          <w:b w:val="0"/>
-          <w:i w:val="0"/>
-        </w:rPr>
-        <w:t>—</w:t>
-      </w:r>
-      <w:r>
-        <w:rPr>
-          <w:b w:val="0"/>
-          <w:i w:val="0"/>
-        </w:rPr>
-        <w:t xml:space="preserve"> what the arm does with those measurements. Matching the budget by construction rather than by assumption is the point: a random</w:t>
-      </w:r>
-      <w:r>
-        <w:rPr>
-          <w:b w:val="0"/>
-          <w:i w:val="0"/>
-        </w:rPr>
-        <w:t>-</w:t>
-      </w:r>
-      <w:r>
-        <w:rPr>
-          <w:b w:val="0"/>
-          <w:i w:val="0"/>
-        </w:rPr>
-        <w:t xml:space="preserve">order arm pays exactly the 1 + </w:t>
-      </w:r>
-      <w:r>
-        <w:rPr>
-          <w:b w:val="0"/>
-          <w:i/>
-        </w:rPr>
         <w:t>|C|</w:t>
       </w:r>
       <w:r>
@@ -21532,7 +21378,7 @@
           <w:b w:val="0"/>
           <w:i w:val="0"/>
         </w:rPr>
-        <w:t xml:space="preserve"> calls a saliency arm pays before either starts substituting, so a difference in flips cannot be a difference in cost. The realised count is still stored per row, because a cap that is matched on paper and used up early in practice would be the same error as an unmatched total.</w:t>
+        <w:t xml:space="preserve"> calls that a saliency arm pays before either starts substituting, so a difference in flips cannot be a difference in cost. The realised count is still stored per row, because a cap that is matched on paper and used up early in practice would be the same error as an unmatched total.</w:t>
       </w:r>
     </w:p>
     <w:p>
@@ -24024,7 +23870,35 @@
           <w:b w:val="0"/>
           <w:i w:val="0"/>
         </w:rPr>
-        <w:t>s two rows is vocabulary, not intelligence, so the unmatched comparison overstates what ordering buys. The probability channel, the thing a saliency attack is supposed to need, is the weakest of the three: an attacker holding only the one</w:t>
+        <w:t xml:space="preserve">s two rows is vocabulary, not intelligence, so the unmatched comparison overstates what ordering buys. The probability channel </w:t>
+      </w:r>
+      <w:r>
+        <w:rPr>
+          <w:b w:val="0"/>
+          <w:i w:val="0"/>
+        </w:rPr>
+        <w:t>—</w:t>
+      </w:r>
+      <w:r>
+        <w:rPr>
+          <w:b w:val="0"/>
+          <w:i w:val="0"/>
+        </w:rPr>
+        <w:t xml:space="preserve"> the thing a saliency attack is supposed to need </w:t>
+      </w:r>
+      <w:r>
+        <w:rPr>
+          <w:b w:val="0"/>
+          <w:i w:val="0"/>
+        </w:rPr>
+        <w:t>—</w:t>
+      </w:r>
+      <w:r>
+        <w:rPr>
+          <w:b w:val="0"/>
+          <w:i w:val="0"/>
+        </w:rPr>
+        <w:t xml:space="preserve"> is the weakest of the three: an attacker holding only the one</w:t>
       </w:r>
       <w:r>
         <w:rPr>
@@ -24038,7 +23912,7 @@
           <w:b w:val="0"/>
           <w:i w:val="0"/>
         </w:rPr>
-        <w:t>bit verdict loses messages in one direction and wins a few in the other, and the difference does not reach significance at this sample size. Searching subsets instead of ranking recovers a handful of the messages that bit costs, which is what the theory predicts, because one bit cannot rank.</w:t>
+        <w:t>bit verdict loses messages in one direction and wins a few in the other, and the difference does not reach significance at this sample size. Searching subsets instead of ranking recovers a handful of the messages that the bit costs, which is what the theory predicts, because one bit cannot rank.</w:t>
       </w:r>
     </w:p>
     <w:p>
@@ -24196,7 +24070,7 @@
           <w:b w:val="0"/>
           <w:i w:val="0"/>
         </w:rPr>
-        <w:t xml:space="preserve"> model cost an attacker who can query it. That is the right question for a targeted campaign and the wrong one for a defender choosing a model, because an attacker who cannot query the deployed model will instead build perturbations against something they can download. Whether those perturbations survive the move decides whether the weakness measured in </w:t>
+        <w:t xml:space="preserve"> model cost an attacker who can query it. That is the right question for a targeted campaign and the wrong one for a defender choosing a model, because an attacker who cannot query the deployed model will instead build perturbations against something they can download. If those perturbations do not survive the move, the weakness measured in </w:t>
       </w:r>
       <w:r>
         <w:rPr>
@@ -24217,7 +24091,7 @@
           <w:b w:val="0"/>
           <w:i w:val="0"/>
         </w:rPr>
-        <w:t xml:space="preserve"> belongs to the task or only to three specific checkpoints.</w:t>
+        <w:t xml:space="preserve"> belongs to three specific checkpoints rather than to the task.</w:t>
       </w:r>
     </w:p>
     <w:p>
@@ -24713,7 +24587,7 @@
           <w:b w:val="0"/>
           <w:i w:val="0"/>
         </w:rPr>
-        <w:t>diagonal cells have a nonzero transfer rate, and every cell has a denominator worth an interval. Among the cells with a denominator worth an interval, the highest rate is SmolLM2</w:t>
+        <w:t>diagonal cells have a nonzero transfer rate, and every cell has a denominator worth an interval. Among the cells with at least ten caught originals, the highest rate is SmolLM2</w:t>
       </w:r>
       <w:r>
         <w:rPr>
@@ -34233,7 +34107,7 @@
           <w:b w:val="0"/>
           <w:i w:val="0"/>
         </w:rPr>
-        <w:t>normalised (a standard Unicode cleanup), invisible and format characters are removed, Cyrillic and Greek look</w:t>
+        <w:t>normalised (a standard Unicode cleanup); invisible and format characters are removed; Cyrillic and Greek look</w:t>
       </w:r>
       <w:r>
         <w:rPr>
@@ -34247,7 +34121,7 @@
           <w:b w:val="0"/>
           <w:i w:val="0"/>
         </w:rPr>
-        <w:t>alike characters are folded back to their ASCII equivalents, and whitespace is collapsed. This targets exactly the mechanism of the character attack: the model sees a different token where a human sees the same word. It should therefore rescue character</w:t>
+        <w:t>alike characters are folded back to their ASCII equivalents; and whitespace is collapsed. This targets exactly the mechanism of the character attack: the model sees a different token where a human sees the same word. It should therefore rescue character</w:t>
       </w:r>
       <w:r>
         <w:rPr>
@@ -34632,7 +34506,7 @@
           <w:b w:val="0"/>
           <w:i w:val="0"/>
         </w:rPr>
-        <w:t xml:space="preserve">, and counting a flip whenever an edited text falls below </w:t>
+        <w:t xml:space="preserve"> and counting a flip whenever an edited text falls below </w:t>
       </w:r>
       <w:r>
         <w:rPr>
@@ -34646,7 +34520,7 @@
           <w:b w:val="0"/>
           <w:i w:val="0"/>
         </w:rPr>
-        <w:t xml:space="preserve"> without asking whether the original was above it, reports a 100</w:t>
+        <w:t>, without asking whether the original was above it, reported a 100</w:t>
       </w:r>
       <w:r>
         <w:rPr>
@@ -34722,7 +34596,7 @@
           <w:b w:val="0"/>
           <w:i w:val="0"/>
         </w:rPr>
-        <w:t>Three outcomes are possible and all three are informative: a defence that removes the flips it targets (D1 against the character attack), a defence that removes none (D1 against a word attack it cannot see), and a defence that trades a small amount of clean precision for a large reduction in evasions (D2). What we do not do is report a defence at a different operating point than the baseline and call the difference robustness.</w:t>
+        <w:t>Three outcomes are possible and all three are informative: a defence that removes the flips it targets (D1 against the character attack), a defence that removes none (D1 against a word attack it cannot see), and a defence that trades a small amount of clean precision for a large reduction in evasions (D2). What we do not do is report a defence at a different operating point from the baseline and call the difference robustness.</w:t>
       </w:r>
     </w:p>
     <w:p>
@@ -36212,7 +36086,7 @@
           <w:b w:val="0"/>
           <w:i w:val="0"/>
         </w:rPr>
-        <w:t>Some readers might view an Attack Success Rate (ASR) of 0.0</w:t>
+        <w:t>Some readers might view an attack success rate of 0.0</w:t>
       </w:r>
       <w:r>
         <w:rPr>
@@ -36675,7 +36549,7 @@
           <w:b w:val="0"/>
           <w:i w:val="0"/>
         </w:rPr>
-        <w:t>). Normalized by edit rate, its advantage is roughly 1.4 times rather than 1.7 times. Thus, vulnerability is concentrated in specific tokens. This finding is useful for defenders because targeted words can be filtered. It also warns against taking random perturbation rates as proof of general robustness.</w:t>
+        <w:t>). Normalised by edit rate, its advantage is roughly 1.4 times rather than 1.7 times. Thus, vulnerability is concentrated in specific tokens. This finding is useful for defenders because targeted words can be filtered. It also warns against taking random perturbation rates as proof of general robustness.</w:t>
       </w:r>
     </w:p>
     <w:p>
@@ -36861,7 +36735,7 @@
           <w:b w:val="0"/>
           <w:i w:val="0"/>
         </w:rPr>
-        <w:t xml:space="preserve">The saliency attack requires continuous scores, so it optimizes the predicted probability </w:t>
+        <w:t xml:space="preserve">The saliency attack requires continuous scores, so it optimises the predicted probability </w:t>
       </w:r>
       <w:r>
         <w:rPr>
@@ -37145,7 +37019,7 @@
           <w:b w:val="0"/>
           <w:i w:val="0"/>
         </w:rPr>
-        <w:t>zero, 27 of 31 cells hold fewer than ten caught originals, and every non</w:t>
+        <w:t>zero; 27 of the 31 hold fewer than ten caught originals; and every non</w:t>
       </w:r>
       <w:r>
         <w:rPr>
@@ -37684,7 +37558,7 @@
           <w:b w:val="0"/>
           <w:i w:val="0"/>
         </w:rPr>
-        <w:t xml:space="preserve"> isolates vocabulary, ordering, and oracle effects across five arms. The reported contrasts in Table</w:t>
+        <w:t xml:space="preserve"> isolates vocabulary, ordering and information effects across five arms. The reported contrasts in Table</w:t>
       </w:r>
       <w:r>
         <w:rPr>
@@ -37980,7 +37854,7 @@
           <w:b w:val="0"/>
           <w:i w:val="0"/>
         </w:rPr>
-        <w:t>distribution generalization.</w:t>
+        <w:t>distribution generalisation.</w:t>
       </w:r>
     </w:p>
     <w:p>
@@ -38987,7 +38861,7 @@
           <w:b w:val="0"/>
           <w:i w:val="0"/>
         </w:rPr>
-        <w:t>sample attack records (including every perturbed text), both verdict channels for the saliency rows, the transfer replays, the threshold fits, the table</w:t>
+        <w:t>sample attack records (including every perturbed text), both channels for the saliency rows, the transfer replays, the threshold fits, the table</w:t>
       </w:r>
       <w:r>
         <w:rPr>
@@ -39320,7 +39194,7 @@
           <w:b w:val="0"/>
           <w:i w:val="0"/>
         </w:rPr>
-        <w:t>). This result is not on the same messages or from the same candidate vocabulary. Once we account for the higher budget actually spent, the factor is 1.4, not 1.7. The search, the candidates, and the denominator must all be named in the claim. Second, at this budget the binding constraint on a small triage model is what it catches before any attack. What orders the flip rate is not accuracy and not the measured margin: the model that flips most is neither the least accurate nor the closest to its threshold, and its probability channel saturates, so the margin cannot be read on it at all. The model that catches almost everything is immovable because its decision rule is nearly constant. Detection quality, not adversarial robustness, is where deployment effort pays first. Third, cheap defences split cleanly. Normalising visually confusable characters removes every character</w:t>
+        <w:t>). That comparison is not on the same messages, nor from the same candidate vocabulary. Once we account for the higher budget actually spent, the factor is 1.4, not 1.7. The search, the candidates, and the denominator must all be named in the claim. Second, at this budget the binding constraint on a small triage model is what it catches before any attack. What orders the flip rate is neither accuracy nor the measured margin: the model that flips most is neither the least accurate nor the closest to its threshold, and its probability channel saturates, so the margin cannot be read on it at all. The model that catches almost everything is immovable because its decision rule is nearly constant. Detection quality, not adversarial robustness, is where deployment effort pays first. Third, cheap defences split cleanly. Normalising visually confusable characters removes every character</w:t>
       </w:r>
       <w:r>
         <w:rPr>
@@ -39458,7 +39332,28 @@
           <w:b w:val="0"/>
           <w:i w:val="0"/>
         </w:rPr>
-        <w:t>001 rows. They diverged systematically on two of three models. A single channel is not a measurement until it is checked against the other. Every tool in this paper reports its denominator, its interval, and the bugs we fixed in our own pipeline. Each bug silently inflated the attack success rate in the direction that makes a paper look interesting.</w:t>
+        <w:t xml:space="preserve">001 rows. They diverged systematically on two of three models. A single channel is not a measurement until it is checked against the other. Every result in this paper reports its denominator and its interval, and </w:t>
+      </w:r>
+      <w:r>
+        <w:rPr>
+          <w:b w:val="0"/>
+          <w:i w:val="0"/>
+        </w:rPr>
+        <w:t>§</w:t>
+      </w:r>
+      <w:r>
+        <w:rPr>
+          <w:b w:val="0"/>
+          <w:i w:val="0"/>
+        </w:rPr>
+        <w:t>10</w:t>
+      </w:r>
+      <w:r>
+        <w:rPr>
+          <w:b w:val="0"/>
+          <w:i w:val="0"/>
+        </w:rPr>
+        <w:t xml:space="preserve"> lists the bugs we fixed in our own pipeline. Each bug silently inflated the attack success rate in the direction that makes a paper look interesting.</w:t>
       </w:r>
     </w:p>
     <w:p>

</xml_diff>

<commit_message>
Spell out cross-references as "Section N" instead of the section sign.
Some venues and Word-based reviewers mishandle the section sign, so the paper
now reads "Section 5.5" everywhere; hyphenation is pinned so the word itself
never breaks across a line as "Sec-tion".
</commit_message>
<xml_diff>
--- a/paper/main.docx
+++ b/paper/main.docx
@@ -856,14 +856,14 @@
           <w:b w:val="0"/>
           <w:i w:val="0"/>
         </w:rPr>
-        <w:t xml:space="preserve"> (</w:t>
-      </w:r>
-      <w:r>
-        <w:rPr>
-          <w:b w:val="0"/>
-          <w:i w:val="0"/>
-        </w:rPr>
-        <w:t>§</w:t>
+        <w:t xml:space="preserve"> (Section</w:t>
+      </w:r>
+      <w:r>
+        <w:rPr>
+          <w:b w:val="0"/>
+          <w:i w:val="0"/>
+        </w:rPr>
+        <w:t xml:space="preserve"> </w:t>
       </w:r>
       <w:r>
         <w:rPr>
@@ -910,14 +910,14 @@
           <w:b w:val="0"/>
           <w:i w:val="0"/>
         </w:rPr>
-        <w:t xml:space="preserve"> (</w:t>
-      </w:r>
-      <w:r>
-        <w:rPr>
-          <w:b w:val="0"/>
-          <w:i w:val="0"/>
-        </w:rPr>
-        <w:t>§</w:t>
+        <w:t xml:space="preserve"> (Section</w:t>
+      </w:r>
+      <w:r>
+        <w:rPr>
+          <w:b w:val="0"/>
+          <w:i w:val="0"/>
+        </w:rPr>
+        <w:t xml:space="preserve"> </w:t>
       </w:r>
       <w:r>
         <w:rPr>
@@ -959,14 +959,14 @@
           <w:b w:val="0"/>
           <w:i w:val="0"/>
         </w:rPr>
-        <w:t xml:space="preserve">047 model queries gave 40 decision flips under the two random attacks; the guided attack has its own totals in </w:t>
-      </w:r>
-      <w:r>
-        <w:rPr>
-          <w:b w:val="0"/>
-          <w:i w:val="0"/>
-        </w:rPr>
-        <w:t>§</w:t>
+        <w:t>047 model queries gave 40 decision flips under the two random attacks; the guided attack has its own totals in Section</w:t>
+      </w:r>
+      <w:r>
+        <w:rPr>
+          <w:b w:val="0"/>
+          <w:i w:val="0"/>
+        </w:rPr>
+        <w:t xml:space="preserve"> </w:t>
       </w:r>
       <w:r>
         <w:rPr>
@@ -1055,14 +1055,14 @@
           <w:b w:val="0"/>
           <w:i w:val="0"/>
         </w:rPr>
-        <w:t xml:space="preserve"> (</w:t>
-      </w:r>
-      <w:r>
-        <w:rPr>
-          <w:b w:val="0"/>
-          <w:i w:val="0"/>
-        </w:rPr>
-        <w:t>§</w:t>
+        <w:t xml:space="preserve"> (Section</w:t>
+      </w:r>
+      <w:r>
+        <w:rPr>
+          <w:b w:val="0"/>
+          <w:i w:val="0"/>
+        </w:rPr>
+        <w:t xml:space="preserve"> </w:t>
       </w:r>
       <w:r>
         <w:rPr>
@@ -1167,14 +1167,14 @@
           <w:b w:val="0"/>
           <w:i w:val="0"/>
         </w:rPr>
-        <w:t xml:space="preserve"> (</w:t>
-      </w:r>
-      <w:r>
-        <w:rPr>
-          <w:b w:val="0"/>
-          <w:i w:val="0"/>
-        </w:rPr>
-        <w:t>§</w:t>
+        <w:t xml:space="preserve"> (Section</w:t>
+      </w:r>
+      <w:r>
+        <w:rPr>
+          <w:b w:val="0"/>
+          <w:i w:val="0"/>
+        </w:rPr>
+        <w:t xml:space="preserve"> </w:t>
       </w:r>
       <w:r>
         <w:rPr>
@@ -1207,14 +1207,14 @@
           <w:b w:val="0"/>
           <w:i w:val="0"/>
         </w:rPr>
-        <w:t xml:space="preserve"> (</w:t>
-      </w:r>
-      <w:r>
-        <w:rPr>
-          <w:b w:val="0"/>
-          <w:i w:val="0"/>
-        </w:rPr>
-        <w:t>§</w:t>
+        <w:t xml:space="preserve"> (Section</w:t>
+      </w:r>
+      <w:r>
+        <w:rPr>
+          <w:b w:val="0"/>
+          <w:i w:val="0"/>
+        </w:rPr>
+        <w:t xml:space="preserve"> </w:t>
       </w:r>
       <w:r>
         <w:rPr>
@@ -1295,14 +1295,14 @@
           <w:b w:val="0"/>
           <w:i w:val="0"/>
         </w:rPr>
-        <w:t>box attacks with full access to model internal weights, nor do we evaluate adaptive attackers who know the defence beforehand. Our saliency attack selects words using model feedback, but it also uses a larger dictionary than the random word baseline. Therefore, the gap between them is not due to word ordering alone (</w:t>
-      </w:r>
-      <w:r>
-        <w:rPr>
-          <w:b w:val="0"/>
-          <w:i w:val="0"/>
-        </w:rPr>
-        <w:t>§</w:t>
+        <w:t>box attacks with full access to model internal weights, nor do we evaluate adaptive attackers who know the defence beforehand. Our saliency attack selects words using model feedback, but it also uses a larger dictionary than the random word baseline. Therefore, the gap between them is not due to word ordering alone (Section</w:t>
+      </w:r>
+      <w:r>
+        <w:rPr>
+          <w:b w:val="0"/>
+          <w:i w:val="0"/>
+        </w:rPr>
+        <w:t xml:space="preserve"> </w:t>
       </w:r>
       <w:r>
         <w:rPr>
@@ -1316,14 +1316,14 @@
           <w:b w:val="0"/>
           <w:i w:val="0"/>
         </w:rPr>
-        <w:t xml:space="preserve">). An ablation study in </w:t>
-      </w:r>
-      <w:r>
-        <w:rPr>
-          <w:b w:val="0"/>
-          <w:i w:val="0"/>
-        </w:rPr>
-        <w:t>§</w:t>
+        <w:t>). An ablation study in Section</w:t>
+      </w:r>
+      <w:r>
+        <w:rPr>
+          <w:b w:val="0"/>
+          <w:i w:val="0"/>
+        </w:rPr>
+        <w:t xml:space="preserve"> </w:t>
       </w:r>
       <w:r>
         <w:rPr>
@@ -2077,14 +2077,14 @@
           <w:b w:val="0"/>
           <w:i w:val="0"/>
         </w:rPr>
-        <w:t>. We test two search strengths. The first picks a synonym at random from a small table; it stands for a simple attacker and gives a lower bound on evasion. The second ranks word swaps by their measured effect on the model (</w:t>
-      </w:r>
-      <w:r>
-        <w:rPr>
-          <w:b w:val="0"/>
-          <w:i w:val="0"/>
-        </w:rPr>
-        <w:t>§</w:t>
+        <w:t>. We test two search strengths. The first picks a synonym at random from a small table; it stands for a simple attacker and gives a lower bound on evasion. The second ranks word swaps by their measured effect on the model (Section</w:t>
+      </w:r>
+      <w:r>
+        <w:rPr>
+          <w:b w:val="0"/>
+          <w:i w:val="0"/>
+        </w:rPr>
+        <w:t xml:space="preserve"> </w:t>
       </w:r>
       <w:r>
         <w:rPr>
@@ -2098,14 +2098,14 @@
           <w:b w:val="0"/>
           <w:i w:val="0"/>
         </w:rPr>
-        <w:t xml:space="preserve">), and we call it the guided attack. In </w:t>
-      </w:r>
-      <w:r>
-        <w:rPr>
-          <w:b w:val="0"/>
-          <w:i w:val="0"/>
-        </w:rPr>
-        <w:t>§</w:t>
+        <w:t>), and we call it the guided attack. In Section</w:t>
+      </w:r>
+      <w:r>
+        <w:rPr>
+          <w:b w:val="0"/>
+          <w:i w:val="0"/>
+        </w:rPr>
+        <w:t xml:space="preserve"> </w:t>
       </w:r>
       <w:r>
         <w:rPr>
@@ -2265,14 +2265,14 @@
           <w:b w:val="0"/>
           <w:i w:val="0"/>
         </w:rPr>
-        <w:t xml:space="preserve">model transfer matrix in </w:t>
-      </w:r>
-      <w:r>
-        <w:rPr>
-          <w:b w:val="0"/>
-          <w:i w:val="0"/>
-        </w:rPr>
-        <w:t>§</w:t>
+        <w:t>model transfer matrix in Section</w:t>
+      </w:r>
+      <w:r>
+        <w:rPr>
+          <w:b w:val="0"/>
+          <w:i w:val="0"/>
+        </w:rPr>
+        <w:t xml:space="preserve"> </w:t>
       </w:r>
       <w:r>
         <w:rPr>
@@ -2558,14 +2558,14 @@
           <w:b w:val="0"/>
           <w:i w:val="0"/>
         </w:rPr>
-        <w:t>word attacks (</w:t>
-      </w:r>
-      <w:r>
-        <w:rPr>
-          <w:b w:val="0"/>
-          <w:i w:val="0"/>
-        </w:rPr>
-        <w:t>§</w:t>
+        <w:t>word attacks (Section</w:t>
+      </w:r>
+      <w:r>
+        <w:rPr>
+          <w:b w:val="0"/>
+          <w:i w:val="0"/>
+        </w:rPr>
+        <w:t xml:space="preserve"> </w:t>
       </w:r>
       <w:r>
         <w:rPr>
@@ -2663,14 +2663,14 @@
           <w:b w:val="0"/>
           <w:i w:val="0"/>
         </w:rPr>
-        <w:t>guided attack uses it (</w:t>
-      </w:r>
-      <w:r>
-        <w:rPr>
-          <w:b w:val="0"/>
-          <w:i w:val="0"/>
-        </w:rPr>
-        <w:t>§</w:t>
+        <w:t>guided attack uses it (Section</w:t>
+      </w:r>
+      <w:r>
+        <w:rPr>
+          <w:b w:val="0"/>
+          <w:i w:val="0"/>
+        </w:rPr>
+        <w:t xml:space="preserve"> </w:t>
       </w:r>
       <w:r>
         <w:rPr>
@@ -2684,14 +2684,14 @@
           <w:b w:val="0"/>
           <w:i w:val="0"/>
         </w:rPr>
-        <w:t>), because a ranking needs a number and one bit per candidate cannot give one. Every row in every table records which channel produced it, the two channels are never mixed inside one comparison, and the disagreement between them is reported on its own (</w:t>
-      </w:r>
-      <w:r>
-        <w:rPr>
-          <w:b w:val="0"/>
-          <w:i w:val="0"/>
-        </w:rPr>
-        <w:t>§</w:t>
+        <w:t>), because a ranking needs a number and one bit per candidate cannot give one. Every row in every table records which channel produced it, the two channels are never mixed inside one comparison, and the disagreement between them is reported on its own (Section</w:t>
+      </w:r>
+      <w:r>
+        <w:rPr>
+          <w:b w:val="0"/>
+          <w:i w:val="0"/>
+        </w:rPr>
+        <w:t xml:space="preserve"> </w:t>
       </w:r>
       <w:r>
         <w:rPr>
@@ -2705,14 +2705,14 @@
           <w:b w:val="0"/>
           <w:i w:val="0"/>
         </w:rPr>
-        <w:t xml:space="preserve">). The ablation of </w:t>
-      </w:r>
-      <w:r>
-        <w:rPr>
-          <w:b w:val="0"/>
-          <w:i w:val="0"/>
-        </w:rPr>
-        <w:t>§</w:t>
+        <w:t>). The ablation of Section</w:t>
+      </w:r>
+      <w:r>
+        <w:rPr>
+          <w:b w:val="0"/>
+          <w:i w:val="0"/>
+        </w:rPr>
+        <w:t xml:space="preserve"> </w:t>
       </w:r>
       <w:r>
         <w:rPr>
@@ -2912,14 +2912,14 @@
           <w:b w:val="0"/>
           <w:i w:val="0"/>
         </w:rPr>
-        <w:t xml:space="preserve">3B, a channel problem discussed in </w:t>
-      </w:r>
-      <w:r>
-        <w:rPr>
-          <w:b w:val="0"/>
-          <w:i w:val="0"/>
-        </w:rPr>
-        <w:t>§</w:t>
+        <w:t>3B, a channel problem discussed in Section</w:t>
+      </w:r>
+      <w:r>
+        <w:rPr>
+          <w:b w:val="0"/>
+          <w:i w:val="0"/>
+        </w:rPr>
+        <w:t xml:space="preserve"> </w:t>
       </w:r>
       <w:r>
         <w:rPr>
@@ -4062,14 +4062,14 @@
           <w:b w:val="0"/>
           <w:i w:val="0"/>
         </w:rPr>
-        <w:t xml:space="preserve">runs one arm at several seeds, so the spread between seeds can be reported next to the sampling interval rather than absorbed into it. The sweep is implemented; its cells are not part of the numbers in this version, and </w:t>
-      </w:r>
-      <w:r>
-        <w:rPr>
-          <w:b w:val="0"/>
-          <w:i w:val="0"/>
-        </w:rPr>
-        <w:t>§</w:t>
+        <w:t>runs one arm at several seeds, so the spread between seeds can be reported next to the sampling interval rather than absorbed into it. The sweep is implemented; its cells are not part of the numbers in this version, and Section</w:t>
+      </w:r>
+      <w:r>
+        <w:rPr>
+          <w:b w:val="0"/>
+          <w:i w:val="0"/>
+        </w:rPr>
+        <w:t xml:space="preserve"> </w:t>
       </w:r>
       <w:r>
         <w:rPr>
@@ -11702,7 +11702,7 @@
           <w:i/>
           <w:sz w:val="18"/>
         </w:rPr>
-        <w:t xml:space="preserve">guided word attack of </w:t>
+        <w:t>guided word attack of Section</w:t>
       </w:r>
       <w:r>
         <w:rPr>
@@ -11710,7 +11710,7 @@
           <w:i/>
           <w:sz w:val="18"/>
         </w:rPr>
-        <w:t>§</w:t>
+        <w:t xml:space="preserve"> </w:t>
       </w:r>
       <w:r>
         <w:rPr>
@@ -12155,14 +12155,14 @@
           <w:b w:val="0"/>
           <w:i w:val="0"/>
         </w:rPr>
-        <w:t xml:space="preserve"> a disagreement between the two channels of the kind </w:t>
-      </w:r>
-      <w:r>
-        <w:rPr>
-          <w:b w:val="0"/>
-          <w:i w:val="0"/>
-        </w:rPr>
-        <w:t>§</w:t>
+        <w:t xml:space="preserve"> a disagreement between the two channels of the kind that Section</w:t>
+      </w:r>
+      <w:r>
+        <w:rPr>
+          <w:b w:val="0"/>
+          <w:i w:val="0"/>
+        </w:rPr>
+        <w:t xml:space="preserve"> </w:t>
       </w:r>
       <w:r>
         <w:rPr>
@@ -12467,14 +12467,14 @@
           <w:b w:val="0"/>
           <w:i w:val="0"/>
         </w:rPr>
-        <w:t xml:space="preserve">), which is the difference </w:t>
-      </w:r>
-      <w:r>
-        <w:rPr>
-          <w:b w:val="0"/>
-          <w:i w:val="0"/>
-        </w:rPr>
-        <w:t>§</w:t>
+        <w:t>), which is the difference that Section</w:t>
+      </w:r>
+      <w:r>
+        <w:rPr>
+          <w:b w:val="0"/>
+          <w:i w:val="0"/>
+        </w:rPr>
+        <w:t xml:space="preserve"> </w:t>
       </w:r>
       <w:r>
         <w:rPr>
@@ -12542,14 +12542,14 @@
           <w:b w:val="0"/>
           <w:i w:val="0"/>
         </w:rPr>
-        <w:t xml:space="preserve">guided cells of </w:t>
-      </w:r>
-      <w:r>
-        <w:rPr>
-          <w:b w:val="0"/>
-          <w:i w:val="0"/>
-        </w:rPr>
-        <w:t>§</w:t>
+        <w:t>guided cells of Section</w:t>
+      </w:r>
+      <w:r>
+        <w:rPr>
+          <w:b w:val="0"/>
+          <w:i w:val="0"/>
+        </w:rPr>
+        <w:t xml:space="preserve"> </w:t>
       </w:r>
       <w:r>
         <w:rPr>
@@ -16149,14 +16149,14 @@
           <w:b w:val="0"/>
           <w:i w:val="0"/>
         </w:rPr>
-        <w:t xml:space="preserve">The word attack of </w:t>
-      </w:r>
-      <w:r>
-        <w:rPr>
-          <w:b w:val="0"/>
-          <w:i w:val="0"/>
-        </w:rPr>
-        <w:t>§</w:t>
+        <w:t>The word attack of Section</w:t>
+      </w:r>
+      <w:r>
+        <w:rPr>
+          <w:b w:val="0"/>
+          <w:i w:val="0"/>
+        </w:rPr>
+        <w:t xml:space="preserve"> </w:t>
       </w:r>
       <w:r>
         <w:rPr>
@@ -17623,14 +17623,14 @@
           <w:b w:val="0"/>
           <w:i w:val="0"/>
         </w:rPr>
-        <w:t xml:space="preserve"> is between attacks whose cost is on the record. The saliency attack spends 22.9 queries per message, six times what the random attack spends per message (</w:t>
-      </w:r>
-      <w:r>
-        <w:rPr>
-          <w:b w:val="0"/>
-          <w:i w:val="0"/>
-        </w:rPr>
-        <w:t>§</w:t>
+        <w:t xml:space="preserve"> is between attacks whose cost is on the record. The saliency attack spends 22.9 queries per message, six times what the random attack spends per message (Section</w:t>
+      </w:r>
+      <w:r>
+        <w:rPr>
+          <w:b w:val="0"/>
+          <w:i w:val="0"/>
+        </w:rPr>
+        <w:t xml:space="preserve"> </w:t>
       </w:r>
       <w:r>
         <w:rPr>
@@ -17818,14 +17818,14 @@
           <w:b w:val="0"/>
           <w:i w:val="0"/>
         </w:rPr>
-        <w:t xml:space="preserve">ordered substitution over a security vocabulary breaks more messages per unit of edit than a random draw over a small table. It does not show that ordering alone is responsible, and it cannot say what the probability channel is worth. </w:t>
-      </w:r>
-      <w:r>
-        <w:rPr>
-          <w:b w:val="0"/>
-          <w:i w:val="0"/>
-        </w:rPr>
-        <w:t>§</w:t>
+        <w:t>ordered substitution over a security vocabulary breaks more messages per unit of edit than a random draw over a small table. It does not show that ordering alone is responsible, and it cannot say what the probability channel is worth. Section</w:t>
+      </w:r>
+      <w:r>
+        <w:rPr>
+          <w:b w:val="0"/>
+          <w:i w:val="0"/>
+        </w:rPr>
+        <w:t xml:space="preserve"> </w:t>
       </w:r>
       <w:r>
         <w:rPr>
@@ -22005,14 +22005,14 @@
           <w:b w:val="0"/>
           <w:i w:val="0"/>
         </w:rPr>
-        <w:t xml:space="preserve"> against the recorded random word attack of </w:t>
-      </w:r>
-      <w:r>
-        <w:rPr>
-          <w:b w:val="0"/>
-          <w:i w:val="0"/>
-        </w:rPr>
-        <w:t>§</w:t>
+        <w:t xml:space="preserve"> against the recorded random word attack of Section</w:t>
+      </w:r>
+      <w:r>
+        <w:rPr>
+          <w:b w:val="0"/>
+          <w:i w:val="0"/>
+        </w:rPr>
+        <w:t xml:space="preserve"> </w:t>
       </w:r>
       <w:r>
         <w:rPr>
@@ -22362,14 +22362,14 @@
           <w:b w:val="0"/>
           <w:i w:val="0"/>
         </w:rPr>
-        <w:t xml:space="preserve">sample records are written in the same schema as the other attacks, which is what lets the paired test of </w:t>
-      </w:r>
-      <w:r>
-        <w:rPr>
-          <w:b w:val="0"/>
-          <w:i w:val="0"/>
-        </w:rPr>
-        <w:t>§</w:t>
+        <w:t>sample records are written in the same schema as the other attacks, which is what lets the paired test of Section</w:t>
+      </w:r>
+      <w:r>
+        <w:rPr>
+          <w:b w:val="0"/>
+          <w:i w:val="0"/>
+        </w:rPr>
+        <w:t xml:space="preserve"> </w:t>
       </w:r>
       <w:r>
         <w:rPr>
@@ -24070,14 +24070,14 @@
           <w:b w:val="0"/>
           <w:i w:val="0"/>
         </w:rPr>
-        <w:t xml:space="preserve"> model cost an attacker who can query it. That is the right question for a targeted campaign and the wrong one for a defender choosing a model, because an attacker who cannot query the deployed model will instead build perturbations against something they can download. If those perturbations do not survive the move, the weakness measured in </w:t>
-      </w:r>
-      <w:r>
-        <w:rPr>
-          <w:b w:val="0"/>
-          <w:i w:val="0"/>
-        </w:rPr>
-        <w:t>§</w:t>
+        <w:t xml:space="preserve"> model cost an attacker who can query it. That is the right question for a targeted campaign and the wrong one for a defender choosing a model, because an attacker who cannot query the deployed model will instead build perturbations against something they can download. If those perturbations do not survive the move, the weakness measured in Section</w:t>
+      </w:r>
+      <w:r>
+        <w:rPr>
+          <w:b w:val="0"/>
+          <w:i w:val="0"/>
+        </w:rPr>
+        <w:t xml:space="preserve"> </w:t>
       </w:r>
       <w:r>
         <w:rPr>
@@ -36363,14 +36363,14 @@
           <w:b w:val="0"/>
           <w:i w:val="0"/>
         </w:rPr>
-        <w:t xml:space="preserve"> of characters). The paired analysis in </w:t>
-      </w:r>
-      <w:r>
-        <w:rPr>
-          <w:b w:val="0"/>
-          <w:i w:val="0"/>
-        </w:rPr>
-        <w:t>§</w:t>
+        <w:t xml:space="preserve"> of characters). The paired analysis in Section</w:t>
+      </w:r>
+      <w:r>
+        <w:rPr>
+          <w:b w:val="0"/>
+          <w:i w:val="0"/>
+        </w:rPr>
+        <w:t xml:space="preserve"> </w:t>
       </w:r>
       <w:r>
         <w:rPr>
@@ -37537,14 +37537,14 @@
           <w:b w:val="0"/>
           <w:i w:val="0"/>
         </w:rPr>
-        <w:t xml:space="preserve">The saliency attack uses a broader vocabulary than the random word attack. The ablation in </w:t>
-      </w:r>
-      <w:r>
-        <w:rPr>
-          <w:b w:val="0"/>
-          <w:i w:val="0"/>
-        </w:rPr>
-        <w:t>§</w:t>
+        <w:t>The saliency attack uses a broader vocabulary than the random word attack. The ablation in Section</w:t>
+      </w:r>
+      <w:r>
+        <w:rPr>
+          <w:b w:val="0"/>
+          <w:i w:val="0"/>
+        </w:rPr>
+        <w:t xml:space="preserve"> </w:t>
       </w:r>
       <w:r>
         <w:rPr>
@@ -37675,14 +37675,14 @@
           <w:b w:val="0"/>
           <w:i w:val="0"/>
         </w:rPr>
-        <w:t xml:space="preserve">079 for the random attacks follow from the 52 exclusions of </w:t>
-      </w:r>
-      <w:r>
-        <w:rPr>
-          <w:b w:val="0"/>
-          <w:i w:val="0"/>
-        </w:rPr>
-        <w:t>§</w:t>
+        <w:t>079 for the random attacks follow from the 52 exclusions of Section</w:t>
+      </w:r>
+      <w:r>
+        <w:rPr>
+          <w:b w:val="0"/>
+          <w:i w:val="0"/>
+        </w:rPr>
+        <w:t xml:space="preserve"> </w:t>
       </w:r>
       <w:r>
         <w:rPr>
@@ -37956,14 +37956,14 @@
           <w:b w:val="0"/>
           <w:i w:val="0"/>
         </w:rPr>
-        <w:t xml:space="preserve">Two designed attacks were not run; </w:t>
-      </w:r>
-      <w:r>
-        <w:rPr>
-          <w:b w:val="0"/>
-          <w:i w:val="0"/>
-        </w:rPr>
-        <w:t>§</w:t>
+        <w:t>Two designed attacks were not run; Section</w:t>
+      </w:r>
+      <w:r>
+        <w:rPr>
+          <w:b w:val="0"/>
+          <w:i w:val="0"/>
+        </w:rPr>
+        <w:t xml:space="preserve"> </w:t>
       </w:r>
       <w:r>
         <w:rPr>
@@ -38059,14 +38059,14 @@
           <w:b w:val="0"/>
           <w:i w:val="0"/>
         </w:rPr>
-        <w:t xml:space="preserve"> edit budget does not describe it, because a paraphrase can change most of the message while leaving the meaning intact. Two pieces would be needed before such an attack could sit in the same table as the ones above: a reliable meaning check, so that a rewrite is counted only when a reader would treat it as the same request; and a cost model, because the rewriter is itself a model call and the query accounting of </w:t>
-      </w:r>
-      <w:r>
-        <w:rPr>
-          <w:b w:val="0"/>
-          <w:i w:val="0"/>
-        </w:rPr>
-        <w:t>§</w:t>
+        <w:t xml:space="preserve"> edit budget does not describe it, because a paraphrase can change most of the message while leaving the meaning intact. Two pieces would be needed before such an attack could sit in the same table as the ones above: a reliable meaning check, so that a rewrite is counted only when a reader would treat it as the same request; and a cost model, because the rewriter is itself a model call and the query accounting of Section</w:t>
+      </w:r>
+      <w:r>
+        <w:rPr>
+          <w:b w:val="0"/>
+          <w:i w:val="0"/>
+        </w:rPr>
+        <w:t xml:space="preserve"> </w:t>
       </w:r>
       <w:r>
         <w:rPr>
@@ -38100,14 +38100,14 @@
           <w:b w:val="0"/>
           <w:i w:val="0"/>
         </w:rPr>
-        <w:t xml:space="preserve">The two defences of </w:t>
-      </w:r>
-      <w:r>
-        <w:rPr>
-          <w:b w:val="0"/>
-          <w:i w:val="0"/>
-        </w:rPr>
-        <w:t>§</w:t>
+        <w:t>The two defences of Section</w:t>
+      </w:r>
+      <w:r>
+        <w:rPr>
+          <w:b w:val="0"/>
+          <w:i w:val="0"/>
+        </w:rPr>
+        <w:t xml:space="preserve"> </w:t>
       </w:r>
       <w:r>
         <w:rPr>
@@ -38225,14 +38225,14 @@
           <w:b w:val="0"/>
           <w:i w:val="0"/>
         </w:rPr>
-        <w:t xml:space="preserve">Instruct was omitted because it is gated, and the three models we do report sit in one size band. We therefore cannot say whether fragility grows or shrinks with model size, and we do not: the discussion of </w:t>
-      </w:r>
-      <w:r>
-        <w:rPr>
-          <w:b w:val="0"/>
-          <w:i w:val="0"/>
-        </w:rPr>
-        <w:t>§</w:t>
+        <w:t>Instruct was omitted because it is gated, and the three models we do report sit in one size band. We therefore cannot say whether fragility grows or shrinks with model size, and we do not: the discussion of Section</w:t>
+      </w:r>
+      <w:r>
+        <w:rPr>
+          <w:b w:val="0"/>
+          <w:i w:val="0"/>
+        </w:rPr>
+        <w:t xml:space="preserve"> </w:t>
       </w:r>
       <w:r>
         <w:rPr>
@@ -38376,14 +38376,14 @@
           <w:b w:val="0"/>
           <w:i w:val="0"/>
         </w:rPr>
-        <w:t xml:space="preserve"> select the substitution to apply, per message, using measured model behaviour, and the ablation of </w:t>
-      </w:r>
-      <w:r>
-        <w:rPr>
-          <w:b w:val="0"/>
-          <w:i w:val="0"/>
-        </w:rPr>
-        <w:t>§</w:t>
+        <w:t xml:space="preserve"> select the substitution to apply, per message, using measured model behaviour, and the ablation of Section</w:t>
+      </w:r>
+      <w:r>
+        <w:rPr>
+          <w:b w:val="0"/>
+          <w:i w:val="0"/>
+        </w:rPr>
+        <w:t xml:space="preserve"> </w:t>
       </w:r>
       <w:r>
         <w:rPr>
@@ -38826,14 +38826,14 @@
           <w:b w:val="0"/>
           <w:i w:val="0"/>
         </w:rPr>
-        <w:t xml:space="preserve">. The artefact contains the frozen splits with fingerprints, the prompt, the perturbation code for all three attacks, the five ablation arms of </w:t>
-      </w:r>
-      <w:r>
-        <w:rPr>
-          <w:b w:val="0"/>
-          <w:i w:val="0"/>
-        </w:rPr>
-        <w:t>§</w:t>
+        <w:t>. The artefact contains the frozen splits with fingerprints, the prompt, the perturbation code for all three attacks, the five ablation arms of Section</w:t>
+      </w:r>
+      <w:r>
+        <w:rPr>
+          <w:b w:val="0"/>
+          <w:i w:val="0"/>
+        </w:rPr>
+        <w:t xml:space="preserve"> </w:t>
       </w:r>
       <w:r>
         <w:rPr>
@@ -38917,14 +38917,14 @@
           <w:b w:val="0"/>
           <w:i w:val="0"/>
         </w:rPr>
-        <w:t xml:space="preserve">attack run of </w:t>
-      </w:r>
-      <w:r>
-        <w:rPr>
-          <w:b w:val="0"/>
-          <w:i w:val="0"/>
-        </w:rPr>
-        <w:t>§</w:t>
+        <w:t>attack run of Section</w:t>
+      </w:r>
+      <w:r>
+        <w:rPr>
+          <w:b w:val="0"/>
+          <w:i w:val="0"/>
+        </w:rPr>
+        <w:t xml:space="preserve"> </w:t>
       </w:r>
       <w:r>
         <w:rPr>
@@ -39332,14 +39332,14 @@
           <w:b w:val="0"/>
           <w:i w:val="0"/>
         </w:rPr>
-        <w:t xml:space="preserve">001 rows. They diverged systematically on two of three models. A single channel is not a measurement until it is checked against the other. Every result in this paper reports its denominator and its interval, and </w:t>
-      </w:r>
-      <w:r>
-        <w:rPr>
-          <w:b w:val="0"/>
-          <w:i w:val="0"/>
-        </w:rPr>
-        <w:t>§</w:t>
+        <w:t>001 rows. They diverged systematically on two of three models. A single channel is not a measurement until it is checked against the other. Every result in this paper reports its denominator and its interval, and Section</w:t>
+      </w:r>
+      <w:r>
+        <w:rPr>
+          <w:b w:val="0"/>
+          <w:i w:val="0"/>
+        </w:rPr>
+        <w:t xml:space="preserve"> </w:t>
       </w:r>
       <w:r>
         <w:rPr>
@@ -39393,14 +39393,14 @@
           <w:b w:val="0"/>
           <w:i w:val="0"/>
         </w:rPr>
-        <w:t xml:space="preserve">budget ablation of </w:t>
-      </w:r>
-      <w:r>
-        <w:rPr>
-          <w:b w:val="0"/>
-          <w:i w:val="0"/>
-        </w:rPr>
-        <w:t>§</w:t>
+        <w:t>budget ablation of Section</w:t>
+      </w:r>
+      <w:r>
+        <w:rPr>
+          <w:b w:val="0"/>
+          <w:i w:val="0"/>
+        </w:rPr>
+        <w:t xml:space="preserve"> </w:t>
       </w:r>
       <w:r>
         <w:rPr>
@@ -39414,14 +39414,14 @@
           <w:b w:val="0"/>
           <w:i w:val="0"/>
         </w:rPr>
-        <w:t xml:space="preserve"> is the one experiment here that attributes rather than describes. With the candidate set, the probe phase, and the call budget held fixed, it reports what ordering is worth on its own. What it cannot do is turn five contrasts on roughly a thousand paired messages into a ranking of attacks. </w:t>
-      </w:r>
-      <w:r>
-        <w:rPr>
-          <w:b w:val="0"/>
-          <w:i w:val="0"/>
-        </w:rPr>
-        <w:t>§</w:t>
+        <w:t xml:space="preserve"> is the one experiment here that attributes rather than describes. With the candidate set, the probe phase, and the call budget held fixed, it reports what ordering is worth on its own. What it cannot do is turn five contrasts on roughly a thousand paired messages into a ranking of attacks. Section</w:t>
+      </w:r>
+      <w:r>
+        <w:rPr>
+          <w:b w:val="0"/>
+          <w:i w:val="0"/>
+        </w:rPr>
+        <w:t xml:space="preserve"> </w:t>
       </w:r>
       <w:r>
         <w:rPr>

</xml_diff>

<commit_message>
Fix the reference list against the registry records it was checked on.
The yearless NIST handbook entry made acmart print the citation key and a
stray bracket in the printed list, so it now carries the handbook's own DOI
and year. Entries that the registries give pages, volume or a proceedings
record for now say so, and the duplicate arXiv identifiers and the Thapa
entry's preprint-with-conference-DOI mix are gone.
</commit_message>
<xml_diff>
--- a/paper/main.docx
+++ b/paper/main.docx
@@ -39497,7 +39497,7 @@
           <w:b w:val="0"/>
           <w:i w:val="0"/>
         </w:rPr>
-        <w:t>trained Large Language Models. Applied Computer Sciences in Engineering (WEA 2024) 2024 doi:10.1007/978</w:t>
+        <w:t>trained Large Language Models. Applied Computer Sciences in Engineering (WEA 2024) pp. 3–18 2024 doi:10.1007/978</w:t>
       </w:r>
       <w:r>
         <w:rPr>
@@ -39747,7 +39747,14 @@
           <w:b w:val="0"/>
           <w:i w:val="0"/>
         </w:rPr>
-        <w:t xml:space="preserve">AI Era: Quantized </w:t>
+        <w:t>AI</w:t>
+      </w:r>
+      <w:r>
+        <w:rPr>
+          <w:b w:val="0"/>
+          <w:i w:val="0"/>
+        </w:rPr>
+        <w:t xml:space="preserve"> Era: Quantized </w:t>
       </w:r>
       <w:r>
         <w:rPr>
@@ -39761,7 +39768,7 @@
           <w:b w:val="0"/>
           <w:i w:val="0"/>
         </w:rPr>
-        <w:t xml:space="preserve"> vs Classical Models. 2025 doi:10.1109/SNPD65828.2025.11253009</w:t>
+        <w:t xml:space="preserve"> vs Classical Models. 2025 IEEE/ACIS 29th International Conference on Software Engineering, Artificial Intelligence, Networking and Parallel/Distributed Computing (SNPD) pp. 856–863 2025 doi:10.1109/SNPD65828.2025.11253009</w:t>
       </w:r>
     </w:p>
     <w:p>
@@ -39808,7 +39815,7 @@
           <w:b w:val="0"/>
           <w:i w:val="0"/>
         </w:rPr>
-        <w:t>based Cyber Threat Intelligence Systems. Future Generation Computer Systems 2026 doi:10.1016/j.future.2026.108603</w:t>
+        <w:t>based Cyber Threat Intelligence Systems. Future Generation Computer Systems vol. 184 pp. 108603 2026 doi:10.1016/j.future.2026.108603</w:t>
       </w:r>
     </w:p>
     <w:p>
@@ -40013,7 +40020,7 @@
           <w:b w:val="0"/>
           <w:i w:val="0"/>
         </w:rPr>
-        <w:t>Wei On the Transferability of Adversarial Attacks against Neural Text Classifier. Proceedings of the 2021 Conference on Empirical Methods in Natural Language Processing (EMNLP) 2021 doi:10.18653/v1/2021.emnlp</w:t>
+        <w:t>Wei On the Transferability of Adversarial Attacks against Neural Text Classifier. Proceedings of the 2021 Conference on Empirical Methods in Natural Language Processing (EMNLP) pp. 1612–1625 2021 doi:10.18653/v1/2021.emnlp</w:t>
       </w:r>
       <w:r>
         <w:rPr>
@@ -40067,7 +40074,7 @@
           <w:b w:val="0"/>
           <w:i w:val="0"/>
         </w:rPr>
-        <w:t>HLT) 2021 doi:10.18653/v1/2021.naacl</w:t>
+        <w:t>HLT) pp. 2006–2012 2021 doi:10.18653/v1/2021.naacl</w:t>
       </w:r>
       <w:r>
         <w:rPr>
@@ -40206,7 +40213,7 @@
           <w:b w:val="0"/>
           <w:i w:val="0"/>
         </w:rPr>
-        <w:t>Handbook of Statistical Methods: Confidence Intervals for Proportions (Wilson method).</w:t>
+        <w:t>Handbook of Statistical Methods: Confidence Intervals for Proportions (Wilson Method). 2020 doi:10.18434/M32189</w:t>
       </w:r>
     </w:p>
     <w:p>

</xml_diff>

<commit_message>
Call the object under attack a model everywhere.
The paper mixed "classifier", "model" and "detector" for the same thing, which
reads as three different objects; each occurrence now says "model", including
the abstract's opening sentence and the related-work paragraph heading.
</commit_message>
<xml_diff>
--- a/paper/main.docx
+++ b/paper/main.docx
@@ -86,7 +86,7 @@
           <w:b w:val="0"/>
           <w:i w:val="0"/>
         </w:rPr>
-        <w:t xml:space="preserve">Security teams often use small AI text classifiers to sort incoming emails and text messages. The classifier decides whether a message is </w:t>
+        <w:t xml:space="preserve">Security teams often use small language models to sort incoming emails and text messages. The model decides whether a message is </w:t>
       </w:r>
       <w:r>
         <w:rPr>
@@ -114,7 +114,7 @@
           <w:b w:val="0"/>
           <w:i w:val="0"/>
         </w:rPr>
-        <w:t xml:space="preserve"> (safe) before a human reviews it. In this paper, we test what happens when an attacker makes small text edits, called perturbations, to fool the classifier. We show that evasion rates can only be measured fairly under a </w:t>
+        <w:t xml:space="preserve"> (safe) before a human reviews it. In this paper, we test what happens when an attacker makes small text edits, called perturbations, to fool the model. We show that evasion rates can only be measured fairly under a </w:t>
       </w:r>
       <w:r>
         <w:rPr>
@@ -671,7 +671,7 @@
           <w:b w:val="0"/>
           <w:i w:val="0"/>
         </w:rPr>
-        <w:t>A phishing email that reaches a security analyst has usually passed several initial spam filters. Often, the next security layer is a small language model (an AI text classifier). The model makes a fast, automated decision: is this message malicious (harmful) or benign (safe)? Small open models with 1 to 4 billion parameters are popular for this job. They run on a single standard GPU, can be hosted privately inside an organization, and require no special training examples</w:t>
+        <w:t>A phishing email that reaches a security analyst has usually passed several initial spam filters. Often, the next security layer is a small language model. The model makes a fast, automated decision: is this message malicious (harmful) or benign (safe)? Small open models with 1 to 4 billion parameters are popular for this job. They run on a single standard GPU, can be hosted privately inside an organization, and require no special training examples</w:t>
       </w:r>
       <w:r>
         <w:rPr>
@@ -1228,7 +1228,7 @@
           <w:b w:val="0"/>
           <w:i w:val="0"/>
         </w:rPr>
-        <w:t>): neither overall accuracy nor the measured distance from the decision threshold orders the attack success rate across the three models. The model with the most flips is not the least accurate, and its own probability channel saturates at 0.9999 or above on 800 of its 845 stored originals, so no margin can be read there. The one clear case is the detector that marks almost everything malicious: its score barely varies, so it looks robust for a reason that has nothing to do with robustness.</w:t>
+        <w:t>): neither overall accuracy nor the measured distance from the decision threshold orders the attack success rate across the three models. The model with the most flips is not the least accurate, and its own probability channel saturates at 0.9999 or above on 800 of its 845 stored originals, so no margin can be read there. The one clear case is the model that marks almost everything malicious: its score barely varies, so it looks robust for a reason that has nothing to do with robustness.</w:t>
       </w:r>
     </w:p>
     <w:p>
@@ -1381,7 +1381,7 @@
         <w:pStyle w:val="Heading3"/>
       </w:pPr>
       <w:r>
-        <w:t>Language models as email and SMS detectors.</w:t>
+        <w:t>Language models for email and SMS triage.</w:t>
       </w:r>
     </w:p>
     <w:p>
@@ -1603,7 +1603,7 @@
           <w:b w:val="0"/>
           <w:i w:val="0"/>
         </w:rPr>
-        <w:t>built a detector from email headers and bodies and reported 99.70</w:t>
+        <w:t>built a model from email headers and bodies and reported 99.70</w:t>
       </w:r>
       <w:r>
         <w:rPr>
@@ -1736,7 +1736,7 @@
           <w:b w:val="0"/>
           <w:i w:val="0"/>
         </w:rPr>
-        <w:t>. Our study is about measurement rules rather than model design. We keep the detector and the prompt fixed and apply careful counting rules to see how text edits change the final decision.</w:t>
+        <w:t>. Our study is about measurement rules rather than model design. We keep the model and the prompt fixed and apply careful counting rules to see how text edits change the final decision.</w:t>
       </w:r>
     </w:p>
     <w:p>
@@ -1784,7 +1784,7 @@
           <w:b w:val="0"/>
           <w:i w:val="0"/>
         </w:rPr>
-        <w:t>intelligence pipelines. Their text misled the classifiers, producing a 75</w:t>
+        <w:t>intelligence pipelines. Their text misled the models, producing a 75</w:t>
       </w:r>
       <w:r>
         <w:rPr>
@@ -1826,7 +1826,7 @@
           <w:b w:val="0"/>
           <w:i w:val="0"/>
         </w:rPr>
-        <w:t>4o acted as the detector</w:t>
+        <w:t>4o classified the messages</w:t>
       </w:r>
       <w:r>
         <w:rPr>
@@ -1861,7 +1861,7 @@
           <w:b w:val="0"/>
           <w:i w:val="0"/>
         </w:rPr>
-        <w:t>generated fake phishing pages: small detectors failed, while vision</w:t>
+        <w:t>generated fake phishing pages: small models failed, while vision</w:t>
       </w:r>
       <w:r>
         <w:rPr>
@@ -2426,7 +2426,7 @@
           <w:b w:val="0"/>
           <w:i w:val="0"/>
         </w:rPr>
-        <w:t>The attacker controls the message text and nothing else: no access to the model weights, gradients, logits or detector code, and no way to retrain it. The attacker also wants the message to stay readable, so the edit budget is capped: at most 15</w:t>
+        <w:t>The attacker controls the message text and nothing else: no access to the model weights, gradients, logits or detection code, and no way to retrain it. The attacker also wants the message to stay readable, so the edit budget is capped: at most 15</w:t>
       </w:r>
       <w:r>
         <w:rPr>
@@ -2780,7 +2780,7 @@
           <w:b w:val="0"/>
           <w:i w:val="0"/>
         </w:rPr>
-        <w:t>guided word search would do better. A weak adversary is useful precisely because a flip under it is unambiguously bad news for the detector: nothing exotic happened, the message simply stopped looking suspicious.</w:t>
+        <w:t>guided word search would do better. A weak adversary is useful precisely because a flip under it is unambiguously bad news for the model: nothing exotic happened, the message simply stopped looking suspicious.</w:t>
       </w:r>
     </w:p>
     <w:p>
@@ -4994,7 +4994,7 @@
           <w:b/>
           <w:i w:val="0"/>
         </w:rPr>
-        <w:t>mini is a cautious detector on email.</w:t>
+        <w:t>mini is a cautious model on email.</w:t>
       </w:r>
       <w:r>
         <w:rPr>
@@ -5055,7 +5055,7 @@
           <w:b/>
           <w:i w:val="0"/>
         </w:rPr>
-        <w:t>1.7B is a degenerate detector.</w:t>
+        <w:t>1.7B is a degenerate model.</w:t>
       </w:r>
       <w:r>
         <w:rPr>
@@ -5076,7 +5076,7 @@
           <w:b w:val="0"/>
           <w:i w:val="0"/>
         </w:rPr>
-        <w:t xml:space="preserve"> on phishing email, but its precision is 0.510 and its confusion matrix shows 189 false positives against 11 true negatives on the benign class: it calls nearly every message malicious. A detector that says </w:t>
+        <w:t xml:space="preserve"> on phishing email, but its precision is 0.510 and its confusion matrix shows 189 false positives against 11 true negatives on the benign class: it calls nearly every message malicious. A model that says </w:t>
       </w:r>
       <w:r>
         <w:rPr>
@@ -5130,7 +5130,7 @@
           <w:b w:val="0"/>
           <w:i w:val="0"/>
         </w:rPr>
-        <w:t>3B is the strongest and most balanced classifier of the three (F1 0.923 on email, 0.857 on SMS).</w:t>
+        <w:t>3B is the strongest and most balanced model of the three (F1 0.923 on email, 0.857 on SMS).</w:t>
       </w:r>
     </w:p>
     <w:p>
@@ -38481,7 +38481,7 @@
           <w:b w:val="0"/>
           <w:i w:val="0"/>
         </w:rPr>
-        <w:t xml:space="preserve"> word budget and a lexical paraphrase constraint, on open checkpoints. No attack here is tuned against a deployed classifier, no victim system is probed, and nothing released lowers the cost of an attack below what those toolkits already provide. We report that small triage models resist the random adversaries and that the targeted one roughly doubles the flip rate, which is the defensive direction of the finding: both numbers tell an operator that a random</w:t>
+        <w:t xml:space="preserve"> word budget and a lexical paraphrase constraint, on open checkpoints. No attack here is tuned against a deployed model, no victim system is probed, and nothing released lowers the cost of an attack below what those toolkits already provide. We report that small triage models resist the random adversaries and that the targeted one roughly doubles the flip rate, which is the defensive direction of the finding: both numbers tell an operator that a random</w:t>
       </w:r>
       <w:r>
         <w:rPr>
@@ -38509,7 +38509,7 @@
           <w:b w:val="0"/>
           <w:i w:val="0"/>
         </w:rPr>
-        <w:t>positive prone detector is robust.</w:t>
+        <w:t>positive prone model is robust.</w:t>
       </w:r>
     </w:p>
     <w:p>

</xml_diff>

<commit_message>
Redraw the pipeline figure so its arrows say what the study does.
The old raster had a missing arrow shaft, arrows that stopped short of their
boxes, and no edge back to the model even though the caption promises a
re-query. Figure 1 is now TikZ: the edit loop returns to the model, the attack
set feeds it, and the evaluation reads the saved records. British "defence"
matches the body. The Word build rasterises the same TikZ file, so the two
renders cannot drift.
</commit_message>
<xml_diff>
--- a/paper/main.docx
+++ b/paper/main.docx
@@ -4795,7 +4795,7 @@
       <w:r>
         <w:drawing>
           <wp:inline xmlns:a="http://schemas.openxmlformats.org/drawingml/2006/main" xmlns:pic="http://schemas.openxmlformats.org/drawingml/2006/picture">
-            <wp:extent cx="5669280" cy="2024743"/>
+            <wp:extent cx="5669280" cy="2561591"/>
             <wp:docPr id="1" name="Picture 1"/>
             <wp:cNvGraphicFramePr>
               <a:graphicFrameLocks noChangeAspect="1"/>
@@ -4816,7 +4816,7 @@
                   <pic:spPr>
                     <a:xfrm>
                       <a:off x="0" y="0"/>
-                      <a:ext cx="5669280" cy="2024743"/>
+                      <a:ext cx="5669280" cy="2561591"/>
                     </a:xfrm>
                     <a:prstGeom prst="rect"/>
                   </pic:spPr>
@@ -4841,7 +4841,7 @@
           <w:i/>
           <w:sz w:val="18"/>
         </w:rPr>
-        <w:t>The evaluation pipeline. A clean message is classified by the model. If the verdict is malicious, the message enters the attack set. The perturbation engine applies edits under budget and re</w:t>
+        <w:t>The evaluation pipeline. A clean message is scored by the model. If the verdict is malicious the message enters the attack set. The perturbation engine edits it inside the shared 15</w:t>
       </w:r>
       <w:r>
         <w:rPr>
@@ -4849,7 +4849,7 @@
           <w:i/>
           <w:sz w:val="18"/>
         </w:rPr>
-        <w:t>-</w:t>
+        <w:t>%</w:t>
       </w:r>
       <w:r>
         <w:rPr>
@@ -4857,7 +4857,71 @@
           <w:i/>
           <w:sz w:val="18"/>
         </w:rPr>
-        <w:t>queries the model. The results are then evaluated for transfer and defense robustness.</w:t>
+        <w:t xml:space="preserve"> budget and re</w:t>
+      </w:r>
+      <w:r>
+        <w:rPr>
+          <w:b w:val="0"/>
+          <w:i/>
+          <w:sz w:val="18"/>
+        </w:rPr>
+        <w:t>-</w:t>
+      </w:r>
+      <w:r>
+        <w:rPr>
+          <w:b w:val="0"/>
+          <w:i/>
+          <w:sz w:val="18"/>
+        </w:rPr>
+        <w:t>queries the model, which is the loop back to the top row. The saved per</w:t>
+      </w:r>
+      <w:r>
+        <w:rPr>
+          <w:b w:val="0"/>
+          <w:i/>
+          <w:sz w:val="18"/>
+        </w:rPr>
+        <w:t>-</w:t>
+      </w:r>
+      <w:r>
+        <w:rPr>
+          <w:b w:val="0"/>
+          <w:i/>
+          <w:sz w:val="18"/>
+        </w:rPr>
+        <w:t>sample records are then replayed against the other models (transfer) and re</w:t>
+      </w:r>
+      <w:r>
+        <w:rPr>
+          <w:b w:val="0"/>
+          <w:i/>
+          <w:sz w:val="18"/>
+        </w:rPr>
+        <w:t>-</w:t>
+      </w:r>
+      <w:r>
+        <w:rPr>
+          <w:b w:val="0"/>
+          <w:i/>
+          <w:sz w:val="18"/>
+        </w:rPr>
+        <w:t>scored after normalisation and re</w:t>
+      </w:r>
+      <w:r>
+        <w:rPr>
+          <w:b w:val="0"/>
+          <w:i/>
+          <w:sz w:val="18"/>
+        </w:rPr>
+        <w:t>-</w:t>
+      </w:r>
+      <w:r>
+        <w:rPr>
+          <w:b w:val="0"/>
+          <w:i/>
+          <w:sz w:val="18"/>
+        </w:rPr>
+        <w:t>thresholding (defence).</w:t>
       </w:r>
     </w:p>
     <w:p>

</xml_diff>